<commit_message>
COMPLETED REPORT FOR MID EXCEPT FOR RESULTS
</commit_message>
<xml_diff>
--- a/DOCS/CSE3_REPORT.docx
+++ b/DOCS/CSE3_REPORT.docx
@@ -764,7 +764,7 @@
           <w:lang w:val="en-US"/>
         </w:rPr>
         <w:drawing>
-          <wp:anchor distT="0" distB="0" distL="114300" distR="114300" simplePos="0" relativeHeight="251658240" behindDoc="0" locked="0" layoutInCell="1" allowOverlap="1" wp14:anchorId="21785E6A" wp14:editId="29EF0AAA">
+          <wp:anchor distT="0" distB="0" distL="114300" distR="114300" simplePos="0" relativeHeight="251658240" behindDoc="0" locked="0" layoutInCell="1" allowOverlap="1" wp14:anchorId="21785E6A" wp14:editId="05BA8A18">
             <wp:simplePos x="0" y="0"/>
             <wp:positionH relativeFrom="margin">
               <wp:align>center</wp:align>
@@ -4888,9 +4888,26 @@
     </w:p>
     <w:p>
       <w:pPr>
+        <w:pStyle w:val="MSISTEXT"/>
+        <w:rPr>
+          <w:lang w:val="en-IN"/>
+        </w:rPr>
+      </w:pPr>
+    </w:p>
+    <w:p>
+      <w:pPr>
+        <w:pStyle w:val="MSISTEXT"/>
+        <w:rPr>
+          <w:lang w:val="en-IN"/>
+        </w:rPr>
+      </w:pPr>
+    </w:p>
+    <w:p>
+      <w:pPr>
         <w:pStyle w:val="MSISSUBHEADIN"/>
       </w:pPr>
       <w:r>
+        <w:lastRenderedPageBreak/>
         <w:t>PROBLEM STATEMENT</w:t>
       </w:r>
     </w:p>
@@ -4899,61 +4916,176 @@
         <w:pStyle w:val="MSISTEXT"/>
       </w:pPr>
       <w:r>
-        <w:t xml:space="preserve">Due to the quick growth in IoT, there has been an increase in the number of devices that interact and operate in different environments, such as smart homes, healthcare </w:t>
+        <w:t>Due to the quick growth in IoT, there has been an increase in the number of devices that interact and operate in different environments, such as smart homes, healthcare systems, industrial automation, smart cities, and intelligent transport systems. Despite the fact that these devices offer better automation and monitoring, they bring about many security issues because of their poor computing capacity, little memory, and light communication protocol. These IoT devices lack good security settings, which makes them vulnerable to attacks from cyber criminals.</w:t>
+      </w:r>
+    </w:p>
+    <w:p>
+      <w:pPr>
+        <w:pStyle w:val="MSISTEXT"/>
+      </w:pPr>
+      <w:r>
+        <w:t>The heterogeneity and distribution of the IoT networks make it even harder to implement any security mechanism. The IoT devices exchange private information in numerous communication layers that include perception layer, network layer, and application layer. All these layers are subject to attacks that can be categorized differently depending on the layer. For instance, the perception layer is prone to physical attacks, sensor attack, node capture, and jamming attacks. The network layer becomes a target for Man-in-the-Middle (MITM) attack, spoofing, replay attack, routing attacks, and network reconnaissance attack. In the application layer, the attacker uses software flaws via DDoS attack, malware, unauthorized access, and service disruption.</w:t>
+      </w:r>
+    </w:p>
+    <w:p>
+      <w:pPr>
+        <w:pStyle w:val="MSISTEXT"/>
+      </w:pPr>
+      <w:r>
+        <w:t>For overcoming such issues, intrusion detection systems (IDSs) are used extensively for monitoring network traffic and detecting malicious activities. But there are certain limitations associated with traditional methods of intrusion detection systems, namely, signature-based detection system and rule-based detection systems, which are used in dynamic IoT environment. Signature-based IDS uses predefined attack signature for detecting malicious activities. Even though it is highly accurate in detecting attacks that have already been known to us, but it cannot detect new kinds of zero-day attacks because their signature does not exist in the database.</w:t>
+      </w:r>
+    </w:p>
+    <w:p>
+      <w:pPr>
+        <w:pStyle w:val="MSISTEXT"/>
+      </w:pPr>
+      <w:r>
+        <w:t xml:space="preserve">In like manner, rule-based IDS relies on handcrafted rules and expert knowledge in order to recognize malicious behaviors. The process of creating and updating the rule is time-consuming and cumbersome, especially as new attack patterns are constantly emerging. There is need for constant updates in order to maintain good performance of the system, which makes the use of rule-based methods not very scalable in IoT </w:t>
       </w:r>
       <w:r>
         <w:lastRenderedPageBreak/>
-        <w:t>systems, industrial automation, smart cities, and intelligent transport systems. Despite the fact that these devices offer better automation and monitoring, they bring about many security issues because of their poor computing capacity, little memory, and light communication protocol. These IoT devices lack good security settings, which makes them vulnerable to attacks from cyber criminals.</w:t>
-      </w:r>
-    </w:p>
-    <w:p>
-      <w:pPr>
-        <w:pStyle w:val="MSISTEXT"/>
-      </w:pPr>
-      <w:r>
-        <w:t>The heterogeneity and distribution of the IoT networks make it even harder to implement any security mechanism. The IoT devices exchange private information in numerous communication layers that include perception layer, network layer, and application layer. All these layers are subject to attacks that can be categorized differently depending on the layer. For instance, the perception layer is prone to physical attacks, sensor attack, node capture, and jamming attacks. The network layer becomes a target for Man-in-the-Middle (MITM) attack, spoofing, replay attack, routing attacks, and network reconnaissance attack. In the application layer, the attacker uses software flaws via DDoS attack, malware, unauthorized access, and service disruption.</w:t>
-      </w:r>
-    </w:p>
-    <w:p>
-      <w:pPr>
-        <w:pStyle w:val="MSISTEXT"/>
-      </w:pPr>
-      <w:r>
-        <w:t>For overcoming such issues, intrusion detection systems (IDSs) are used extensively for monitoring network traffic and detecting malicious activities. But there are certain limitations associated with traditional methods of intrusion detection systems, namely, signature-based detection system and rule-based detection systems, which are used in dynamic IoT environment. Signature-based IDS uses predefined attack signature for detecting malicious activities. Even though it is highly accurate in detecting attacks that have already been known to us, but it cannot detect new kinds of zero-day attacks because their signature does not exist in the database.</w:t>
-      </w:r>
-    </w:p>
-    <w:p>
-      <w:pPr>
-        <w:pStyle w:val="MSISTEXT"/>
-      </w:pPr>
-      <w:r>
-        <w:t>In like manner, rule-based IDS relies on handcrafted rules and expert knowledge in order to recognize malicious behaviors. The process of creating and updating the rule is time-consuming and cumbersome, especially as new attack patterns are constantly emerging. There is need for constant updates in order to maintain good performance of the system, which makes the use of rule-based methods not very scalable in IoT environments. In addition, both approaches face challenges in dealing with the massive data produced by the IoT networks.</w:t>
-      </w:r>
-    </w:p>
-    <w:p>
-      <w:pPr>
-        <w:pStyle w:val="MSISTEXT"/>
-      </w:pPr>
-      <w:r>
-        <w:t xml:space="preserve">A second problem faced while designing intelligent intrusion detection models is that of high-dimensional data sets, which are filled with redundant and irrelevant features </w:t>
-      </w:r>
-      <w:r>
+        <w:t>environments. In addition, both approaches face challenges in dealing with the massive data produced by the IoT networks.</w:t>
+      </w:r>
+    </w:p>
+    <w:p>
+      <w:pPr>
+        <w:pStyle w:val="MSISTEXT"/>
+      </w:pPr>
+      <w:r>
+        <w:t>A second problem faced while designing intelligent intrusion detection models is that of high-dimensional data sets, which are filled with redundant and irrelevant features along with high correlations between different features. High-dimensional data sets add to computational overheads, increase the time required for model training, and adversely affect the detection performance because of noise and irrelevant features in the dataset.</w:t>
+      </w:r>
+    </w:p>
+    <w:p>
+      <w:pPr>
+        <w:pStyle w:val="MSISTEXT"/>
+        <w:rPr>
+          <w:lang w:val="en-IN"/>
+        </w:rPr>
+      </w:pPr>
+      <w:r>
+        <w:rPr>
+          <w:lang w:val="en-IN"/>
+        </w:rPr>
+        <w:t xml:space="preserve">Therefore, there is a need for an intelligent, data-driven intrusion detection framework capable of efficiently </w:t>
+      </w:r>
+      <w:proofErr w:type="spellStart"/>
+      <w:r>
+        <w:rPr>
+          <w:lang w:val="en-IN"/>
+        </w:rPr>
+        <w:t>analyzing</w:t>
+      </w:r>
+      <w:proofErr w:type="spellEnd"/>
+      <w:r>
+        <w:rPr>
+          <w:lang w:val="en-IN"/>
+        </w:rPr>
+        <w:t xml:space="preserve"> IoT network traffic, selecting the most relevant features, and accurately distinguishing between normal and malicious activities. Such a framework should provide high detection performance while minimizing computational overhead, making it suitable for deployment in modern IoT environments.</w:t>
+      </w:r>
+    </w:p>
+    <w:p>
+      <w:pPr>
+        <w:pStyle w:val="MSISSUBHEADIN"/>
+        <w:rPr>
+          <w:lang w:val="en-IN"/>
+        </w:rPr>
+      </w:pPr>
+      <w:r>
+        <w:t>MOTIVATION</w:t>
+      </w:r>
+    </w:p>
+    <w:p>
+      <w:pPr>
+        <w:pStyle w:val="MSISTEXT"/>
+      </w:pPr>
+      <w:r>
+        <w:t>The emergence of IoT technology at a breakneck pace has changed how different devices interact and communicate with each other through various applications. The smart home, healthcare system, automation industry, agriculture, and transportation all have become dependent on IoT devices to provide automation and real-time monitoring. However, the use of IoT devices has increased the number of attack surfaces and made the network vulnerable to attacks by the cyber-criminals. It has become important to maintain the integrity of these networks.</w:t>
+      </w:r>
+    </w:p>
+    <w:p>
+      <w:pPr>
+        <w:pStyle w:val="MSISTEXT"/>
+      </w:pPr>
+      <w:r>
+        <w:t xml:space="preserve">The conventional methodologies for intrusion detection include signature based and </w:t>
+      </w:r>
+      <w:proofErr w:type="gramStart"/>
+      <w:r>
+        <w:t>rule based</w:t>
+      </w:r>
+      <w:proofErr w:type="gramEnd"/>
+      <w:r>
+        <w:t xml:space="preserve"> systems. Even though these methods are quite efficient in detecting any attacks that have already been witnessed before, they lack the capability of detecting new attacks or any zero-day attacks since they depend on pre-programmed signatures and detection rules. In addition, the constant changing nature of </w:t>
+      </w:r>
+      <w:proofErr w:type="spellStart"/>
+      <w:r>
+        <w:t>cyber attacks</w:t>
+      </w:r>
+      <w:proofErr w:type="spellEnd"/>
+      <w:r>
+        <w:t xml:space="preserve"> necessitates regular updates of these detection systems.</w:t>
+      </w:r>
+    </w:p>
+    <w:p>
+      <w:pPr>
+        <w:pStyle w:val="MSISTEXT"/>
+        <w:rPr>
+          <w:lang w:val="en-IN"/>
+        </w:rPr>
+      </w:pPr>
+      <w:r>
+        <w:rPr>
+          <w:lang w:val="en-IN"/>
+        </w:rPr>
+        <w:t xml:space="preserve">The increasing volume of network traffic generated by IoT devices presents another major challenge for intrusion detection systems. Modern IoT datasets contain a large number of features, many of which may be redundant, irrelevant, or highly correlated. </w:t>
+      </w:r>
+      <w:r>
+        <w:rPr>
+          <w:lang w:val="en-IN"/>
+        </w:rPr>
         <w:lastRenderedPageBreak/>
-        <w:t>along with high correlations between different features. High-dimensional data sets add to computational overheads, increase the time required for model training, and adversely affect the detection performance because of noise and irrelevant features in the dataset.</w:t>
-      </w:r>
-    </w:p>
-    <w:p>
-      <w:pPr>
-        <w:pStyle w:val="MSISTEXT"/>
-        <w:rPr>
-          <w:lang w:val="en-IN"/>
-        </w:rPr>
-      </w:pPr>
-      <w:r>
-        <w:rPr>
-          <w:lang w:val="en-IN"/>
-        </w:rPr>
-        <w:t xml:space="preserve">Therefore, there is a need for an intelligent, data-driven intrusion detection framework capable of efficiently </w:t>
+        <w:t>Training machine learning and deep learning models using all available features increases computational complexity, prolongs training time, and may reduce the overall detection performance due to the inclusion of noisy information. Therefore, selecting the most informative features before model training is essential for improving both efficiency and classification accuracy.</w:t>
+      </w:r>
+    </w:p>
+    <w:p>
+      <w:pPr>
+        <w:pStyle w:val="MSISTEXT"/>
+      </w:pPr>
+      <w:r>
+        <w:t>The recent developments in the field of Artificial Intelligence (AI) such as Machine Learning (ML) and Deep Learning (DL) technologies have been proven very effective in improving the intrusion detection techniques. As opposed to traditional systems, these smart systems can easily learn complicated features through analysis of the network traffic itself. The machine learning algorithms make use of an effective feature set selection and classification, whereas the deep learning algorithms can easily learn the hierarchy in the network traffic.</w:t>
+      </w:r>
+    </w:p>
+    <w:p>
+      <w:pPr>
+        <w:pStyle w:val="MSISTEXT"/>
+      </w:pPr>
+      <w:r>
+        <w:t>Driven by the above challenges and opportunities, this study intends to propose an intelligent intrusion detection approach for IoT network by employing appropriate data preprocessing, feature selection, and AI approaches for classification. In this regard, the CICIoT2023 dataset is used in this study where data preprocessing and feature selection using Pearson Correlation Coefficient (PCC) are done in order to select the most significant features, and RF, ANN, and CNN are evaluated as classifiers for intrusion detection task. Comparison of these models based on performance measures will help to find out the efficient model for intrusion detection.</w:t>
+      </w:r>
+    </w:p>
+    <w:p>
+      <w:pPr>
+        <w:pStyle w:val="MSISSUBHEADIN"/>
+        <w:rPr>
+          <w:lang w:val="en-IN"/>
+        </w:rPr>
+      </w:pPr>
+      <w:r>
+        <w:t>PROPOSED SOLUTION</w:t>
+      </w:r>
+    </w:p>
+    <w:p>
+      <w:pPr>
+        <w:pStyle w:val="MSISTEXT"/>
+        <w:rPr>
+          <w:lang w:val="en-IN"/>
+        </w:rPr>
+      </w:pPr>
+      <w:r>
+        <w:rPr>
+          <w:lang w:val="en-IN"/>
+        </w:rPr>
+        <w:t xml:space="preserve">To address the security challenges associated with Internet of Things (IoT) networks, this project implements an Artificial Intelligence (AI)-based intrusion detection system by following the methodology proposed in the selected research study. The implementation focuses on reproducing the data preprocessing, feature selection, model development, and evaluation pipeline presented in the reference work, while </w:t>
       </w:r>
       <w:proofErr w:type="spellStart"/>
       <w:r>
@@ -4967,133 +5099,45 @@
         <w:rPr>
           <w:lang w:val="en-IN"/>
         </w:rPr>
-        <w:t xml:space="preserve"> IoT network traffic, selecting the most relevant features, and accurately distinguishing between normal and malicious activities. Such a framework should provide high detection performance while minimizing computational overhead, making it suitable for deployment in modern IoT environments.</w:t>
-      </w:r>
-    </w:p>
-    <w:p>
-      <w:pPr>
-        <w:pStyle w:val="MSISSUBHEADIN"/>
-        <w:rPr>
-          <w:lang w:val="en-IN"/>
-        </w:rPr>
-      </w:pPr>
-      <w:r>
-        <w:t>MOTIVATION</w:t>
-      </w:r>
-    </w:p>
-    <w:p>
-      <w:pPr>
-        <w:pStyle w:val="MSISTEXT"/>
-      </w:pPr>
-      <w:r>
-        <w:t>The emergence of IoT technology at a breakneck pace has changed how different devices interact and communicate with each other through various applications. The smart home, healthcare system, automation industry, agriculture, and transportation all have become dependent on IoT devices to provide automation and real-time monitoring. However, the use of IoT devices has increased the number of attack surfaces and made the network vulnerable to attacks by the cyber-criminals. It has become important to maintain the integrity of these networks.</w:t>
-      </w:r>
-    </w:p>
-    <w:p>
-      <w:pPr>
-        <w:pStyle w:val="MSISTEXT"/>
-      </w:pPr>
-      <w:r>
-        <w:t xml:space="preserve">The conventional methodologies for intrusion detection include signature based and </w:t>
-      </w:r>
-      <w:proofErr w:type="gramStart"/>
-      <w:r>
-        <w:t>rule based</w:t>
-      </w:r>
-      <w:proofErr w:type="gramEnd"/>
-      <w:r>
-        <w:t xml:space="preserve"> systems. Even though these methods are quite efficient in detecting any attacks that have already been witnessed before, they lack the capability of detecting new attacks or any zero-day attacks since they depend on pre-programmed signatures and detection rules. In addition, the constant changing nature of </w:t>
-      </w:r>
-      <w:proofErr w:type="spellStart"/>
-      <w:r>
-        <w:t>cyber attacks</w:t>
-      </w:r>
-      <w:proofErr w:type="spellEnd"/>
-      <w:r>
-        <w:t xml:space="preserve"> necessitates regular updates of these detection systems.</w:t>
-      </w:r>
-    </w:p>
-    <w:p>
-      <w:pPr>
-        <w:pStyle w:val="MSISTEXT"/>
-        <w:rPr>
-          <w:lang w:val="en-IN"/>
-        </w:rPr>
-      </w:pPr>
-      <w:r>
-        <w:rPr>
-          <w:lang w:val="en-IN"/>
-        </w:rPr>
-        <w:t>The increasing volume of network traffic generated by IoT devices presents another major challenge for intrusion detection systems. Modern IoT datasets contain a large number of features, many of which may be redundant, irrelevant, or highly correlated. Training machine learning and deep learning models using all available features increases computational complexity, prolongs training time, and may reduce the overall detection performance due to the inclusion of noisy information. Therefore, selecting the most informative features before model training is essential for improving both efficiency and classification accuracy.</w:t>
-      </w:r>
-    </w:p>
-    <w:p>
-      <w:pPr>
-        <w:pStyle w:val="MSISTEXT"/>
-      </w:pPr>
-      <w:r>
+        <w:t xml:space="preserve"> its effectiveness on the selected IoT intrusion dataset.</w:t>
+      </w:r>
+    </w:p>
+    <w:p>
+      <w:pPr>
+        <w:pStyle w:val="MSISTEXT"/>
+        <w:rPr>
+          <w:lang w:val="en-IN"/>
+        </w:rPr>
+      </w:pPr>
+    </w:p>
+    <w:p>
+      <w:pPr>
+        <w:pStyle w:val="MSISTEXT"/>
+        <w:rPr>
+          <w:lang w:val="en-IN"/>
+        </w:rPr>
+      </w:pPr>
+    </w:p>
+    <w:p>
+      <w:pPr>
+        <w:pStyle w:val="MSISTEXT"/>
+        <w:rPr>
+          <w:lang w:val="en-IN"/>
+        </w:rPr>
+      </w:pPr>
+    </w:p>
+    <w:p>
+      <w:pPr>
+        <w:pStyle w:val="MSISTEXT"/>
+        <w:rPr>
+          <w:lang w:val="en-IN"/>
+        </w:rPr>
+      </w:pPr>
+      <w:r>
+        <w:rPr>
+          <w:lang w:val="en-IN"/>
+        </w:rPr>
         <w:lastRenderedPageBreak/>
-        <w:t>The recent developments in the field of Artificial Intelligence (AI) such as Machine Learning (ML) and Deep Learning (DL) technologies have been proven very effective in improving the intrusion detection techniques. As opposed to traditional systems, these smart systems can easily learn complicated features through analysis of the network traffic itself. The machine learning algorithms make use of an effective feature set selection and classification, whereas the deep learning algorithms can easily learn the hierarchy in the network traffic.</w:t>
-      </w:r>
-    </w:p>
-    <w:p>
-      <w:pPr>
-        <w:pStyle w:val="MSISTEXT"/>
-      </w:pPr>
-      <w:r>
-        <w:t>Driven by the above challenges and opportunities, this study intends to propose an intelligent intrusion detection approach for IoT network by employing appropriate data preprocessing, feature selection, and AI approaches for classification. In this regard, the CICIoT2023 dataset is used in this study where data preprocessing and feature selection using Pearson Correlation Coefficient (PCC) are done in order to select the most significant features, and RF, ANN, and CNN are evaluated as classifiers for intrusion detection task. Comparison of these models based on performance measures will help to find out the efficient model for intrusion detection.</w:t>
-      </w:r>
-    </w:p>
-    <w:p>
-      <w:pPr>
-        <w:pStyle w:val="MSISSUBHEADIN"/>
-        <w:rPr>
-          <w:lang w:val="en-IN"/>
-        </w:rPr>
-      </w:pPr>
-      <w:r>
-        <w:t>PROPOSED SOLUTION</w:t>
-      </w:r>
-    </w:p>
-    <w:p>
-      <w:pPr>
-        <w:pStyle w:val="MSISTEXT"/>
-        <w:rPr>
-          <w:lang w:val="en-IN"/>
-        </w:rPr>
-      </w:pPr>
-      <w:r>
-        <w:rPr>
-          <w:lang w:val="en-IN"/>
-        </w:rPr>
-        <w:t xml:space="preserve">To address the security challenges associated with Internet of Things (IoT) networks, this project implements an Artificial Intelligence (AI)-based intrusion detection system by following the methodology proposed in the selected research study. The implementation focuses on reproducing the data preprocessing, feature selection, model development, and evaluation pipeline presented in the reference work, while </w:t>
-      </w:r>
-      <w:proofErr w:type="spellStart"/>
-      <w:r>
-        <w:rPr>
-          <w:lang w:val="en-IN"/>
-        </w:rPr>
-        <w:t>analyzing</w:t>
-      </w:r>
-      <w:proofErr w:type="spellEnd"/>
-      <w:r>
-        <w:rPr>
-          <w:lang w:val="en-IN"/>
-        </w:rPr>
-        <w:t xml:space="preserve"> its effectiveness on the selected IoT intrusion dataset.</w:t>
-      </w:r>
-    </w:p>
-    <w:p>
-      <w:pPr>
-        <w:pStyle w:val="MSISTEXT"/>
-        <w:rPr>
-          <w:lang w:val="en-IN"/>
-        </w:rPr>
-      </w:pPr>
-      <w:r>
-        <w:rPr>
-          <w:lang w:val="en-IN"/>
-        </w:rPr>
         <w:t xml:space="preserve">The proposed methodology begins with the </w:t>
       </w:r>
       <w:r>
@@ -5116,11 +5160,7 @@
         <w:pStyle w:val="MSISTEXT"/>
       </w:pPr>
       <w:r>
-        <w:t xml:space="preserve">Following data preprocessing, Exploratory Data Analysis (EDA) is performed to understand the characteristics of the dataset, identify feature distributions, examine class imbalance, and gain insights into the relationship between different network traffic </w:t>
-      </w:r>
-      <w:r>
-        <w:lastRenderedPageBreak/>
-        <w:t>attributes. This analysis assists in selecting an appropriate preprocessing and feature selection strategy.</w:t>
+        <w:t>Following data preprocessing, Exploratory Data Analysis (EDA) is performed to understand the characteristics of the dataset, identify feature distributions, examine class imbalance, and gain insights into the relationship between different network traffic attributes. This analysis assists in selecting an appropriate preprocessing and feature selection strategy.</w:t>
       </w:r>
       <w:r>
         <w:t xml:space="preserve"> </w:t>
@@ -5180,6 +5220,20 @@
           <w:lang w:val="en-IN"/>
         </w:rPr>
         <w:t>The overall objective of this implementation is to reproduce the methodology presented in the selected research work and evaluate the performance of traditional machine learning and deep learning techniques for IoT intrusion detection. The outcomes of this study provide insights into the effectiveness of the implemented models and establish a foundation for future enhancements and comparative analyses.</w:t>
+      </w:r>
+    </w:p>
+    <w:p>
+      <w:pPr>
+        <w:spacing w:after="160"/>
+        <w:rPr>
+          <w:rFonts w:cs="Times New Roman"/>
+          <w:kern w:val="2"/>
+          <w:szCs w:val="24"/>
+          <w14:ligatures w14:val="standardContextual"/>
+        </w:rPr>
+      </w:pPr>
+      <w:r>
+        <w:br w:type="page"/>
       </w:r>
     </w:p>
     <w:p>
@@ -5191,6 +5245,7 @@
         </w:numPr>
       </w:pPr>
       <w:r>
+        <w:lastRenderedPageBreak/>
         <w:t>OBJECTIVES</w:t>
       </w:r>
     </w:p>
@@ -5228,6 +5283,24 @@
       </w:pPr>
       <w:r>
         <w:t>To evaluate the developed intrusion detection models using metrics such as Accuracy, Precision, Recall, F1-Score, ROC-AUC, and False Alarm Rate and develop a visual dashboard to monitor and present their performance.</w:t>
+      </w:r>
+    </w:p>
+    <w:p>
+      <w:pPr>
+        <w:spacing w:after="160"/>
+        <w:rPr>
+          <w:rFonts w:cs="Times New Roman"/>
+          <w:b/>
+          <w:bCs/>
+          <w:kern w:val="2"/>
+          <w:sz w:val="28"/>
+          <w:szCs w:val="28"/>
+          <w:lang w:val="en-US"/>
+          <w14:ligatures w14:val="standardContextual"/>
+        </w:rPr>
+      </w:pPr>
+      <w:r>
+        <w:br w:type="page"/>
       </w:r>
     </w:p>
     <w:p>
@@ -5239,6 +5312,7 @@
         </w:numPr>
       </w:pPr>
       <w:r>
+        <w:lastRenderedPageBreak/>
         <w:t>LITERATURE SURVEY</w:t>
       </w:r>
     </w:p>
@@ -5255,53 +5329,292 @@
         <w:pStyle w:val="MSISTEXT"/>
       </w:pPr>
       <w:r>
+        <w:t xml:space="preserve">Fast development of the Internet of Things has resulted in an increasing requirement for effective cybersecurity tools that can ensure the security of the devices connected in the network from possible </w:t>
+      </w:r>
+      <w:proofErr w:type="spellStart"/>
+      <w:r>
+        <w:t>cyber attacks</w:t>
+      </w:r>
+      <w:proofErr w:type="spellEnd"/>
+      <w:r>
+        <w:t>. With the expansion of IoT networks in different domains of applications, various techniques of intrusion detection have been suggested in order to detect any possible malicious behavior in the network while maintaining the required efficiency and reliability of IoT. Within the last ten years, intrusion detection systems have become more advanced from simple signature-based methods to machine learning-based systems.</w:t>
+      </w:r>
+    </w:p>
+    <w:p>
+      <w:pPr>
+        <w:pStyle w:val="MSISTEXT"/>
+      </w:pPr>
+      <w:r>
+        <w:t>A number of researchers have proposed the use of machine learning techniques like Decision Tree, Random Forest, Support Vector Machine, Naive Bayes, and Ensemble Learning in detecting attacks in a network. These approaches have shown encouraging results in recognizing attack signatures and possess better adaptability than the rule-based approaches used traditionally. Nevertheless, most of the classical machine learning approaches depend on hand-crafted feature engineering and their performance may drop while processing high-dimensional data sets which include redundant features.</w:t>
+      </w:r>
+    </w:p>
+    <w:p>
+      <w:pPr>
+        <w:pStyle w:val="MSISTEXT"/>
+      </w:pPr>
+      <w:r>
+        <w:t>Given the growing availability of large cybersecurity datasets, deep learning methods have been gaining popularity because of their potential to learn advanced feature representations autonomously from network traffic data. Some of the machine learning algorithms that have been used for the purpose of intrusion detection include ANN, CNN, RNN, and LSTM. These methods have been successful in increasing the detection accuracy for complex attack situations. However, despite these developments, there are issues such as computational complexity, feature redundancy, class imbalance, and scalability that affect intrusion detection system performance.</w:t>
+      </w:r>
+    </w:p>
+    <w:p>
+      <w:pPr>
+        <w:pStyle w:val="MSISTEXT"/>
+        <w:rPr>
+          <w:lang w:val="en-IN"/>
+        </w:rPr>
+      </w:pPr>
+      <w:r>
+        <w:rPr>
+          <w:lang w:val="en-IN"/>
+        </w:rPr>
+        <w:t xml:space="preserve">To address these challenges, recent research has focused on combining efficient data preprocessing techniques with feature selection methods and intelligent classification algorithms. Feature selection techniques such as the Pearson Correlation Coefficient (PCC) have been widely employed to eliminate redundant features, reduce computational complexity, and improve model performance. The research paper </w:t>
+      </w:r>
+      <w:r>
+        <w:rPr>
+          <w:lang w:val="en-IN"/>
+        </w:rPr>
         <w:lastRenderedPageBreak/>
-        <w:t xml:space="preserve">Fast development of the Internet of Things has resulted in an increasing requirement for effective cybersecurity tools that can ensure the security of the devices connected in the network from possible </w:t>
+        <w:t>selected for this project follows this approach by integrating PCC-based feature selection with machine learning and deep learning models for IoT intrusion detection. The following sections present a detailed review of the existing literature, highlight recent developments in AI-based intrusion detection systems, and identify the research work that forms the foundation of the present implementation.</w:t>
+      </w:r>
+    </w:p>
+    <w:p>
+      <w:pPr>
+        <w:pStyle w:val="MSISSUBHEADIN"/>
+      </w:pPr>
+      <w:r>
+        <w:t>SUMMARY OF EXISTING RESEARCH PAPERS</w:t>
+      </w:r>
+    </w:p>
+    <w:p>
+      <w:pPr>
+        <w:pStyle w:val="MSISTEXT"/>
+      </w:pPr>
+      <w:r>
+        <w:t>There has been an improvement in technology of IoT in recent times, resulting in increased research efforts on securing devices that are connected against potential threats on the Internet. As shown by the studies in this paper, the development of the IoT in fields such as smart homes, health care, automation industry, transportation, and smart cities has posed a challenge for achieving a secure communication between resource constrained devices. This is because traditional methods of security cannot guarantee protection for modern day IoT environments owing to the heterogeneity of network traffic. As a result, there has been increased interest in creating IDSs that are intelligent enough to detect any threat with minimal computational overhead.</w:t>
+      </w:r>
+    </w:p>
+    <w:p>
+      <w:pPr>
+        <w:pStyle w:val="MSISTEXT"/>
+      </w:pPr>
+      <w:r>
+        <w:t>As far as the literature shows, intrusion detection techniques have come a long way during the last ten years. The first IDS technologies used signature- and rule-based approaches for traffic classification, where attack signatures and rules, which were pre-defined by experts, were used to detect attacks. This approach proved to be quite efficient in case of known attacks; however, it lacked adaptability towards zero-day attacks and new intrusion patterns. Besides, the constant update of signature and rule databases makes these approaches ineffective in ever-changing IoT environments.</w:t>
+      </w:r>
+    </w:p>
+    <w:p>
+      <w:pPr>
+        <w:pStyle w:val="MSISTEXT"/>
+      </w:pPr>
+      <w:r>
+        <w:t>The Machine Learning (ML) approach has proved to be one of the most common methods for IoT intrusion detection. There have been multiple studies focused on the evaluation of different supervised machine learning techniques, such as Decision Trees, Random Forest, SVM, Naive Bayes, K-Nearest Neighbors, Logistic Regression, and also ensemble learning approaches. Based on the analyzed literature, Random Forest has been one of the most popular classifiers used in the studies due to its efficiency and reduced risks of overfitting. Moreover, all kinds of ensemble learning approaches have shown better classification results than other approaches, as well as low computational complexity.</w:t>
+      </w:r>
+    </w:p>
+    <w:p>
+      <w:pPr>
+        <w:pStyle w:val="MSISTEXT"/>
+      </w:pPr>
+      <w:r>
+        <w:lastRenderedPageBreak/>
+        <w:t>Due to increased access to cybersecurity big data, there is a lot of focus on DL approaches owing to their potential in automatic hierarchical representation learning. In the reviewed papers, many different types of ANN models such as CNNs, RNNs, LSTMs, and hybrid deep learning architectures have been used for intrusion detection. Among all these approaches, CNNs have shown better results since they are effective in capturing complex patterns in network traffic without relying much on manual feature extraction. However, one of the limitations of deep learning approaches is that they need bigger datasets, more computation resources, and longer training time as compared to traditional ML models.</w:t>
+      </w:r>
+    </w:p>
+    <w:p>
+      <w:pPr>
+        <w:pStyle w:val="MSISTEXT"/>
+      </w:pPr>
+      <w:r>
+        <w:t>Another significant finding from the reviewed literature is the increasing importance of data preprocessing and feature selection. Almost all publicly available intrusion detection datasets include redundant, irrelevant, or highly correlated features which might adversely impact the performance of models and make the computation more expensive. For this reason, many different feature selection algorithms have been investigated, such as filter methods, wrapper methods, embedded methods, and hybrid methods. One of the filter algorithms is the Pearson Correlation Coefficient (PCC), which has attracted much attention because of its low computational cost and effectiveness in selecting highly relevant features while filtering out redundant features.</w:t>
+      </w:r>
+    </w:p>
+    <w:p>
+      <w:pPr>
+        <w:pStyle w:val="MSISTEXT"/>
+      </w:pPr>
+      <w:r>
+        <w:t xml:space="preserve">Benchmark datasets have been pointed out by the literature as a necessary factor to test the intrusion detection systems. These are some of the widely used benchmark datasets – NSL-KDD, UNSW-NB15, CICIDS2017, </w:t>
       </w:r>
       <w:proofErr w:type="spellStart"/>
       <w:r>
+        <w:t>BoT</w:t>
+      </w:r>
+      <w:proofErr w:type="spellEnd"/>
+      <w:r>
+        <w:t>-IoT, IoTID20, and in recent years CICIoT2023. The datasets have various attack cases as well as traffic features for evaluation of the performance of the research models in various network environments. Evaluations have been carried out through parameters such as Accuracy, Precision, Recall, F1-Score, ROC curve, AUC, and Confusion Matrix.</w:t>
+      </w:r>
+    </w:p>
+    <w:p>
+      <w:pPr>
+        <w:pStyle w:val="MSISTEXT"/>
+      </w:pPr>
+      <w:r>
+        <w:t xml:space="preserve">Even with considerable advances in the state of art as described above, there are many issues that continue to hamper the practical application of AI-driven IDS in IoT environments. Some of the problems that have been identified include issues related to high-dimensional data, class imbalance, noisy network traffic, complexity of algorithms, low interpretability of models, and constant introduction of novel attacks. Increasing number of works deal with creating lightweight and scalable solutions to </w:t>
+      </w:r>
+      <w:r>
+        <w:lastRenderedPageBreak/>
+        <w:t>intrusion detection problem that provide high precision through efficient preprocessing, feature selection, and machine learning models.</w:t>
+      </w:r>
+    </w:p>
+    <w:p>
+      <w:pPr>
+        <w:pStyle w:val="MSISTEXT"/>
+      </w:pPr>
+      <w:r>
+        <w:t>In general, the discussed literature illustrates an evident shift from traditional intrusion detection techniques to intelligent AI-based systems. The overall insights indicate that the combination of successful data preprocessing, efficient feature selection, and powerful machine/deep learning approaches can be considered an effective way towards enhancing the performance of intrusion detection systems within contemporary IoT environments. The outlined findings serve as the base for the methodology used within the current research, as suggested in the chosen PCC-CNN literature review paper.</w:t>
+      </w:r>
+    </w:p>
+    <w:p>
+      <w:pPr>
+        <w:pStyle w:val="MSISSUBHEADIN"/>
+      </w:pPr>
+      <w:r>
+        <w:t>SELECTED RESEARCH PAPER</w:t>
+      </w:r>
+    </w:p>
+    <w:p>
+      <w:pPr>
+        <w:pStyle w:val="MSISTEXT"/>
+      </w:pPr>
+      <w:r>
+        <w:t xml:space="preserve">The implementation used in this work is inspired from the research paper titled "Anomaly Based Intrusion Detection System for IoT Application" authored by Mansi Bhavsar, Kaushik Roy, John Kelly, and </w:t>
+      </w:r>
+      <w:proofErr w:type="spellStart"/>
+      <w:r>
+        <w:t>Odeyomi</w:t>
+      </w:r>
+      <w:proofErr w:type="spellEnd"/>
+      <w:r>
+        <w:t xml:space="preserve"> Olusola. In the research paper, an AI-based intrusion detection system has been suggested, which uses the Pearson Correlation Coefficient (PCC) method to select features along with a CNN for the purpose of anomaly detection in IoT networks. The aim of the research is to increase the performance of intrusion detection by removing redundant features before classification.</w:t>
+      </w:r>
+    </w:p>
+    <w:p>
+      <w:pPr>
+        <w:pStyle w:val="MSISTEXT"/>
+        <w:rPr>
+          <w:lang w:val="en-IN"/>
+        </w:rPr>
+      </w:pPr>
+      <w:r>
+        <w:rPr>
+          <w:lang w:val="en-IN"/>
+        </w:rPr>
+        <w:t>The authors recognize that IoT devices continuously generate large volumes of heterogeneous network traffic, making traditional intrusion detection techniques less effective due to increasing computational complexity and evolving attack patterns. They emphasize that datasets used for intrusion detection often contain redundant and highly correlated features, which unnecessarily increase training time and may reduce the effectiveness of learning algorithms. To address this challenge, the proposed framework first performs feature selection using the Pearson Correlation Coefficient (PCC), allowing only the most relevant features to be used for model training.</w:t>
+      </w:r>
+    </w:p>
+    <w:p>
+      <w:pPr>
+        <w:pStyle w:val="MSISTEXT"/>
+      </w:pPr>
+      <w:r>
+        <w:t xml:space="preserve">The methodology that will be adopted for this study involves various stages that are carried out sequentially, starting with data pre-processing. Firstly, the datasets are processed to ensure that they are ready for use in the modeling process. In the next stage, feature selection is performed using PCC. The correlation value of each feature and the target variable is determined. The features having higher correlation values are </w:t>
+      </w:r>
+      <w:r>
+        <w:lastRenderedPageBreak/>
+        <w:t>selected while those having lower values are disregarded since they do not add much information to the classifier.</w:t>
+      </w:r>
+    </w:p>
+    <w:p>
+      <w:pPr>
+        <w:pStyle w:val="MSISTEXT"/>
+        <w:rPr>
+          <w:lang w:val="en-IN"/>
+        </w:rPr>
+      </w:pPr>
+      <w:r>
+        <w:rPr>
+          <w:lang w:val="en-IN"/>
+        </w:rPr>
+        <w:t>Following feature selection, the selected features are provided as input to a Convolutional Neural Network (CNN). Although CNNs are traditionally associated with image processing, the authors demonstrate that one-dimensional convolutional operations can effectively learn local feature relationships present in network traffic data. The CNN automatically extracts hierarchical representations from the selected features, enabling the model to distinguish between normal and malicious network traffic with high accuracy. The learning capability of CNN also reduces the dependence on manually engineered features, making it suitable for complex intrusion detection tasks.</w:t>
+      </w:r>
+    </w:p>
+    <w:p>
+      <w:pPr>
+        <w:pStyle w:val="MSISTEXT"/>
+      </w:pPr>
+      <w:r>
+        <w:t xml:space="preserve">In order to conduct performance analysis of the suggested framework, three datasets that are widely used for intrusions detections were used: NSL-KDD, CICIDS2017, and IoTID20. These datasets together cover different classes of </w:t>
+      </w:r>
+      <w:proofErr w:type="spellStart"/>
+      <w:r>
         <w:t>cyber attacks</w:t>
       </w:r>
       <w:proofErr w:type="spellEnd"/>
       <w:r>
-        <w:t>. With the expansion of IoT networks in different domains of applications, various techniques of intrusion detection have been suggested in order to detect any possible malicious behavior in the network while maintaining the required efficiency and reliability of IoT. Within the last ten years, intrusion detection systems have become more advanced from simple signature-based methods to machine learning-based systems.</w:t>
-      </w:r>
-    </w:p>
-    <w:p>
-      <w:pPr>
-        <w:pStyle w:val="MSISTEXT"/>
-      </w:pPr>
-      <w:r>
-        <w:t>A number of researchers have proposed the use of machine learning techniques like Decision Tree, Random Forest, Support Vector Machine, Naive Bayes, and Ensemble Learning in detecting attacks in a network. These approaches have shown encouraging results in recognizing attack signatures and possess better adaptability than the rule-based approaches used traditionally. Nevertheless, most of the classical machine learning approaches depend on hand-crafted feature engineering and their performance may drop while processing high-dimensional data sets which include redundant features.</w:t>
-      </w:r>
-    </w:p>
-    <w:p>
-      <w:pPr>
-        <w:pStyle w:val="MSISTEXT"/>
-      </w:pPr>
-      <w:r>
-        <w:t>Given the growing availability of large cybersecurity datasets, deep learning methods have been gaining popularity because of their potential to learn advanced feature representations autonomously from network traffic data. Some of the machine learning algorithms that have been used for the purpose of intrusion detection include ANN, CNN, RNN, and LSTM. These methods have been successful in increasing the detection accuracy for complex attack situations. However, despite these developments, there are issues such as computational complexity, feature redundancy, class imbalance, and scalability that affect intrusion detection system performance.</w:t>
-      </w:r>
-    </w:p>
-    <w:p>
-      <w:pPr>
-        <w:pStyle w:val="MSISTEXT"/>
-        <w:rPr>
-          <w:lang w:val="en-IN"/>
-        </w:rPr>
-      </w:pPr>
-      <w:r>
-        <w:rPr>
-          <w:lang w:val="en-IN"/>
-        </w:rPr>
-        <w:t xml:space="preserve">To address these challenges, recent research has focused on combining efficient data preprocessing techniques with feature selection methods and intelligent classification algorithms. Feature selection techniques such as the Pearson Correlation Coefficient (PCC) have been widely employed to eliminate redundant features, reduce computational complexity, and improve model performance. The research paper selected for this project follows this approach by integrating PCC-based feature selection with machine learning and deep learning models for IoT intrusion detection. The following sections present a detailed review of the existing literature, highlight </w:t>
-      </w:r>
-      <w:r>
-        <w:rPr>
-          <w:lang w:val="en-IN"/>
-        </w:rPr>
+        <w:t xml:space="preserve"> as well as different networks, which allows the methodology to be tested under varied operational conditions. Evaluation of performance was done via calculation of such traditional measures of classification as accuracy, precision, recall, and f1-score.</w:t>
+      </w:r>
+    </w:p>
+    <w:p>
+      <w:pPr>
+        <w:pStyle w:val="MSISTEXT"/>
+      </w:pPr>
+      <w:r>
+        <w:t xml:space="preserve">The experimental results provided by the paper suggest that using the combination of PCC-based feature selection with the CNN model increases intrusion detection accuracy while decreasing the computational complexity of the process. This is achieved because of the reduction of unnecessary data prior to the training process which decreases the </w:t>
+      </w:r>
+      <w:proofErr w:type="gramStart"/>
+      <w:r>
+        <w:t>amount</w:t>
+      </w:r>
+      <w:proofErr w:type="gramEnd"/>
+      <w:r>
+        <w:t xml:space="preserve"> of calculations needed for learning. Furthermore, the results confirm that CNN can detect complicated patterns in the IoT network traffic effectively.</w:t>
+      </w:r>
+    </w:p>
+    <w:p>
+      <w:pPr>
+        <w:pStyle w:val="MSISTEXT"/>
+        <w:rPr>
+          <w:lang w:val="en-IN"/>
+        </w:rPr>
+      </w:pPr>
+      <w:r>
+        <w:rPr>
+          <w:lang w:val="en-IN"/>
+        </w:rPr>
+        <w:t>One of the major strengths of the proposed research is its systematic combination of efficient feature selection and deep learning-based classification. Instead of directly training a deep learning model using all available features, the authors first reduce the dimensionality of the data through PCC-based filtering, thereby improving both computational efficiency and model performance. Additionally, evaluating the framework on three different benchmark datasets enhances the credibility of the reported results by demonstrating consistent performance across multiple network environments.</w:t>
+      </w:r>
+    </w:p>
+    <w:p>
+      <w:pPr>
+        <w:pStyle w:val="MSISTEXT"/>
+      </w:pPr>
+      <w:r>
         <w:lastRenderedPageBreak/>
-        <w:t>recent developments in AI-based intrusion detection systems, and identify the research work that forms the foundation of the present implementation.</w:t>
+        <w:t>The study, however, also presents certain limitations. The experimental evaluation is restricted to the NSL-KDD, CICIDS2017, and IoTID20 datasets, which may not fully represent the latest attack patterns observed in modern IoT environments. Recent datasets such as CICIoT2023, which include newer attack scenarios and more diverse IoT traffic, were not considered during evaluation. Furthermore, the research primarily focuses on the CNN-based classification model and does not provide a detailed comparative analysis with multiple machine learning and deep learning classifiers under identical preprocessing conditions. These observations provide opportunities for further evaluation using updated datasets and additional classification models.</w:t>
+      </w:r>
+    </w:p>
+    <w:p>
+      <w:pPr>
+        <w:pStyle w:val="MSISTEXT"/>
+      </w:pPr>
+      <w:r>
+        <w:t>The methodology proposed in this research paper serves as the foundation for the implementation carried out in the present project. While preserving the core preprocessing and feature selection strategy proposed by the authors, the current work evaluates the methodology using the CICIoT2023 dataset and investigates the performance of Random Forest (RF), Artificial Neural Network (ANN), and Convolutional Neural Network (CNN) models under a common experimental framework. This implementation facilitates a broader comparative analysis while maintaining consistency with the methodology presented in the selected research paper.</w:t>
+      </w:r>
+    </w:p>
+    <w:p>
+      <w:pPr>
+        <w:pStyle w:val="MSISTEXT"/>
+      </w:pPr>
+      <w:r>
+        <w:rPr>
+          <w:lang w:val="en-IN"/>
+        </w:rPr>
+        <w:t>The selected research paper was chosen because it presents a structured and well-validated methodology that integrates feature selection with deep learning for IoT intrusion detection. Its evaluation on multiple benchmark datasets, together with its clear preprocessing pipeline, makes it an appropriate foundation for implementation and comparative analysis. The methodology is reproducible and provides a suitable basis for assessing its performance on the CICIoT2023 dataset using additional classification models.</w:t>
+      </w:r>
+    </w:p>
+    <w:p>
+      <w:pPr>
+        <w:spacing w:after="160"/>
+        <w:rPr>
+          <w:rFonts w:cs="Times New Roman"/>
+          <w:b/>
+          <w:bCs/>
+          <w:kern w:val="2"/>
+          <w:szCs w:val="24"/>
+          <w:lang w:val="en-US"/>
+          <w14:ligatures w14:val="standardContextual"/>
+        </w:rPr>
+      </w:pPr>
+      <w:r>
+        <w:br w:type="page"/>
       </w:r>
     </w:p>
     <w:p>
@@ -5309,295 +5622,64 @@
         <w:pStyle w:val="MSISSUBHEADIN"/>
       </w:pPr>
       <w:r>
-        <w:t>SUMMARY OF EXISTING RESEARCH PAPERS</w:t>
-      </w:r>
-    </w:p>
-    <w:p>
-      <w:pPr>
-        <w:pStyle w:val="MSISTEXT"/>
-      </w:pPr>
-      <w:r>
-        <w:t>There has been an improvement in technology of IoT in recent times, resulting in increased research efforts on securing devices that are connected against potential threats on the Internet. As shown by the studies in this paper, the development of the IoT in fields such as smart homes, health care, automation industry, transportation, and smart cities has posed a challenge for achieving a secure communication between resource constrained devices. This is because traditional methods of security cannot guarantee protection for modern day IoT environments owing to the heterogeneity of network traffic. As a result, there has been increased interest in creating IDSs that are intelligent enough to detect any threat with minimal computational overhead.</w:t>
-      </w:r>
-    </w:p>
-    <w:p>
-      <w:pPr>
-        <w:pStyle w:val="MSISTEXT"/>
-      </w:pPr>
-      <w:r>
-        <w:t>As far as the literature shows, intrusion detection techniques have come a long way during the last ten years. The first IDS technologies used signature- and rule-based approaches for traffic classification, where attack signatures and rules, which were pre-defined by experts, were used to detect attacks. This approach proved to be quite efficient in case of known attacks; however, it lacked adaptability towards zero-day attacks and new intrusion patterns. Besides, the constant update of signature and rule databases makes these approaches ineffective in ever-changing IoT environments.</w:t>
-      </w:r>
-    </w:p>
-    <w:p>
-      <w:pPr>
-        <w:pStyle w:val="MSISTEXT"/>
-      </w:pPr>
-      <w:r>
-        <w:t>The Machine Learning (ML) approach has proved to be one of the most common methods for IoT intrusion detection. There have been multiple studies focused on the evaluation of different supervised machine learning techniques, such as Decision Trees, Random Forest, SVM, Naive Bayes, K-Nearest Neighbors, Logistic Regression, and also ensemble learning approaches. Based on the analyzed literature, Random Forest has been one of the most popular classifiers used in the studies due to its efficiency and reduced risks of overfitting. Moreover, all kinds of ensemble learning approaches have shown better classification results than other approaches, as well as low computational complexity.</w:t>
-      </w:r>
-    </w:p>
-    <w:p>
-      <w:pPr>
-        <w:pStyle w:val="MSISTEXT"/>
-      </w:pPr>
-      <w:r>
-        <w:t xml:space="preserve">Due to increased access to cybersecurity big data, there is a lot of focus on DL approaches owing to their potential in automatic hierarchical representation learning. In the reviewed papers, many different types of ANN models such as CNNs, RNNs, LSTMs, and hybrid deep learning architectures have been used for intrusion detection. </w:t>
-      </w:r>
-      <w:r>
         <w:lastRenderedPageBreak/>
-        <w:t>Among all these approaches, CNNs have shown better results since they are effective in capturing complex patterns in network traffic without relying much on manual feature extraction. However, one of the limitations of deep learning approaches is that they need bigger datasets, more computation resources, and longer training time as compared to traditional ML models.</w:t>
-      </w:r>
-    </w:p>
-    <w:p>
-      <w:pPr>
-        <w:pStyle w:val="MSISTEXT"/>
-      </w:pPr>
-      <w:r>
-        <w:t>Another significant finding from the reviewed literature is the increasing importance of data preprocessing and feature selection. Almost all publicly available intrusion detection datasets include redundant, irrelevant, or highly correlated features which might adversely impact the performance of models and make the computation more expensive. For this reason, many different feature selection algorithms have been investigated, such as filter methods, wrapper methods, embedded methods, and hybrid methods. One of the filter algorithms is the Pearson Correlation Coefficient (PCC), which has attracted much attention because of its low computational cost and effectiveness in selecting highly relevant features while filtering out redundant features.</w:t>
-      </w:r>
-    </w:p>
-    <w:p>
-      <w:pPr>
-        <w:pStyle w:val="MSISTEXT"/>
-      </w:pPr>
-      <w:r>
-        <w:t xml:space="preserve">Benchmark datasets have been pointed out by the literature as a necessary factor to test the intrusion detection systems. These are some of the widely used benchmark datasets – NSL-KDD, UNSW-NB15, CICIDS2017, </w:t>
-      </w:r>
-      <w:proofErr w:type="spellStart"/>
-      <w:r>
-        <w:t>BoT</w:t>
-      </w:r>
-      <w:proofErr w:type="spellEnd"/>
-      <w:r>
-        <w:t>-IoT, IoTID20, and in recent years CICIoT2023. The datasets have various attack cases as well as traffic features for evaluation of the performance of the research models in various network environments. Evaluations have been carried out through parameters such as Accuracy, Precision, Recall, F1-Score, ROC curve, AUC, and Confusion Matrix.</w:t>
-      </w:r>
-    </w:p>
-    <w:p>
-      <w:pPr>
-        <w:pStyle w:val="MSISTEXT"/>
-      </w:pPr>
-      <w:r>
-        <w:t>Even with considerable advances in the state of art as described above, there are many issues that continue to hamper the practical application of AI-driven IDS in IoT environments. Some of the problems that have been identified include issues related to high-dimensional data, class imbalance, noisy network traffic, complexity of algorithms, low interpretability of models, and constant introduction of novel attacks. Increasing number of works deal with creating lightweight and scalable solutions to intrusion detection problem that provide high precision through efficient preprocessing, feature selection, and machine learning models.</w:t>
-      </w:r>
-    </w:p>
-    <w:p>
-      <w:pPr>
-        <w:pStyle w:val="MSISTEXT"/>
-      </w:pPr>
-      <w:r>
-        <w:t xml:space="preserve">In general, the discussed literature illustrates an evident shift from traditional intrusion detection techniques to intelligent AI-based systems. The overall insights indicate that the combination of successful data preprocessing, efficient feature selection, and </w:t>
+        <w:t>RESEARCH GAP</w:t>
+      </w:r>
+    </w:p>
+    <w:p>
+      <w:pPr>
+        <w:pStyle w:val="MSISTEXT"/>
+        <w:rPr>
+          <w:lang w:val="en-IN"/>
+        </w:rPr>
+      </w:pPr>
+      <w:r>
+        <w:rPr>
+          <w:lang w:val="en-IN"/>
+        </w:rPr>
+        <w:t>Despite the significant progress achieved in Artificial Intelligence (AI)-based Intrusion Detection Systems (IDSs), the literature survey indicates that several challenges continue to exist in securing Internet of Things (IoT) environments. Researchers have successfully demonstrated the effectiveness of machine learning and deep learning techniques in detecting malicious network traffic; however, factors such as rapidly evolving cyberattacks, increasing network complexity, and the growing volume of IoT-generated data continue to influence the performance and adaptability of intrusion detection systems.</w:t>
+      </w:r>
+    </w:p>
+    <w:p>
+      <w:pPr>
+        <w:pStyle w:val="MSISTEXT"/>
+      </w:pPr>
+      <w:r>
+        <w:t>A common observation from the reviewed literature is that many intrusion detection models have been evaluated using benchmark datasets such as NSL-KDD, CICIDS2017, and IoTID20. Although these datasets have significantly contributed to the advancement of intrusion detection research, they may not fully represent the characteristics of modern IoT environments or recently emerging attack patterns. As IoT technology continues to evolve, newer datasets containing more diverse network traffic and attack scenarios have become available, creating opportunities to evaluate existing methodologies under updated conditions.</w:t>
+      </w:r>
+    </w:p>
+    <w:p>
+      <w:pPr>
+        <w:pStyle w:val="MSISTEXT"/>
+        <w:rPr>
+          <w:lang w:val="en-IN"/>
+        </w:rPr>
+      </w:pPr>
+      <w:r>
+        <w:rPr>
+          <w:lang w:val="en-IN"/>
+        </w:rPr>
+        <w:t>Another important observation is that several studies primarily focus on evaluating a single classification model or comparing only a limited number of machine learning algorithms. While these investigations demonstrate the effectiveness of individual approaches, a broader comparative analysis involving both traditional machine learning and deep learning techniques under a common preprocessing framework can provide a better understanding of their relative strengths and limitations.</w:t>
+      </w:r>
+    </w:p>
+    <w:p>
+      <w:pPr>
+        <w:pStyle w:val="MSISTEXT"/>
+      </w:pPr>
+      <w:r>
+        <w:t>The selected research paper proposes an effective framework that combines Pearson Correlation Coefficient (PCC) based feature selection with a Convolutional Neural Network (CNN) for anomaly detection in IoT networks. The reported results demonstrate that reducing redundant features before classification improves computational efficiency while maintaining high detection accuracy. However, the evaluation presented in the paper is limited to the benchmark datasets considered by the authors and primarily focuses on the CNN classifier.</w:t>
+      </w:r>
+    </w:p>
+    <w:p>
+      <w:pPr>
+        <w:pStyle w:val="MSISTEXT"/>
+      </w:pPr>
+      <w:r>
+        <w:t xml:space="preserve">Motivated by these observations, the present project implements the methodology proposed in the selected research paper and evaluates its applicability using the </w:t>
       </w:r>
       <w:r>
         <w:lastRenderedPageBreak/>
-        <w:t>powerful machine/deep learning approaches can be considered an effective way towards enhancing the performance of intrusion detection systems within contemporary IoT environments. The outlined findings serve as the base for the methodology used within the current research, as suggested in the chosen PCC-CNN literature review paper.</w:t>
-      </w:r>
-    </w:p>
-    <w:p>
-      <w:pPr>
-        <w:pStyle w:val="MSISSUBHEADIN"/>
-      </w:pPr>
-      <w:r>
-        <w:t>SELECTED RESEARCH PAPER</w:t>
-      </w:r>
-    </w:p>
-    <w:p>
-      <w:pPr>
-        <w:pStyle w:val="MSISTEXT"/>
-      </w:pPr>
-      <w:r>
-        <w:t xml:space="preserve">The implementation used in this work is inspired from the research paper titled "Anomaly Based Intrusion Detection System for IoT Application" authored by Mansi Bhavsar, Kaushik Roy, John Kelly, and </w:t>
-      </w:r>
-      <w:proofErr w:type="spellStart"/>
-      <w:r>
-        <w:t>Odeyomi</w:t>
-      </w:r>
-      <w:proofErr w:type="spellEnd"/>
-      <w:r>
-        <w:t xml:space="preserve"> Olusola. In the research paper, an AI-based intrusion detection system has been suggested, which uses the Pearson Correlation Coefficient (PCC) method to select features along with a CNN for the purpose of anomaly detection in IoT networks. The aim of the research is to increase the performance of intrusion detection by removing redundant features before classification.</w:t>
-      </w:r>
-    </w:p>
-    <w:p>
-      <w:pPr>
-        <w:pStyle w:val="MSISTEXT"/>
-        <w:rPr>
-          <w:lang w:val="en-IN"/>
-        </w:rPr>
-      </w:pPr>
-      <w:r>
-        <w:rPr>
-          <w:lang w:val="en-IN"/>
-        </w:rPr>
-        <w:t>The authors recognize that IoT devices continuously generate large volumes of heterogeneous network traffic, making traditional intrusion detection techniques less effective due to increasing computational complexity and evolving attack patterns. They emphasize that datasets used for intrusion detection often contain redundant and highly correlated features, which unnecessarily increase training time and may reduce the effectiveness of learning algorithms. To address this challenge, the proposed framework first performs feature selection using the Pearson Correlation Coefficient (PCC), allowing only the most relevant features to be used for model training.</w:t>
-      </w:r>
-    </w:p>
-    <w:p>
-      <w:pPr>
-        <w:pStyle w:val="MSISTEXT"/>
-      </w:pPr>
-      <w:r>
-        <w:t>The methodology that will be adopted for this study involves various stages that are carried out sequentially, starting with data pre-processing. Firstly, the datasets are processed to ensure that they are ready for use in the modeling process. In the next stage, feature selection is performed using PCC. The correlation value of each feature and the target variable is determined. The features having higher correlation values are selected while those having lower values are disregarded since they do not add much information to the classifier.</w:t>
-      </w:r>
-    </w:p>
-    <w:p>
-      <w:pPr>
-        <w:pStyle w:val="MSISTEXT"/>
-        <w:rPr>
-          <w:lang w:val="en-IN"/>
-        </w:rPr>
-      </w:pPr>
-      <w:r>
-        <w:rPr>
-          <w:lang w:val="en-IN"/>
-        </w:rPr>
-        <w:t xml:space="preserve">Following feature selection, the selected features are provided as input to a Convolutional Neural Network (CNN). Although CNNs are traditionally associated with image processing, the authors demonstrate that one-dimensional convolutional </w:t>
-      </w:r>
-      <w:r>
-        <w:rPr>
-          <w:lang w:val="en-IN"/>
-        </w:rPr>
-        <w:lastRenderedPageBreak/>
-        <w:t>operations can effectively learn local feature relationships present in network traffic data. The CNN automatically extracts hierarchical representations from the selected features, enabling the model to distinguish between normal and malicious network traffic with high accuracy. The learning capability of CNN also reduces the dependence on manually engineered features, making it suitable for complex intrusion detection tasks.</w:t>
-      </w:r>
-    </w:p>
-    <w:p>
-      <w:pPr>
-        <w:pStyle w:val="MSISTEXT"/>
-      </w:pPr>
-      <w:r>
-        <w:t xml:space="preserve">In order to conduct performance analysis of the suggested framework, three datasets that are widely used for intrusions detections were used: NSL-KDD, CICIDS2017, and IoTID20. These datasets together cover different classes of </w:t>
-      </w:r>
-      <w:proofErr w:type="spellStart"/>
-      <w:r>
-        <w:t>cyber attacks</w:t>
-      </w:r>
-      <w:proofErr w:type="spellEnd"/>
-      <w:r>
-        <w:t xml:space="preserve"> as well as different networks, which allows the methodology to be tested under varied operational conditions. Evaluation of performance was done via calculation of such traditional measures of classification as accuracy, precision, recall, and f1-score.</w:t>
-      </w:r>
-    </w:p>
-    <w:p>
-      <w:pPr>
-        <w:pStyle w:val="MSISTEXT"/>
-      </w:pPr>
-      <w:r>
-        <w:t xml:space="preserve">The experimental results provided by the paper suggest that using the combination of PCC-based feature selection with the CNN model increases intrusion detection accuracy while decreasing the computational complexity of the process. This is achieved because of the reduction of unnecessary data prior to the training process which decreases the </w:t>
-      </w:r>
-      <w:proofErr w:type="gramStart"/>
-      <w:r>
-        <w:t>amount</w:t>
-      </w:r>
-      <w:proofErr w:type="gramEnd"/>
-      <w:r>
-        <w:t xml:space="preserve"> of calculations needed for learning. Furthermore, the results confirm that CNN can detect complicated patterns in the IoT network traffic effectively.</w:t>
-      </w:r>
-    </w:p>
-    <w:p>
-      <w:pPr>
-        <w:pStyle w:val="MSISTEXT"/>
-        <w:rPr>
-          <w:lang w:val="en-IN"/>
-        </w:rPr>
-      </w:pPr>
-      <w:r>
-        <w:rPr>
-          <w:lang w:val="en-IN"/>
-        </w:rPr>
-        <w:t>One of the major strengths of the proposed research is its systematic combination of efficient feature selection and deep learning-based classification. Instead of directly training a deep learning model using all available features, the authors first reduce the dimensionality of the data through PCC-based filtering, thereby improving both computational efficiency and model performance. Additionally, evaluating the framework on three different benchmark datasets enhances the credibility of the reported results by demonstrating consistent performance across multiple network environments.</w:t>
-      </w:r>
-    </w:p>
-    <w:p>
-      <w:pPr>
-        <w:pStyle w:val="MSISTEXT"/>
-      </w:pPr>
-      <w:r>
-        <w:t xml:space="preserve">The study, however, also presents certain limitations. The experimental evaluation is restricted to the NSL-KDD, CICIDS2017, and IoTID20 datasets, which may not fully represent the latest attack patterns observed in modern IoT environments. Recent datasets such as CICIoT2023, which include newer attack scenarios and more diverse IoT traffic, were not considered during evaluation. Furthermore, the research primarily </w:t>
-      </w:r>
-      <w:r>
-        <w:lastRenderedPageBreak/>
-        <w:t>focuses on the CNN-based classification model and does not provide a detailed comparative analysis with multiple machine learning and deep learning classifiers under identical preprocessing conditions. These observations provide opportunities for further evaluation using updated datasets and additional classification models.</w:t>
-      </w:r>
-    </w:p>
-    <w:p>
-      <w:pPr>
-        <w:pStyle w:val="MSISTEXT"/>
-      </w:pPr>
-      <w:r>
-        <w:t>The methodology proposed in this research paper serves as the foundation for the implementation carried out in the present project. While preserving the core preprocessing and feature selection strategy proposed by the authors, the current work evaluates the methodology using the CICIoT2023 dataset and investigates the performance of Random Forest (RF), Artificial Neural Network (ANN), and Convolutional Neural Network (CNN) models under a common experimental framework. This implementation facilitates a broader comparative analysis while maintaining consistency with the methodology presented in the selected research paper.</w:t>
-      </w:r>
-    </w:p>
-    <w:p>
-      <w:pPr>
-        <w:pStyle w:val="MSISTEXT"/>
-      </w:pPr>
-      <w:r>
-        <w:rPr>
-          <w:lang w:val="en-IN"/>
-        </w:rPr>
-        <w:t>The selected research paper was chosen because it presents a structured and well-validated methodology that integrates feature selection with deep learning for IoT intrusion detection. Its evaluation on multiple benchmark datasets, together with its clear preprocessing pipeline, makes it an appropriate foundation for implementation and comparative analysis. The methodology is reproducible and provides a suitable basis for assessing its performance on the CICIoT2023 dataset using additional classification models.</w:t>
-      </w:r>
-    </w:p>
-    <w:p>
-      <w:pPr>
-        <w:pStyle w:val="MSISSUBHEADIN"/>
-      </w:pPr>
-      <w:r>
-        <w:t>RESEARCH GAP</w:t>
-      </w:r>
-    </w:p>
-    <w:p>
-      <w:pPr>
-        <w:pStyle w:val="MSISTEXT"/>
-        <w:rPr>
-          <w:lang w:val="en-IN"/>
-        </w:rPr>
-      </w:pPr>
-      <w:r>
-        <w:rPr>
-          <w:lang w:val="en-IN"/>
-        </w:rPr>
-        <w:t>Despite the significant progress achieved in Artificial Intelligence (AI)-based Intrusion Detection Systems (IDSs), the literature survey indicates that several challenges continue to exist in securing Internet of Things (IoT) environments. Researchers have successfully demonstrated the effectiveness of machine learning and deep learning techniques in detecting malicious network traffic; however, factors such as rapidly evolving cyberattacks, increasing network complexity, and the growing volume of IoT-generated data continue to influence the performance and adaptability of intrusion detection systems.</w:t>
-      </w:r>
-    </w:p>
-    <w:p>
-      <w:pPr>
-        <w:pStyle w:val="MSISTEXT"/>
-      </w:pPr>
-      <w:r>
-        <w:t xml:space="preserve">A common observation from the reviewed literature is that many intrusion detection models have been evaluated using benchmark datasets such as NSL-KDD, CICIDS2017, and IoTID20. Although these datasets have significantly contributed to the advancement of intrusion detection research, they may not fully represent the </w:t>
-      </w:r>
-      <w:r>
-        <w:lastRenderedPageBreak/>
-        <w:t>characteristics of modern IoT environments or recently emerging attack patterns. As IoT technology continues to evolve, newer datasets containing more diverse network traffic and attack scenarios have become available, creating opportunities to evaluate existing methodologies under updated conditions.</w:t>
-      </w:r>
-    </w:p>
-    <w:p>
-      <w:pPr>
-        <w:pStyle w:val="MSISTEXT"/>
-        <w:rPr>
-          <w:lang w:val="en-IN"/>
-        </w:rPr>
-      </w:pPr>
-      <w:r>
-        <w:rPr>
-          <w:lang w:val="en-IN"/>
-        </w:rPr>
-        <w:t>Another important observation is that several studies primarily focus on evaluating a single classification model or comparing only a limited number of machine learning algorithms. While these investigations demonstrate the effectiveness of individual approaches, a broader comparative analysis involving both traditional machine learning and deep learning techniques under a common preprocessing framework can provide a better understanding of their relative strengths and limitations.</w:t>
-      </w:r>
-    </w:p>
-    <w:p>
-      <w:pPr>
-        <w:pStyle w:val="MSISTEXT"/>
-      </w:pPr>
-      <w:r>
-        <w:t>The selected research paper proposes an effective framework that combines Pearson Correlation Coefficient (PCC) based feature selection with a Convolutional Neural Network (CNN) for anomaly detection in IoT networks. The reported results demonstrate that reducing redundant features before classification improves computational efficiency while maintaining high detection accuracy. However, the evaluation presented in the paper is limited to the benchmark datasets considered by the authors and primarily focuses on the CNN classifier.</w:t>
-      </w:r>
-    </w:p>
-    <w:p>
-      <w:pPr>
-        <w:pStyle w:val="MSISTEXT"/>
-      </w:pPr>
-      <w:r>
-        <w:t>Motivated by these observations, the present project implements the methodology proposed in the selected research paper and evaluates its applicability using the CICIoT2023 dataset, which contains recent IoT network traffic and attack scenarios. In addition to implementing the CNN model, the project also evaluates the performance of Random Forest (RF) and Artificial Neural Network (ANN) models using the same preprocessing and feature selection pipeline. This enables a consistent comparison of machine learning and deep learning approaches while preserving the core methodology proposed in the reference study.</w:t>
+        <w:t>CICIoT2023 dataset, which contains recent IoT network traffic and attack scenarios. In addition to implementing the CNN model, the project also evaluates the performance of Random Forest (RF) and Artificial Neural Network (ANN) models using the same preprocessing and feature selection pipeline. This enables a consistent comparison of machine learning and deep learning approaches while preserving the core methodology proposed in the reference study.</w:t>
       </w:r>
     </w:p>
     <w:p>
@@ -5612,6 +5694,24 @@
           <w:lang w:val="en-IN"/>
         </w:rPr>
         <w:t>The objective of the present work is not to propose a new intrusion detection framework but to reproduce, implement, and evaluate the selected methodology using a modern benchmark dataset and multiple classification models. The findings obtained from this implementation are expected to provide insights into the effectiveness, adaptability, and practical applicability of the proposed methodology in contemporary IoT intrusion detection scenarios.</w:t>
+      </w:r>
+    </w:p>
+    <w:p>
+      <w:pPr>
+        <w:spacing w:after="160"/>
+        <w:rPr>
+          <w:rFonts w:cs="Times New Roman"/>
+          <w:b/>
+          <w:bCs/>
+          <w:kern w:val="2"/>
+          <w:sz w:val="28"/>
+          <w:szCs w:val="28"/>
+          <w:lang w:val="en-US"/>
+          <w14:ligatures w14:val="standardContextual"/>
+        </w:rPr>
+      </w:pPr>
+      <w:r>
+        <w:br w:type="page"/>
       </w:r>
     </w:p>
     <w:p>
@@ -5623,6 +5723,7 @@
         </w:numPr>
       </w:pPr>
       <w:r>
+        <w:lastRenderedPageBreak/>
         <w:t>SPECIFICATIONS</w:t>
       </w:r>
     </w:p>
@@ -5631,7 +5732,6 @@
         <w:pStyle w:val="MSISSUBHEADIN"/>
       </w:pPr>
       <w:r>
-        <w:lastRenderedPageBreak/>
         <w:t>HARDWARE SPECIFICATIONS</w:t>
       </w:r>
     </w:p>
@@ -6041,6 +6141,20 @@
     </w:p>
     <w:p>
       <w:pPr>
+        <w:spacing w:after="160"/>
+        <w:rPr>
+          <w:rFonts w:cs="Times New Roman"/>
+          <w:kern w:val="2"/>
+          <w:szCs w:val="24"/>
+          <w14:ligatures w14:val="standardContextual"/>
+        </w:rPr>
+      </w:pPr>
+      <w:r>
+        <w:br w:type="page"/>
+      </w:r>
+    </w:p>
+    <w:p>
+      <w:pPr>
         <w:pStyle w:val="MSISTEXT"/>
         <w:rPr>
           <w:lang w:val="en-IN"/>
@@ -6411,7 +6525,6 @@
               <w:rPr>
                 <w:lang w:val="en-IN"/>
               </w:rPr>
-              <w:lastRenderedPageBreak/>
               <w:t>Git</w:t>
             </w:r>
           </w:p>
@@ -6846,9 +6959,27 @@
     </w:p>
     <w:p>
       <w:pPr>
+        <w:spacing w:after="160"/>
+        <w:rPr>
+          <w:rFonts w:cs="Times New Roman"/>
+          <w:b/>
+          <w:bCs/>
+          <w:kern w:val="2"/>
+          <w:szCs w:val="24"/>
+          <w:lang w:val="en-US"/>
+          <w14:ligatures w14:val="standardContextual"/>
+        </w:rPr>
+      </w:pPr>
+      <w:r>
+        <w:br w:type="page"/>
+      </w:r>
+    </w:p>
+    <w:p>
+      <w:pPr>
         <w:pStyle w:val="MSISSUBHEADIN"/>
       </w:pPr>
       <w:r>
+        <w:lastRenderedPageBreak/>
         <w:t>DATASET SPECIFICATION</w:t>
       </w:r>
     </w:p>
@@ -6873,7 +7004,6 @@
         <w:pStyle w:val="MSISTEXT"/>
       </w:pPr>
       <w:r>
-        <w:lastRenderedPageBreak/>
         <w:t>As opposed to earlier benchmark datasets like NSL-KDD, CICIDS2017, and IoTID20, the CICIoT2023 dataset has more current attack patterns and also traffic in large volume and therefore it is ideal for assessing the performance of modern AI-based IDSs.</w:t>
       </w:r>
     </w:p>
@@ -7026,6 +7156,7 @@
         </w:numPr>
       </w:pPr>
       <w:r>
+        <w:lastRenderedPageBreak/>
         <w:t>ARCHITECTURE</w:t>
       </w:r>
     </w:p>
@@ -7056,34 +7187,48 @@
         <w:pStyle w:val="MSISTEXT"/>
       </w:pPr>
       <w:r>
-        <w:t xml:space="preserve">The implementation begins with the CICIoT2023 dataset, which contains network traffic generated from IoT devices under both normal operation and multiple cyberattack scenarios. Since the raw dataset contains duplicate records, missing values, </w:t>
-      </w:r>
+        <w:t>The implementation begins with the CICIoT2023 dataset, which contains network traffic generated from IoT devices under both normal operation and multiple cyberattack scenarios. Since the raw dataset contains duplicate records, missing values, and redundant features, preprocessing techniques are applied to improve data quality before model development.</w:t>
+      </w:r>
+    </w:p>
+    <w:p>
+      <w:pPr>
+        <w:pStyle w:val="MSISTEXT"/>
+      </w:pPr>
+      <w:r>
+        <w:t>Following preprocessing, Exploratory Data Analysis (EDA) is performed to understand the characteristics of the dataset and identify important statistical properties. The processed dataset then undergoes Pearson Correlation Coefficient (PCC) based feature selection to eliminate redundant attributes and retain only the most relevant features required for intrusion detection.</w:t>
+      </w:r>
+    </w:p>
+    <w:p>
+      <w:pPr>
+        <w:pStyle w:val="MSISTEXT"/>
+      </w:pPr>
+      <w:r>
+        <w:t>This selected feature set is then employed to train and test three types of classification algorithms: Random Forest (RF), Artificial Neural Network (ANN), and Convolutional Neural Network (CNN). Evaluation of these classifiers is performed by using various metrics such as Accuracy, Precision, Recall, F1-Score, and Confusion Matrix. The complete process helps in comparing machine learning and deep learning approaches under the same preprocessing technique.</w:t>
+      </w:r>
+    </w:p>
+    <w:p>
+      <w:pPr>
+        <w:spacing w:after="160"/>
+        <w:rPr>
+          <w:rFonts w:cs="Times New Roman"/>
+          <w:b/>
+          <w:bCs/>
+          <w:kern w:val="2"/>
+          <w:szCs w:val="24"/>
+          <w:lang w:val="en-US"/>
+          <w14:ligatures w14:val="standardContextual"/>
+        </w:rPr>
+      </w:pPr>
+      <w:r>
+        <w:br w:type="page"/>
+      </w:r>
+    </w:p>
+    <w:p>
+      <w:pPr>
+        <w:pStyle w:val="MSISSUBHEADIN"/>
+      </w:pPr>
       <w:r>
         <w:lastRenderedPageBreak/>
-        <w:t>and redundant features, preprocessing techniques are applied to improve data quality before model development.</w:t>
-      </w:r>
-    </w:p>
-    <w:p>
-      <w:pPr>
-        <w:pStyle w:val="MSISTEXT"/>
-      </w:pPr>
-      <w:r>
-        <w:t>Following preprocessing, Exploratory Data Analysis (EDA) is performed to understand the characteristics of the dataset and identify important statistical properties. The processed dataset then undergoes Pearson Correlation Coefficient (PCC) based feature selection to eliminate redundant attributes and retain only the most relevant features required for intrusion detection.</w:t>
-      </w:r>
-    </w:p>
-    <w:p>
-      <w:pPr>
-        <w:pStyle w:val="MSISTEXT"/>
-      </w:pPr>
-      <w:r>
-        <w:t>This selected feature set is then employed to train and test three types of classification algorithms: Random Forest (RF), Artificial Neural Network (ANN), and Convolutional Neural Network (CNN). Evaluation of these classifiers is performed by using various metrics such as Accuracy, Precision, Recall, F1-Score, and Confusion Matrix. The complete process helps in comparing machine learning and deep learning approaches under the same preprocessing technique.</w:t>
-      </w:r>
-    </w:p>
-    <w:p>
-      <w:pPr>
-        <w:pStyle w:val="MSISSUBHEADIN"/>
-      </w:pPr>
-      <w:r>
         <w:t>SYSTEM ARCHITECTURE</w:t>
       </w:r>
     </w:p>
@@ -7097,9 +7242,8 @@
         <w:rPr>
           <w:noProof/>
         </w:rPr>
-        <w:lastRenderedPageBreak/>
         <w:drawing>
-          <wp:inline distT="0" distB="0" distL="0" distR="0" wp14:anchorId="76E92904" wp14:editId="5D3326A0">
+          <wp:inline distT="0" distB="0" distL="0" distR="0" wp14:anchorId="76E92904" wp14:editId="045681B4">
             <wp:extent cx="5731510" cy="7019925"/>
             <wp:effectExtent l="0" t="0" r="2540" b="9525"/>
             <wp:docPr id="1360371267" name="Picture 1"/>
@@ -7153,14 +7297,26 @@
     </w:p>
     <w:p>
       <w:pPr>
-        <w:pStyle w:val="MSISTEXT"/>
-      </w:pPr>
-      <w:r>
-        <w:t xml:space="preserve">The architecture adopted in the present work is based on the framework proposed in the selected research paper, "Anomaly-Based Intrusion Detection System for IoT Application." The framework provides a systematic approach for detecting anomalies in IoT network traffic by integrating data preprocessing, feature selection, deep learning-based classification, and performance evaluation. The overall architecture </w:t>
-      </w:r>
+        <w:spacing w:after="160"/>
+        <w:rPr>
+          <w:rFonts w:cs="Times New Roman"/>
+          <w:kern w:val="2"/>
+          <w:szCs w:val="24"/>
+          <w:lang w:val="en-US"/>
+          <w14:ligatures w14:val="standardContextual"/>
+        </w:rPr>
+      </w:pPr>
+      <w:r>
+        <w:br w:type="page"/>
+      </w:r>
+    </w:p>
+    <w:p>
+      <w:pPr>
+        <w:pStyle w:val="MSISTEXT"/>
+      </w:pPr>
       <w:r>
         <w:lastRenderedPageBreak/>
-        <w:t>consists of multiple interconnected stages, where the output of each stage serves as the input for the subsequent stage, thereby ensuring a structured and efficient intrusion detection process.</w:t>
+        <w:t>The architecture adopted in the present work is based on the framework proposed in the selected research paper, "Anomaly-Based Intrusion Detection System for IoT Application." The framework provides a systematic approach for detecting anomalies in IoT network traffic by integrating data preprocessing, feature selection, deep learning-based classification, and performance evaluation. The overall architecture consists of multiple interconnected stages, where the output of each stage serves as the input for the subsequent stage, thereby ensuring a structured and efficient intrusion detection process.</w:t>
       </w:r>
     </w:p>
     <w:p>
@@ -7200,6 +7356,7 @@
         <w:pStyle w:val="MSISTEXT"/>
       </w:pPr>
       <w:r>
+        <w:lastRenderedPageBreak/>
         <w:t>The final stage of the architecture focuses on evaluating the performance of the trained classification model using standard performance metrics such as Accuracy, Precision, Recall, F1-Score, and the Confusion Matrix. These metrics provide a comprehensive assessment of the model's capability to correctly classify network traffic and measure its effectiveness in detecting cyberattacks while minimizing false classifications.</w:t>
       </w:r>
     </w:p>
@@ -7208,7 +7365,6 @@
         <w:pStyle w:val="MSISTEXT"/>
       </w:pPr>
       <w:r>
-        <w:lastRenderedPageBreak/>
         <w:t>Although the present project follows the overall architecture proposed in the selected research paper, the experimental implementation is performed using the CICIoT2023 dataset. Furthermore, in addition to reproducing the CNN-based methodology, the implementation also evaluates Random Forest (RF) and Artificial Neural Network (ANN) models using the same preprocessing and feature selection pipeline. This enables a comparative analysis of machine learning and deep learning approaches while preserving the fundamental architecture proposed by the original study.</w:t>
       </w:r>
     </w:p>
@@ -7290,6 +7446,7 @@
         <w:rPr>
           <w:lang w:val="en-IN"/>
         </w:rPr>
+        <w:lastRenderedPageBreak/>
         <w:t>The collected dataset serves as the input for all subsequent stages of the implementation, including preprocessing, feature selection, model training, and performance evaluation.</w:t>
       </w:r>
     </w:p>
@@ -7310,7 +7467,6 @@
         <w:pStyle w:val="MSISTEXT"/>
       </w:pPr>
       <w:r>
-        <w:lastRenderedPageBreak/>
         <w:t>The process of data preprocessing is one of the most important steps in the intrusion detection system, since the quality of the input data affects the efficiency of the classification models. The network traffic dataset can include duplicate rows, missing and infinite values, inconsistency and redundancy in the data, which can adversely affect the classification process.</w:t>
       </w:r>
     </w:p>
@@ -7352,6 +7508,23 @@
     </w:p>
     <w:p>
       <w:pPr>
+        <w:spacing w:after="160"/>
+        <w:rPr>
+          <w:rFonts w:cs="Times New Roman"/>
+          <w:b/>
+          <w:bCs/>
+          <w:kern w:val="2"/>
+          <w:szCs w:val="24"/>
+          <w:lang w:val="en-US"/>
+          <w14:ligatures w14:val="standardContextual"/>
+        </w:rPr>
+      </w:pPr>
+      <w:r>
+        <w:br w:type="page"/>
+      </w:r>
+    </w:p>
+    <w:p>
+      <w:pPr>
         <w:pStyle w:val="MSISSUBHEADIN"/>
         <w:numPr>
           <w:ilvl w:val="2"/>
@@ -7359,6 +7532,7 @@
         </w:numPr>
       </w:pPr>
       <w:r>
+        <w:lastRenderedPageBreak/>
         <w:t>Feature Selection using Pearson Correlation Coefficient (PCC)</w:t>
       </w:r>
     </w:p>
@@ -7381,11 +7555,7 @@
         <w:pStyle w:val="MSISTEXT"/>
       </w:pPr>
       <w:r>
-        <w:t xml:space="preserve">To address this issue, the present work follows the feature selection methodology proposed in the selected research paper by employing the Pearson Correlation Coefficient (PCC). PCC is a statistical technique used to measure the strength and direction of the linear relationship between each feature and the target variable. Features </w:t>
-      </w:r>
-      <w:r>
-        <w:lastRenderedPageBreak/>
-        <w:t>exhibiting stronger correlations with the target class are considered more informative for intrusion detection, whereas features with weak or redundant relationships can be eliminated.</w:t>
+        <w:t>To address this issue, the present work follows the feature selection methodology proposed in the selected research paper by employing the Pearson Correlation Coefficient (PCC). PCC is a statistical technique used to measure the strength and direction of the linear relationship between each feature and the target variable. Features exhibiting stronger correlations with the target class are considered more informative for intrusion detection, whereas features with weak or redundant relationships can be eliminated.</w:t>
       </w:r>
     </w:p>
     <w:p>
@@ -7414,6 +7584,23 @@
           <w:lang w:val="en-IN"/>
         </w:rPr>
         <w:t>The application of PCC-based feature selection provides several advantages. It reduces the computational resources required during model training, minimizes the effect of redundant information, improves training efficiency, and enhances the overall performance of both machine learning and deep learning models. The reduced feature set obtained through PCC serves as the input for all classification models implemented in this project.</w:t>
+      </w:r>
+    </w:p>
+    <w:p>
+      <w:pPr>
+        <w:spacing w:after="160"/>
+        <w:rPr>
+          <w:rFonts w:cs="Times New Roman"/>
+          <w:b/>
+          <w:bCs/>
+          <w:kern w:val="2"/>
+          <w:szCs w:val="24"/>
+          <w:lang w:val="en-US"/>
+          <w14:ligatures w14:val="standardContextual"/>
+        </w:rPr>
+      </w:pPr>
+      <w:r>
+        <w:br w:type="page"/>
       </w:r>
     </w:p>
     <w:p>
@@ -7425,6 +7612,7 @@
         </w:numPr>
       </w:pPr>
       <w:r>
+        <w:lastRenderedPageBreak/>
         <w:t>Random Forest (RF) Module</w:t>
       </w:r>
     </w:p>
@@ -7487,7 +7675,6 @@
         <w:rPr>
           <w:lang w:val="en-IN"/>
         </w:rPr>
-        <w:lastRenderedPageBreak/>
         <w:t>Artificial Neural Networks (ANNs) are widely used in classification problems due to their ability to model complex and non-linear relationships between input features and output classes. Inspired by the structure of the human brain, ANNs consist of interconnected neurons organized into input, hidden, and output layers.</w:t>
       </w:r>
     </w:p>
@@ -7517,6 +7704,23 @@
           <w:lang w:val="en-IN"/>
         </w:rPr>
         <w:t>The ANN model provides a deep learning-based approach for intrusion detection and enables the project to compare shallow ensemble learning methods with neural network-based classification. The experimental results obtained from the ANN are evaluated using standard performance metrics and compared with the Random Forest and CNN models.</w:t>
+      </w:r>
+    </w:p>
+    <w:p>
+      <w:pPr>
+        <w:spacing w:after="160"/>
+        <w:rPr>
+          <w:rFonts w:cs="Times New Roman"/>
+          <w:b/>
+          <w:bCs/>
+          <w:kern w:val="2"/>
+          <w:szCs w:val="24"/>
+          <w:lang w:val="en-US"/>
+          <w14:ligatures w14:val="standardContextual"/>
+        </w:rPr>
+      </w:pPr>
+      <w:r>
+        <w:br w:type="page"/>
       </w:r>
     </w:p>
     <w:p>
@@ -7528,6 +7732,7 @@
         </w:numPr>
       </w:pPr>
       <w:r>
+        <w:lastRenderedPageBreak/>
         <w:t>Convolutional Neural Network (CNN) Module</w:t>
       </w:r>
     </w:p>
@@ -7598,14 +7803,7 @@
         <w:rPr>
           <w:lang w:val="en-IN"/>
         </w:rPr>
-        <w:t xml:space="preserve">The final module of the proposed system focuses on evaluating the performance of the implemented classification models. After training, the Random Forest, Artificial Neural </w:t>
-      </w:r>
-      <w:r>
-        <w:rPr>
-          <w:lang w:val="en-IN"/>
-        </w:rPr>
-        <w:lastRenderedPageBreak/>
-        <w:t>Network, and Convolutional Neural Network models are tested using unseen network traffic data to assess their ability to correctly classify normal and malicious activities.</w:t>
+        <w:t>The final module of the proposed system focuses on evaluating the performance of the implemented classification models. After training, the Random Forest, Artificial Neural Network, and Convolutional Neural Network models are tested using unseen network traffic data to assess their ability to correctly classify normal and malicious activities.</w:t>
       </w:r>
     </w:p>
     <w:p>
@@ -7628,6 +7826,24 @@
           <w:lang w:val="en-IN"/>
         </w:rPr>
         <w:t>The results obtained from each classifier are compared to identify the most effective model for IoT intrusion detection using the CICIoT2023 dataset. The comparative analysis also provides insights into the strengths and limitations of machine learning and deep learning approaches when implemented under a common preprocessing and feature selection framework.</w:t>
+      </w:r>
+    </w:p>
+    <w:p>
+      <w:pPr>
+        <w:spacing w:after="160"/>
+        <w:rPr>
+          <w:rFonts w:cs="Times New Roman"/>
+          <w:b/>
+          <w:bCs/>
+          <w:kern w:val="2"/>
+          <w:sz w:val="28"/>
+          <w:szCs w:val="28"/>
+          <w:lang w:val="en-US"/>
+          <w14:ligatures w14:val="standardContextual"/>
+        </w:rPr>
+      </w:pPr>
+      <w:r>
+        <w:br w:type="page"/>
       </w:r>
     </w:p>
     <w:p>
@@ -7639,6 +7855,7 @@
         </w:numPr>
       </w:pPr>
       <w:r>
+        <w:lastRenderedPageBreak/>
         <w:t>WORK DONE</w:t>
       </w:r>
     </w:p>
@@ -7697,11 +7914,58 @@
         <w:pStyle w:val="MSISTEXT"/>
       </w:pPr>
       <w:r>
-        <w:t xml:space="preserve">After the pre-processing stage, the Pearson Correlation Coefficient (PCC)-based feature selection method was used to select the most important features for intrusion detection purposes. After that, the selected features were used to build and test the Random Forest </w:t>
-      </w:r>
-      <w:r>
+        <w:t>After the pre-processing stage, the Pearson Correlation Coefficient (PCC)-based feature selection method was used to select the most important features for intrusion detection purposes. After that, the selected features were used to build and test the Random Forest (RF), Artificial Neural Network (ANN), and Convolutional Neural Network (CNN) classification models. The final step was the comparison of the performance of the three classifiers using standard performance evaluation metrics.</w:t>
+      </w:r>
+    </w:p>
+    <w:p>
+      <w:pPr>
+        <w:pStyle w:val="MSISSUBHEADIN"/>
+      </w:pPr>
+      <w:r>
+        <w:t>DATASET COLLECTION</w:t>
+      </w:r>
+    </w:p>
+    <w:p>
+      <w:pPr>
+        <w:pStyle w:val="MSISTEXT"/>
+      </w:pPr>
+      <w:r>
+        <w:t>The implementation presented in this project utilizes the CICIoT2023 dataset as the primary source of network traffic for intrusion detection. The dataset was selected because it contains recent IoT communication patterns together with a diverse collection of modern cyberattacks, making it suitable for evaluating Artificial Intelligence-based intrusion detection systems.</w:t>
+      </w:r>
+    </w:p>
+    <w:p>
+      <w:pPr>
+        <w:pStyle w:val="MSISTEXT"/>
+        <w:rPr>
+          <w:lang w:val="en-IN"/>
+        </w:rPr>
+      </w:pPr>
+      <w:r>
+        <w:rPr>
+          <w:lang w:val="en-IN"/>
+        </w:rPr>
+        <w:t xml:space="preserve">The CICIoT2023 dataset is distributed as multiple CSV files, where each file represents network traffic generated under different attack scenarios. Collectively, these files contain millions of network traffic records with numerous numerical features </w:t>
+      </w:r>
+      <w:r>
+        <w:rPr>
+          <w:lang w:val="en-IN"/>
+        </w:rPr>
         <w:lastRenderedPageBreak/>
-        <w:t>(RF), Artificial Neural Network (ANN), and Convolutional Neural Network (CNN) classification models. The final step was the comparison of the performance of the three classifiers using standard performance evaluation metrics.</w:t>
+        <w:t>describing communication characteristics and corresponding class labels representing normal and malicious activities.</w:t>
+      </w:r>
+    </w:p>
+    <w:p>
+      <w:pPr>
+        <w:pStyle w:val="MSISTEXT"/>
+        <w:rPr>
+          <w:lang w:val="en-IN"/>
+        </w:rPr>
+      </w:pPr>
+      <w:r>
+        <w:rPr>
+          <w:lang w:val="en-IN"/>
+        </w:rPr>
+        <w:t>Due to the large volume of data, it was not practical to directly train the machine learning and deep learning models using all available files. Therefore, the implementation first focused on organizing and preparing the dataset through merging, sampling, preprocessing, and feature selection before model development.</w:t>
       </w:r>
     </w:p>
     <w:p>
@@ -7709,43 +7973,79 @@
         <w:pStyle w:val="MSISSUBHEADIN"/>
       </w:pPr>
       <w:r>
-        <w:t>DATASET COLLECTION</w:t>
-      </w:r>
-    </w:p>
-    <w:p>
-      <w:pPr>
-        <w:pStyle w:val="MSISTEXT"/>
-      </w:pPr>
-      <w:r>
-        <w:t>The implementation presented in this project utilizes the CICIoT2023 dataset as the primary source of network traffic for intrusion detection. The dataset was selected because it contains recent IoT communication patterns together with a diverse collection of modern cyberattacks, making it suitable for evaluating Artificial Intelligence-based intrusion detection systems.</w:t>
-      </w:r>
-    </w:p>
-    <w:p>
-      <w:pPr>
-        <w:pStyle w:val="MSISTEXT"/>
-        <w:rPr>
-          <w:lang w:val="en-IN"/>
-        </w:rPr>
-      </w:pPr>
-      <w:r>
-        <w:rPr>
-          <w:lang w:val="en-IN"/>
-        </w:rPr>
-        <w:t>The CICIoT2023 dataset is distributed as multiple CSV files, where each file represents network traffic generated under different attack scenarios. Collectively, these files contain millions of network traffic records with numerous numerical features describing communication characteristics and corresponding class labels representing normal and malicious activities.</w:t>
-      </w:r>
-    </w:p>
-    <w:p>
-      <w:pPr>
-        <w:pStyle w:val="MSISTEXT"/>
-        <w:rPr>
-          <w:lang w:val="en-IN"/>
-        </w:rPr>
-      </w:pPr>
-      <w:r>
-        <w:rPr>
-          <w:lang w:val="en-IN"/>
-        </w:rPr>
-        <w:t>Due to the large volume of data, it was not practical to directly train the machine learning and deep learning models using all available files. Therefore, the implementation first focused on organizing and preparing the dataset through merging, sampling, preprocessing, and feature selection before model development.</w:t>
+        <w:t>DATASET MER</w:t>
+      </w:r>
+      <w:r>
+        <w:t>GING</w:t>
+      </w:r>
+    </w:p>
+    <w:p>
+      <w:pPr>
+        <w:pStyle w:val="MSISTEXT"/>
+      </w:pPr>
+      <w:r>
+        <w:t>The CICIoT2023 dataset is provided in the form of several Comma Separated Value (CSV) files, whereby each CSV file consists of network traffic data for various IoT communication scenarios and types of attacks. Because of the existence of separate files for the CICIoT2023 dataset, it becomes necessary to merge these files first before doing any preprocessing and building the models. It makes working with the dataset easier and more consistent.</w:t>
+      </w:r>
+    </w:p>
+    <w:p>
+      <w:pPr>
+        <w:pStyle w:val="MSISTEXT"/>
+      </w:pPr>
+      <w:r>
+        <w:t xml:space="preserve">All the dataset files were sorted into the Linux server environment at the beginning of the implementation process. The Python code for data processing would then be written to automatically load and check the structure of all the CSV files and append their contents to the same </w:t>
+      </w:r>
+      <w:proofErr w:type="spellStart"/>
+      <w:r>
+        <w:t>dataframe</w:t>
+      </w:r>
+      <w:proofErr w:type="spellEnd"/>
+      <w:r>
+        <w:t>. Prior to concatenation, all the files were made sure to contain the same features in the same order.</w:t>
+      </w:r>
+    </w:p>
+    <w:p>
+      <w:pPr>
+        <w:pStyle w:val="MSISTEXT"/>
+        <w:rPr>
+          <w:lang w:val="en-IN"/>
+        </w:rPr>
+      </w:pPr>
+      <w:r>
+        <w:rPr>
+          <w:lang w:val="en-IN"/>
+        </w:rPr>
+        <w:t>After validating the dataset structure, the CSV files were merged into a single consolidated dataset containing all available network traffic records. The merged dataset preserved the original feature representation while integrating data from multiple attack scenarios into one unified dataset. This consolidated dataset served as the foundation for all subsequent preprocessing, exploratory data analysis, feature selection, and classification stages.</w:t>
+      </w:r>
+    </w:p>
+    <w:p>
+      <w:pPr>
+        <w:pStyle w:val="MSISTEXT"/>
+        <w:rPr>
+          <w:lang w:val="en-IN"/>
+        </w:rPr>
+      </w:pPr>
+      <w:r>
+        <w:rPr>
+          <w:lang w:val="en-IN"/>
+        </w:rPr>
+        <w:t>Considering the extremely large size of the merged dataset, directly performing machine learning and deep learning experiments on the complete dataset would require substantial computational resources and processing time. Therefore, after successfully merging all available CSV files, the dataset was prepared for the sampling stage, where a representative subset was generated for efficient experimentation while preserving the original class distribution.</w:t>
+      </w:r>
+    </w:p>
+    <w:p>
+      <w:pPr>
+        <w:spacing w:after="160"/>
+        <w:rPr>
+          <w:rFonts w:cs="Times New Roman"/>
+          <w:b/>
+          <w:bCs/>
+          <w:kern w:val="2"/>
+          <w:szCs w:val="24"/>
+          <w:lang w:val="en-US"/>
+          <w14:ligatures w14:val="standardContextual"/>
+        </w:rPr>
+      </w:pPr>
+      <w:r>
+        <w:br w:type="page"/>
       </w:r>
     </w:p>
     <w:p>
@@ -7753,70 +8053,7 @@
         <w:pStyle w:val="MSISSUBHEADIN"/>
       </w:pPr>
       <w:r>
-        <w:t>DATASET MER</w:t>
-      </w:r>
-      <w:r>
-        <w:t>GING</w:t>
-      </w:r>
-    </w:p>
-    <w:p>
-      <w:pPr>
-        <w:pStyle w:val="MSISTEXT"/>
-      </w:pPr>
-      <w:r>
-        <w:t>The CICIoT2023 dataset is provided in the form of several Comma Separated Value (CSV) files, whereby each CSV file consists of network traffic data for various IoT communication scenarios and types of attacks. Because of the existence of separate files for the CICIoT2023 dataset, it becomes necessary to merge these files first before doing any preprocessing and building the models. It makes working with the dataset easier and more consistent.</w:t>
-      </w:r>
-    </w:p>
-    <w:p>
-      <w:pPr>
-        <w:pStyle w:val="MSISTEXT"/>
-      </w:pPr>
-      <w:r>
-        <w:t xml:space="preserve">All the dataset files were sorted into the Linux server environment at the beginning of the implementation process. The Python code for data processing would then be written to automatically load and check the structure of all the CSV files and append their contents to the same </w:t>
-      </w:r>
-      <w:proofErr w:type="spellStart"/>
-      <w:r>
-        <w:t>dataframe</w:t>
-      </w:r>
-      <w:proofErr w:type="spellEnd"/>
-      <w:r>
-        <w:t>. Prior to concatenation, all the files were made sure to contain the same features in the same order.</w:t>
-      </w:r>
-    </w:p>
-    <w:p>
-      <w:pPr>
-        <w:pStyle w:val="MSISTEXT"/>
-        <w:rPr>
-          <w:lang w:val="en-IN"/>
-        </w:rPr>
-      </w:pPr>
-      <w:r>
-        <w:rPr>
-          <w:lang w:val="en-IN"/>
-        </w:rPr>
         <w:lastRenderedPageBreak/>
-        <w:t>After validating the dataset structure, the CSV files were merged into a single consolidated dataset containing all available network traffic records. The merged dataset preserved the original feature representation while integrating data from multiple attack scenarios into one unified dataset. This consolidated dataset served as the foundation for all subsequent preprocessing, exploratory data analysis, feature selection, and classification stages.</w:t>
-      </w:r>
-    </w:p>
-    <w:p>
-      <w:pPr>
-        <w:pStyle w:val="MSISTEXT"/>
-        <w:rPr>
-          <w:lang w:val="en-IN"/>
-        </w:rPr>
-      </w:pPr>
-      <w:r>
-        <w:rPr>
-          <w:lang w:val="en-IN"/>
-        </w:rPr>
-        <w:t>Considering the extremely large size of the merged dataset, directly performing machine learning and deep learning experiments on the complete dataset would require substantial computational resources and processing time. Therefore, after successfully merging all available CSV files, the dataset was prepared for the sampling stage, where a representative subset was generated for efficient experimentation while preserving the original class distribution.</w:t>
-      </w:r>
-    </w:p>
-    <w:p>
-      <w:pPr>
-        <w:pStyle w:val="MSISSUBHEADIN"/>
-      </w:pPr>
-      <w:r>
         <w:t>DATASET SAMPLING</w:t>
       </w:r>
     </w:p>
@@ -7849,30 +8086,33 @@
         <w:pStyle w:val="MSISTEXT"/>
       </w:pPr>
       <w:r>
+        <w:t>Following the sampling process, the generated dataset contained approximately 1.47 million records while retaining the original 40 network traffic features. This reduced dataset significantly lowered computational requirements, enabling efficient preprocessing and model training on the available hardware without compromising the diversity of attack patterns present in the original dataset.</w:t>
+      </w:r>
+    </w:p>
+    <w:p>
+      <w:pPr>
+        <w:pStyle w:val="MSISTEXT"/>
+        <w:rPr>
+          <w:lang w:val="en-IN"/>
+        </w:rPr>
+      </w:pPr>
+      <w:r>
+        <w:rPr>
+          <w:lang w:val="en-IN"/>
+        </w:rPr>
+        <w:t>The sampled dataset subsequently served as the input for all remaining stages of the implementation, including data cleaning, exploratory data analysis, Pearson Correlation Coefficient (PCC)-based feature selection, and the training of Random Forest (RF), Artificial Neural Network (ANN), and Convolutional Neural Network (CNN) models.</w:t>
+      </w:r>
+    </w:p>
+    <w:p>
+      <w:pPr>
+        <w:pStyle w:val="MSISTEXT"/>
+        <w:jc w:val="center"/>
+      </w:pPr>
+      <w:r>
+        <w:rPr>
+          <w:noProof/>
+        </w:rPr>
         <w:lastRenderedPageBreak/>
-        <w:t>Following the sampling process, the generated dataset contained approximately 1.47 million records while retaining the original 40 network traffic features. This reduced dataset significantly lowered computational requirements, enabling efficient preprocessing and model training on the available hardware without compromising the diversity of attack patterns present in the original dataset.</w:t>
-      </w:r>
-    </w:p>
-    <w:p>
-      <w:pPr>
-        <w:pStyle w:val="MSISTEXT"/>
-        <w:rPr>
-          <w:lang w:val="en-IN"/>
-        </w:rPr>
-      </w:pPr>
-      <w:r>
-        <w:rPr>
-          <w:lang w:val="en-IN"/>
-        </w:rPr>
-        <w:t>The sampled dataset subsequently served as the input for all remaining stages of the implementation, including data cleaning, exploratory data analysis, Pearson Correlation Coefficient (PCC)-based feature selection, and the training of Random Forest (RF), Artificial Neural Network (ANN), and Convolutional Neural Network (CNN) models.</w:t>
-      </w:r>
-    </w:p>
-    <w:p>
-      <w:pPr>
-        <w:pStyle w:val="MSISTEXT"/>
-        <w:jc w:val="center"/>
-      </w:pPr>
-      <w:r>
         <w:drawing>
           <wp:inline distT="0" distB="0" distL="0" distR="0" wp14:anchorId="6F26D000" wp14:editId="1C913D83">
             <wp:extent cx="5731510" cy="2040890"/>
@@ -7974,36 +8214,33 @@
         <w:rPr>
           <w:lang w:val="en-IN"/>
         </w:rPr>
-        <w:t xml:space="preserve"> for missing and infinite values. The preprocessing scripts detected a small number of missing values and positive </w:t>
-      </w:r>
-      <w:r>
-        <w:rPr>
-          <w:lang w:val="en-IN"/>
+        <w:t xml:space="preserve"> for missing and infinite values. The preprocessing scripts detected a small number of missing values and positive infinite values within a few numerical features. Since these values cannot be directly processed by machine learning and deep learning algorithms, appropriate cleaning operations were performed to replace or remove the affected records. After completing the cleaning process, the dataset was re-evaluated to verify that no missing or infinite values remained.</w:t>
+      </w:r>
+    </w:p>
+    <w:p>
+      <w:pPr>
+        <w:pStyle w:val="MSISTEXT"/>
+        <w:rPr>
+          <w:lang w:val="en-IN"/>
+        </w:rPr>
+      </w:pPr>
+      <w:r>
+        <w:rPr>
+          <w:lang w:val="en-IN"/>
+        </w:rPr>
+        <w:t>The cleaning process significantly improved the quality and consistency of the dataset, ensuring that the subsequent stages of exploratory data analysis, feature selection, and model training were performed using reliable and valid network traffic records.</w:t>
+      </w:r>
+    </w:p>
+    <w:p>
+      <w:pPr>
+        <w:pStyle w:val="MSISTEXT"/>
+        <w:jc w:val="center"/>
+      </w:pPr>
+      <w:r>
+        <w:rPr>
+          <w:noProof/>
         </w:rPr>
         <w:lastRenderedPageBreak/>
-        <w:t>infinite values within a few numerical features. Since these values cannot be directly processed by machine learning and deep learning algorithms, appropriate cleaning operations were performed to replace or remove the affected records. After completing the cleaning process, the dataset was re-evaluated to verify that no missing or infinite values remained.</w:t>
-      </w:r>
-    </w:p>
-    <w:p>
-      <w:pPr>
-        <w:pStyle w:val="MSISTEXT"/>
-        <w:rPr>
-          <w:lang w:val="en-IN"/>
-        </w:rPr>
-      </w:pPr>
-      <w:r>
-        <w:rPr>
-          <w:lang w:val="en-IN"/>
-        </w:rPr>
-        <w:t>The cleaning process significantly improved the quality and consistency of the dataset, ensuring that the subsequent stages of exploratory data analysis, feature selection, and model training were performed using reliable and valid network traffic records.</w:t>
-      </w:r>
-    </w:p>
-    <w:p>
-      <w:pPr>
-        <w:pStyle w:val="MSISTEXT"/>
-        <w:jc w:val="center"/>
-      </w:pPr>
-      <w:r>
         <w:drawing>
           <wp:inline distT="0" distB="0" distL="0" distR="0" wp14:anchorId="796C86B8" wp14:editId="5F4C2C7A">
             <wp:extent cx="5731510" cy="2651760"/>
@@ -8091,7 +8328,6 @@
         <w:pStyle w:val="MSISTEXT"/>
       </w:pPr>
       <w:r>
-        <w:lastRenderedPageBreak/>
         <w:t>The primary objectives of the exploratory data analysis were:</w:t>
       </w:r>
     </w:p>
@@ -8169,26 +8405,6 @@
       </w:pPr>
       <w:r>
         <w:t>To understand feature relationships before feature selection.</w:t>
-      </w:r>
-    </w:p>
-    <w:p>
-      <w:pPr>
-        <w:pStyle w:val="MSISTEXT"/>
-        <w:numPr>
-          <w:ilvl w:val="0"/>
-          <w:numId w:val="11"/>
-        </w:numPr>
-      </w:pPr>
-      <w:r>
-        <w:t>To verify the effectiveness of the preprocessing stage.</w:t>
-      </w:r>
-    </w:p>
-    <w:p>
-      <w:pPr>
-        <w:pStyle w:val="MSISTEXT"/>
-      </w:pPr>
-      <w:r>
-        <w:t>The observations obtained from EDA provided valuable insights into the dataset and assisted in selecting an appropriate feature selection strategy before model training.</w:t>
       </w:r>
     </w:p>
     <w:p>
@@ -8200,6 +8416,7 @@
         </w:numPr>
       </w:pPr>
       <w:r>
+        <w:lastRenderedPageBreak/>
         <w:t>Dataset Overview</w:t>
       </w:r>
     </w:p>
@@ -8233,6 +8450,9 @@
         <w:jc w:val="center"/>
       </w:pPr>
       <w:r>
+        <w:rPr>
+          <w:noProof/>
+        </w:rPr>
         <w:drawing>
           <wp:inline distT="0" distB="0" distL="0" distR="0" wp14:anchorId="05B9C1D1" wp14:editId="20D0D917">
             <wp:extent cx="3010320" cy="476316"/>
@@ -8331,7 +8551,9 @@
         <w:jc w:val="center"/>
       </w:pPr>
       <w:r>
-        <w:lastRenderedPageBreak/>
+        <w:rPr>
+          <w:noProof/>
+        </w:rPr>
         <w:drawing>
           <wp:inline distT="0" distB="0" distL="0" distR="0" wp14:anchorId="065E3621" wp14:editId="24FCD1B1">
             <wp:extent cx="5731510" cy="2689860"/>
@@ -8398,6 +8620,7 @@
         </w:numPr>
       </w:pPr>
       <w:r>
+        <w:lastRenderedPageBreak/>
         <w:t>Class Distribution Analysis</w:t>
       </w:r>
     </w:p>
@@ -8429,6 +8652,9 @@
         <w:jc w:val="center"/>
       </w:pPr>
       <w:r>
+        <w:rPr>
+          <w:noProof/>
+        </w:rPr>
         <w:drawing>
           <wp:inline distT="0" distB="0" distL="0" distR="0" wp14:anchorId="1B21346B" wp14:editId="6EE57D31">
             <wp:extent cx="2926080" cy="2802536"/>
@@ -8490,43 +8716,43 @@
         </w:numPr>
       </w:pPr>
       <w:r>
+        <w:t>Correlation Analysis</w:t>
+      </w:r>
+    </w:p>
+    <w:p>
+      <w:pPr>
+        <w:pStyle w:val="MSISTEXT"/>
+        <w:rPr>
+          <w:lang w:val="en-IN"/>
+        </w:rPr>
+      </w:pPr>
+      <w:r>
+        <w:rPr>
+          <w:lang w:val="en-IN"/>
+        </w:rPr>
+        <w:t>Correlation analysis was performed to understand the relationships among different network traffic features before feature selection. Highly correlated features often contain redundant information and may unnecessarily increase the computational complexity of classification models.</w:t>
+      </w:r>
+    </w:p>
+    <w:p>
+      <w:pPr>
+        <w:pStyle w:val="MSISTEXT"/>
+      </w:pPr>
+      <w:r>
+        <w:t>A correlation matrix was generated to visualize the relationships between numerical features. The observations obtained from this analysis supported the subsequent application of the Pearson Correlation Coefficient (PCC) for selecting the most informative features.</w:t>
+      </w:r>
+    </w:p>
+    <w:p>
+      <w:pPr>
+        <w:pStyle w:val="MSISTEXT"/>
+        <w:jc w:val="center"/>
+      </w:pPr>
+      <w:r>
+        <w:rPr>
+          <w:noProof/>
+        </w:rPr>
         <w:lastRenderedPageBreak/>
-        <w:t>Correlation Analysis</w:t>
-      </w:r>
-    </w:p>
-    <w:p>
-      <w:pPr>
-        <w:pStyle w:val="MSISTEXT"/>
-        <w:rPr>
-          <w:lang w:val="en-IN"/>
-        </w:rPr>
-      </w:pPr>
-      <w:r>
-        <w:rPr>
-          <w:lang w:val="en-IN"/>
-        </w:rPr>
-        <w:t>Correlation analysis was performed to understand the relationships among different network traffic features before feature selection. Highly correlated features often contain redundant information and may unnecessarily increase the computational complexity of classification models.</w:t>
-      </w:r>
-    </w:p>
-    <w:p>
-      <w:pPr>
-        <w:pStyle w:val="MSISTEXT"/>
-      </w:pPr>
-      <w:r>
-        <w:t>A correlation matrix was generated to visualize the relationships between numerical features. The observations obtained from this analysis supported the subsequent application of the Pearson Correlation Coefficient (PCC) for selecting the most informative features.</w:t>
-      </w:r>
-    </w:p>
-    <w:p>
-      <w:pPr>
-        <w:pStyle w:val="MSISTEXT"/>
-        <w:jc w:val="center"/>
-      </w:pPr>
-      <w:r>
-        <w:rPr>
-          <w:noProof/>
-        </w:rPr>
         <w:drawing>
-          <wp:inline distT="0" distB="0" distL="0" distR="0" wp14:anchorId="58647A75" wp14:editId="02929769">
+          <wp:inline distT="0" distB="0" distL="0" distR="0" wp14:anchorId="58647A75" wp14:editId="181BFA1A">
             <wp:extent cx="5731510" cy="4972050"/>
             <wp:effectExtent l="0" t="0" r="2540" b="0"/>
             <wp:docPr id="1437494371" name="Picture 4"/>
@@ -8607,7 +8833,6 @@
         <w:rPr>
           <w:lang w:val="en-IN"/>
         </w:rPr>
-        <w:lastRenderedPageBreak/>
         <w:t>The exploratory data analysis provided several important observations that influenced the subsequent stages of implementation:</w:t>
       </w:r>
     </w:p>
@@ -8661,28 +8886,19 @@
     </w:p>
     <w:p>
       <w:pPr>
-        <w:pStyle w:val="MSISTEXT"/>
-        <w:numPr>
-          <w:ilvl w:val="0"/>
-          <w:numId w:val="12"/>
-        </w:numPr>
-      </w:pPr>
-      <w:r>
-        <w:t>Correlation analysis confirmed the presence of redundant relationships among certain features, supporting the use of PCC-based feature selection.</w:t>
-      </w:r>
-    </w:p>
-    <w:p>
-      <w:pPr>
-        <w:pStyle w:val="MSISTEXT"/>
-        <w:rPr>
-          <w:lang w:val="en-IN"/>
-        </w:rPr>
-      </w:pPr>
-      <w:r>
-        <w:rPr>
-          <w:lang w:val="en-IN"/>
-        </w:rPr>
-        <w:t>Based on these observations, the dataset was considered suitable for feature selection and model training.</w:t>
+        <w:spacing w:after="160"/>
+        <w:rPr>
+          <w:rFonts w:cs="Times New Roman"/>
+          <w:b/>
+          <w:bCs/>
+          <w:kern w:val="2"/>
+          <w:szCs w:val="24"/>
+          <w:lang w:val="en-US"/>
+          <w14:ligatures w14:val="standardContextual"/>
+        </w:rPr>
+      </w:pPr>
+      <w:r>
+        <w:br w:type="page"/>
       </w:r>
     </w:p>
     <w:p>
@@ -8690,6 +8906,7 @@
         <w:pStyle w:val="MSISSUBHEADIN"/>
       </w:pPr>
       <w:r>
+        <w:lastRenderedPageBreak/>
         <w:t>BINARY CLASSIFICATION</w:t>
       </w:r>
     </w:p>
@@ -8736,7 +8953,6 @@
         <w:rPr>
           <w:lang w:val="en-IN"/>
         </w:rPr>
-        <w:lastRenderedPageBreak/>
         <w:t>After completing the binary label conversion, the dataset was re-examined to verify the distribution of both classes. The analysis confirmed that the dataset remained highly imbalanced, with malicious traffic representing the majority of the records. Although class imbalance is a common characteristic of intrusion detection datasets, preserving the original distribution allows the implemented models to be evaluated under realistic network conditions.</w:t>
       </w:r>
     </w:p>
@@ -8752,6 +8968,20 @@
           <w:lang w:val="en-IN"/>
         </w:rPr>
         <w:t>The binary dataset generated during this stage served as the final input for the Pearson Correlation Coefficient (PCC) feature selection process and the subsequent training of the Random Forest (RF), Artificial Neural Network (ANN), and Convolutional Neural Network (CNN) models.</w:t>
+      </w:r>
+    </w:p>
+    <w:p>
+      <w:pPr>
+        <w:spacing w:after="160"/>
+        <w:rPr>
+          <w:rFonts w:cs="Times New Roman"/>
+          <w:kern w:val="2"/>
+          <w:szCs w:val="24"/>
+          <w14:ligatures w14:val="standardContextual"/>
+        </w:rPr>
+      </w:pPr>
+      <w:r>
+        <w:br w:type="page"/>
       </w:r>
     </w:p>
     <w:tbl>
@@ -8798,6 +9028,7 @@
                 <w:bCs/>
                 <w:lang w:val="en-IN"/>
               </w:rPr>
+              <w:lastRenderedPageBreak/>
               <w:t>Original Label</w:t>
             </w:r>
           </w:p>
@@ -9254,11 +9485,7 @@
         <w:pStyle w:val="MSISTEXT"/>
       </w:pPr>
       <w:r>
-        <w:t xml:space="preserve">To address this challenge, the present work adopts the Pearson Correlation Coefficient (PCC) feature selection technique proposed in the selected research paper. PCC is a </w:t>
-      </w:r>
-      <w:r>
-        <w:lastRenderedPageBreak/>
-        <w:t>statistical measure that quantifies the strength and direction of the linear relationship between two variables. In this implementation, the correlation between each network traffic feature and the target class was calculated to determine the importance of individual features for intrusion detection.</w:t>
+        <w:t>To address this challenge, the present work adopts the Pearson Correlation Coefficient (PCC) feature selection technique proposed in the selected research paper. PCC is a statistical measure that quantifies the strength and direction of the linear relationship between two variables. In this implementation, the correlation between each network traffic feature and the target class was calculated to determine the importance of individual features for intrusion detection.</w:t>
       </w:r>
     </w:p>
     <w:p>
@@ -9267,6 +9494,23 @@
       </w:pPr>
       <w:r>
         <w:t>Correlation coefficient lies in the range of -1 to +1. When the value is close to +1, it shows that there is a high positive correlation, while if the value is close to -1, it depicts high negative correlation. If the value is close to zero, it means there is not much of linear correlation. Characteristics which have higher correlations with the class of interest are important for intrusion detection.</w:t>
+      </w:r>
+    </w:p>
+    <w:p>
+      <w:pPr>
+        <w:spacing w:after="160"/>
+        <w:rPr>
+          <w:rFonts w:cs="Times New Roman"/>
+          <w:b/>
+          <w:bCs/>
+          <w:kern w:val="2"/>
+          <w:szCs w:val="24"/>
+          <w:lang w:val="en-US"/>
+          <w14:ligatures w14:val="standardContextual"/>
+        </w:rPr>
+      </w:pPr>
+      <w:r>
+        <w:br w:type="page"/>
       </w:r>
     </w:p>
     <w:p>
@@ -9278,6 +9522,7 @@
         </w:numPr>
       </w:pPr>
       <w:r>
+        <w:lastRenderedPageBreak/>
         <w:t>PCC Implementation</w:t>
       </w:r>
     </w:p>
@@ -9354,14 +9599,7 @@
         <w:rPr>
           <w:lang w:val="en-IN"/>
         </w:rPr>
-        <w:t xml:space="preserve">The correlation coefficient indicates the strength and direction of the relationship between an individual feature and the target class. A positive correlation suggests that </w:t>
-      </w:r>
-      <w:r>
-        <w:rPr>
-          <w:lang w:val="en-IN"/>
-        </w:rPr>
-        <w:lastRenderedPageBreak/>
-        <w:t>an increase in the feature value is generally associated with the presence of a particular attack class, while a negative correlation indicates an inverse relationship. Features with correlation values close to zero were considered to have a weaker linear relationship with the target variable.</w:t>
+        <w:t>The correlation coefficient indicates the strength and direction of the relationship between an individual feature and the target class. A positive correlation suggests that an increase in the feature value is generally associated with the presence of a particular attack class, while a negative correlation indicates an inverse relationship. Features with correlation values close to zero were considered to have a weaker linear relationship with the target variable.</w:t>
       </w:r>
     </w:p>
     <w:p>
@@ -9387,6 +9625,7 @@
         </w:numPr>
       </w:pPr>
       <w:r>
+        <w:lastRenderedPageBreak/>
         <w:t>Selected Features</w:t>
       </w:r>
     </w:p>
@@ -9471,30 +9710,36 @@
         <w:pStyle w:val="MSISSUBHEADIN"/>
       </w:pPr>
       <w:r>
+        <w:t xml:space="preserve">RANDOM FOREST </w:t>
+      </w:r>
+    </w:p>
+    <w:p>
+      <w:pPr>
+        <w:pStyle w:val="MSISTEXT"/>
+      </w:pPr>
+      <w:r>
+        <w:t>Random Forest (RF) is chosen as the initial classifier for this work to lay the foundation for machine learning-based intrusion detection approach. Random Forest is an ensemble method that integrates the outputs of multiple decision trees to increase the accuracy of classification as well as to decrease the risk of overfitting. With such characteristics as robustness, efficiency of dealing with high-dimensional data, and high learning performance, Random Forest became widely used in the field of intrusion detection.</w:t>
+      </w:r>
+    </w:p>
+    <w:p>
+      <w:pPr>
+        <w:pStyle w:val="MSISTEXT"/>
+        <w:rPr>
+          <w:lang w:val="en-IN"/>
+        </w:rPr>
+      </w:pPr>
+      <w:r>
+        <w:rPr>
+          <w:lang w:val="en-IN"/>
+        </w:rPr>
+        <w:t xml:space="preserve">In the present implementation, the Random Forest classifier was trained using the feature subset obtained after Pearson Correlation Coefficient (PCC) based feature </w:t>
+      </w:r>
+      <w:r>
+        <w:rPr>
+          <w:lang w:val="en-IN"/>
+        </w:rPr>
         <w:lastRenderedPageBreak/>
-        <w:t xml:space="preserve">RANDOM FOREST </w:t>
-      </w:r>
-    </w:p>
-    <w:p>
-      <w:pPr>
-        <w:pStyle w:val="MSISTEXT"/>
-      </w:pPr>
-      <w:r>
-        <w:t>Random Forest (RF) is chosen as the initial classifier for this work to lay the foundation for machine learning-based intrusion detection approach. Random Forest is an ensemble method that integrates the outputs of multiple decision trees to increase the accuracy of classification as well as to decrease the risk of overfitting. With such characteristics as robustness, efficiency of dealing with high-dimensional data, and high learning performance, Random Forest became widely used in the field of intrusion detection.</w:t>
-      </w:r>
-    </w:p>
-    <w:p>
-      <w:pPr>
-        <w:pStyle w:val="MSISTEXT"/>
-        <w:rPr>
-          <w:lang w:val="en-IN"/>
-        </w:rPr>
-      </w:pPr>
-      <w:r>
-        <w:rPr>
-          <w:lang w:val="en-IN"/>
-        </w:rPr>
-        <w:t>In the present implementation, the Random Forest classifier was trained using the feature subset obtained after Pearson Correlation Coefficient (PCC) based feature selection. Prior to model training, the cleaned dataset was divided into training and testing subsets to ensure that the classifier was evaluated using previously unseen data. This approach provides a reliable assessment of the model's ability to generalize to new network traffic instances.</w:t>
+        <w:t>selection. Prior to model training, the cleaned dataset was divided into training and testing subsets to ensure that the classifier was evaluated using previously unseen data. This approach provides a reliable assessment of the model's ability to generalize to new network traffic instances.</w:t>
       </w:r>
     </w:p>
     <w:p>
@@ -9672,7 +9917,6 @@
               <w:rPr>
                 <w:lang w:val="en-IN"/>
               </w:rPr>
-              <w:lastRenderedPageBreak/>
               <w:t>Pandas</w:t>
             </w:r>
           </w:p>
@@ -9859,10 +10103,35 @@
           <w:lang w:val="en-IN"/>
         </w:rPr>
       </w:pPr>
-      <w:r>
-        <w:rPr>
-          <w:lang w:val="en-IN"/>
-        </w:rPr>
+    </w:p>
+    <w:p>
+      <w:pPr>
+        <w:pStyle w:val="MSISTEXT"/>
+        <w:rPr>
+          <w:lang w:val="en-IN"/>
+        </w:rPr>
+      </w:pPr>
+    </w:p>
+    <w:p>
+      <w:pPr>
+        <w:pStyle w:val="MSISTEXT"/>
+        <w:rPr>
+          <w:lang w:val="en-IN"/>
+        </w:rPr>
+      </w:pPr>
+    </w:p>
+    <w:p>
+      <w:pPr>
+        <w:pStyle w:val="MSISTEXT"/>
+        <w:rPr>
+          <w:lang w:val="en-IN"/>
+        </w:rPr>
+      </w:pPr>
+      <w:r>
+        <w:rPr>
+          <w:lang w:val="en-IN"/>
+        </w:rPr>
+        <w:lastRenderedPageBreak/>
         <w:t>The implementation generated the following outputs:</w:t>
       </w:r>
     </w:p>
@@ -10035,22 +10304,19 @@
         <w:rPr>
           <w:lang w:val="en-IN"/>
         </w:rPr>
-        <w:t xml:space="preserve">Before model training, the processed dataset was divided into training and testing subsets. The ANN architecture consisted of an input layer that received the selected </w:t>
-      </w:r>
-      <w:r>
-        <w:rPr>
-          <w:lang w:val="en-IN"/>
-        </w:rPr>
+        <w:t>Before model training, the processed dataset was divided into training and testing subsets. The ANN architecture consisted of an input layer that received the selected network traffic features, one or more hidden layers responsible for learning complex feature representations, and an output layer that performed binary classification by predicting whether a network traffic instance represented normal or malicious activity.</w:t>
+      </w:r>
+    </w:p>
+    <w:p>
+      <w:pPr>
+        <w:pStyle w:val="MSISTEXT"/>
+      </w:pPr>
+      <w:r>
+        <w:t xml:space="preserve">In the training phase, the model used the backpropagation method and an optimization method to minimize the classification error by adjusting the internal weights. Several training iterations were conducted until convergence was attained and learning </w:t>
+      </w:r>
+      <w:r>
         <w:lastRenderedPageBreak/>
-        <w:t>network traffic features, one or more hidden layers responsible for learning complex feature representations, and an output layer that performed binary classification by predicting whether a network traffic instance represented normal or malicious activity.</w:t>
-      </w:r>
-    </w:p>
-    <w:p>
-      <w:pPr>
-        <w:pStyle w:val="MSISTEXT"/>
-      </w:pPr>
-      <w:r>
-        <w:t>In the training phase, the model used the backpropagation method and an optimization method to minimize the classification error by adjusting the internal weights. Several training iterations were conducted until convergence was attained and learning performance stabilized. The performance of the ANN classifier was assessed based on Accuracy, Precision, Recall, F1-Score, and the Confusion Matrix using the test set.</w:t>
+        <w:t>performance stabilized. The performance of the ANN classifier was assessed based on Accuracy, Precision, Recall, F1-Score, and the Confusion Matrix using the test set.</w:t>
       </w:r>
     </w:p>
     <w:p>
@@ -10493,7 +10759,6 @@
         <w:rPr>
           <w:lang w:val="en-IN"/>
         </w:rPr>
-        <w:lastRenderedPageBreak/>
         <w:t xml:space="preserve">Training and validation loss. </w:t>
       </w:r>
     </w:p>
@@ -10554,32 +10819,15 @@
     <w:p>
       <w:pPr>
         <w:pStyle w:val="MSISTEXT"/>
-        <w:numPr>
-          <w:ilvl w:val="0"/>
-          <w:numId w:val="14"/>
-        </w:numPr>
-        <w:rPr>
-          <w:lang w:val="en-IN"/>
-        </w:rPr>
-      </w:pPr>
-      <w:r>
-        <w:rPr>
-          <w:lang w:val="en-IN"/>
-        </w:rPr>
-        <w:t xml:space="preserve">Accuracy, Precision, Recall, and F1-Score. </w:t>
-      </w:r>
-    </w:p>
-    <w:p>
-      <w:pPr>
-        <w:pStyle w:val="MSISTEXT"/>
-        <w:rPr>
-          <w:lang w:val="en-IN"/>
-        </w:rPr>
-      </w:pPr>
-      <w:r>
-        <w:rPr>
-          <w:lang w:val="en-IN"/>
-        </w:rPr>
+        <w:rPr>
+          <w:lang w:val="en-IN"/>
+        </w:rPr>
+      </w:pPr>
+      <w:r>
+        <w:rPr>
+          <w:lang w:val="en-IN"/>
+        </w:rPr>
+        <w:lastRenderedPageBreak/>
         <w:t>These outputs were saved for comparison with the Random Forest and Convolutional Neural Network models.</w:t>
       </w:r>
     </w:p>
@@ -10645,21 +10893,30 @@
         <w:rPr>
           <w:lang w:val="en-IN"/>
         </w:rPr>
-        <w:t xml:space="preserve">The CNN architecture consisted of convolutional layers for extracting important feature patterns, activation functions for introducing non-linearity, pooling layers for reducing </w:t>
-      </w:r>
-      <w:r>
-        <w:rPr>
-          <w:lang w:val="en-IN"/>
-        </w:rPr>
+        <w:t>The CNN architecture consisted of convolutional layers for extracting important feature patterns, activation functions for introducing non-linearity, pooling layers for reducing feature dimensions, and fully connected layers for performing the final binary classification. During training, the network iteratively updated its weights through backpropagation and optimization algorithms to minimize the classification error.</w:t>
+      </w:r>
+    </w:p>
+    <w:p>
+      <w:pPr>
+        <w:spacing w:after="160"/>
+        <w:rPr>
+          <w:rFonts w:cs="Times New Roman"/>
+          <w:kern w:val="2"/>
+          <w:szCs w:val="24"/>
+          <w:lang w:val="en-US"/>
+          <w14:ligatures w14:val="standardContextual"/>
+        </w:rPr>
+      </w:pPr>
+      <w:r>
+        <w:br w:type="page"/>
+      </w:r>
+    </w:p>
+    <w:p>
+      <w:pPr>
+        <w:pStyle w:val="MSISTEXT"/>
+      </w:pPr>
+      <w:r>
         <w:lastRenderedPageBreak/>
-        <w:t>feature dimensions, and fully connected layers for performing the final binary classification. During training, the network iteratively updated its weights through backpropagation and optimization algorithms to minimize the classification error.</w:t>
-      </w:r>
-    </w:p>
-    <w:p>
-      <w:pPr>
-        <w:pStyle w:val="MSISTEXT"/>
-      </w:pPr>
-      <w:r>
         <w:t>After training, the CNN model was then tested on the test data set. The classifier would make predictions based on each of the network traffic data and would be analyzed using accuracy measures such as Accuracy, Precision, Recall, F1-Score, and Confusion Matrix. The obtained results would later be compared with the results obtained from Random Forest and Artificial Neural Network algorithms.</w:t>
       </w:r>
     </w:p>
@@ -11181,8 +11438,32 @@
         <w:rPr>
           <w:lang w:val="en-IN"/>
         </w:rPr>
+        <w:t xml:space="preserve">The Convolutional Neural Network successfully learned the complex relationships present within the selected network traffic features and produced binary predictions for normal and malicious network traffic. By automatically extracting discriminative </w:t>
+      </w:r>
+      <w:r>
+        <w:rPr>
+          <w:lang w:val="en-IN"/>
+        </w:rPr>
         <w:lastRenderedPageBreak/>
-        <w:t>The Convolutional Neural Network successfully learned the complex relationships present within the selected network traffic features and produced binary predictions for normal and malicious network traffic. By automatically extracting discriminative feature representations during training, the CNN provided a robust deep learning approach for intrusion detection. The final performance of the CNN model was evaluated using standard classification metrics and compared with the Random Forest and Artificial Neural Network models to determine the most effective classifier for the proposed intrusion detection framework.</w:t>
+        <w:t>feature representations during training, the CNN provided a robust deep learning approach for intrusion detection. The final performance of the CNN model was evaluated using standard classification metrics and compared with the Random Forest and Artificial Neural Network models to determine the most effective classifier for the proposed intrusion detection framework.</w:t>
+      </w:r>
+    </w:p>
+    <w:p>
+      <w:pPr>
+        <w:spacing w:after="160"/>
+        <w:rPr>
+          <w:rFonts w:cs="Times New Roman"/>
+          <w:b/>
+          <w:bCs/>
+          <w:kern w:val="2"/>
+          <w:sz w:val="28"/>
+          <w:szCs w:val="28"/>
+          <w:lang w:val="en-US"/>
+          <w14:ligatures w14:val="standardContextual"/>
+        </w:rPr>
+      </w:pPr>
+      <w:r>
+        <w:br w:type="page"/>
       </w:r>
     </w:p>
     <w:p>
@@ -11194,7 +11475,26 @@
         </w:numPr>
       </w:pPr>
       <w:r>
+        <w:lastRenderedPageBreak/>
         <w:t>RESULTS AND DISCUSSION</w:t>
+      </w:r>
+    </w:p>
+    <w:p>
+      <w:pPr>
+        <w:spacing w:after="160"/>
+        <w:rPr>
+          <w:rFonts w:cs="Times New Roman"/>
+          <w:b/>
+          <w:bCs/>
+          <w:kern w:val="2"/>
+          <w:sz w:val="28"/>
+          <w:szCs w:val="28"/>
+          <w:lang w:val="en-US"/>
+          <w14:ligatures w14:val="standardContextual"/>
+        </w:rPr>
+      </w:pPr>
+      <w:r>
+        <w:br w:type="page"/>
       </w:r>
     </w:p>
     <w:p>
@@ -11206,6 +11506,7 @@
         </w:numPr>
       </w:pPr>
       <w:r>
+        <w:lastRenderedPageBreak/>
         <w:t>CONCLUSION</w:t>
       </w:r>
     </w:p>
@@ -11264,14 +11565,7 @@
         <w:rPr>
           <w:lang w:val="en-IN"/>
         </w:rPr>
-        <w:t xml:space="preserve">The implementation presented in this work establishes a complete intrusion detection framework, beginning with raw network traffic data and progressing through preprocessing, feature selection, model development, and evaluation. The experimental </w:t>
-      </w:r>
-      <w:r>
-        <w:rPr>
-          <w:lang w:val="en-IN"/>
-        </w:rPr>
-        <w:lastRenderedPageBreak/>
-        <w:t>analysis and comparative performance of the implemented models are presented in the Results chapter, providing a detailed assessment of their effectiveness in detecting malicious network traffic.</w:t>
+        <w:t>The implementation presented in this work establishes a complete intrusion detection framework, beginning with raw network traffic data and progressing through preprocessing, feature selection, model development, and evaluation. The experimental analysis and comparative performance of the implemented models are presented in the Results chapter, providing a detailed assessment of their effectiveness in detecting malicious network traffic.</w:t>
       </w:r>
     </w:p>
     <w:p>
@@ -11286,6 +11580,24 @@
           <w:lang w:val="en-IN"/>
         </w:rPr>
         <w:t>Overall, the work demonstrates a structured implementation of an anomaly-based intrusion detection framework for IoT environments and provides a foundation for further improvements in intelligent network security systems.</w:t>
+      </w:r>
+    </w:p>
+    <w:p>
+      <w:pPr>
+        <w:spacing w:after="160"/>
+        <w:rPr>
+          <w:rFonts w:cs="Times New Roman"/>
+          <w:b/>
+          <w:bCs/>
+          <w:kern w:val="2"/>
+          <w:sz w:val="28"/>
+          <w:szCs w:val="28"/>
+          <w:lang w:val="en-US"/>
+          <w14:ligatures w14:val="standardContextual"/>
+        </w:rPr>
+      </w:pPr>
+      <w:r>
+        <w:br w:type="page"/>
       </w:r>
     </w:p>
     <w:p>
@@ -11297,6 +11609,7 @@
         </w:numPr>
       </w:pPr>
       <w:r>
+        <w:lastRenderedPageBreak/>
         <w:t>SCOPE FOR FUTURE WORK</w:t>
       </w:r>
     </w:p>
@@ -11369,14 +11682,25 @@
         <w:rPr>
           <w:lang w:val="en-IN"/>
         </w:rPr>
-        <w:t xml:space="preserve">Finally, the proposed intrusion detection framework can be integrated into real-time IoT systems and edge computing platforms, enabling continuous monitoring of network </w:t>
-      </w:r>
-      <w:r>
-        <w:rPr>
-          <w:lang w:val="en-IN"/>
-        </w:rPr>
-        <w:lastRenderedPageBreak/>
-        <w:t>traffic and rapid detection of emerging cyber threats with reduced computational latency.</w:t>
+        <w:t>Finally, the proposed intrusion detection framework can be integrated into real-time IoT systems and edge computing platforms, enabling continuous monitoring of network traffic and rapid detection of emerging cyber threats with reduced computational latency.</w:t>
+      </w:r>
+    </w:p>
+    <w:p>
+      <w:pPr>
+        <w:spacing w:after="160"/>
+        <w:rPr>
+          <w:rFonts w:cs="Times New Roman"/>
+          <w:b/>
+          <w:bCs/>
+          <w:kern w:val="2"/>
+          <w:sz w:val="28"/>
+          <w:szCs w:val="28"/>
+          <w:lang w:val="en-US"/>
+          <w14:ligatures w14:val="standardContextual"/>
+        </w:rPr>
+      </w:pPr>
+      <w:r>
+        <w:br w:type="page"/>
       </w:r>
     </w:p>
     <w:p>
@@ -11388,6 +11712,7 @@
         </w:numPr>
       </w:pPr>
       <w:r>
+        <w:lastRenderedPageBreak/>
         <w:t>REFERENCES</w:t>
       </w:r>
     </w:p>
@@ -11564,26 +11889,23 @@
         <w:pStyle w:val="MSISTEXT"/>
       </w:pPr>
       <w:r>
-        <w:t xml:space="preserve">[7] M. Subramanian, K. Shanmugavadivel, P. S. Nandhini, and R. Sowmya, "DDoS Attack Detection Using Deep Learning and Bayesian Hyperparameter Optimization," in Proceedings of 7th International Conference on Harmony Search, Soft Computing and Applications, Lecture Notes on Data Engineering and Communications </w:t>
-      </w:r>
+        <w:t xml:space="preserve">[7] M. Subramanian, K. Shanmugavadivel, P. S. Nandhini, and R. Sowmya, "DDoS Attack Detection Using Deep Learning and Bayesian Hyperparameter Optimization," in Proceedings of 7th International Conference on Harmony Search, Soft Computing and Applications, Lecture Notes on Data Engineering and Communications Technologies, vol. 140, Springer, 2022, pp. 395–404, </w:t>
+      </w:r>
+      <w:proofErr w:type="spellStart"/>
+      <w:r>
+        <w:t>doi</w:t>
+      </w:r>
+      <w:proofErr w:type="spellEnd"/>
+      <w:r>
+        <w:t>: 10.1007/978-981-19-2948-9_38.</w:t>
+      </w:r>
+    </w:p>
+    <w:p>
+      <w:pPr>
+        <w:pStyle w:val="MSISTEXT"/>
+      </w:pPr>
       <w:r>
         <w:lastRenderedPageBreak/>
-        <w:t xml:space="preserve">Technologies, vol. 140, Springer, 2022, pp. 395–404, </w:t>
-      </w:r>
-      <w:proofErr w:type="spellStart"/>
-      <w:r>
-        <w:t>doi</w:t>
-      </w:r>
-      <w:proofErr w:type="spellEnd"/>
-      <w:r>
-        <w:t>: 10.1007/978-981-19-2948-9_38.</w:t>
-      </w:r>
-    </w:p>
-    <w:p>
-      <w:pPr>
-        <w:pStyle w:val="MSISTEXT"/>
-      </w:pPr>
-      <w:r>
         <w:t xml:space="preserve">[8] X. Gao, C. Shan, C. Hu, Z. Niu, and Z. Liu, "An Adaptive Ensemble Machine Learning Model for Intrusion Detection," IEEE Access, vol. 7, pp. 82512–82521, 2019, </w:t>
       </w:r>
       <w:proofErr w:type="spellStart"/>
@@ -14820,11 +15142,13 @@
   <w:style w:type="character" w:default="1" w:styleId="DefaultParagraphFont">
     <w:name w:val="Default Paragraph Font"/>
     <w:uiPriority w:val="1"/>
+    <w:semiHidden/>
     <w:unhideWhenUsed/>
   </w:style>
   <w:style w:type="table" w:default="1" w:styleId="TableNormal">
     <w:name w:val="Normal Table"/>
     <w:uiPriority w:val="99"/>
+    <w:semiHidden/>
     <w:unhideWhenUsed/>
     <w:tblPr>
       <w:tblInd w:w="0" w:type="dxa"/>

</xml_diff>

<commit_message>
NEW RESULTS HAVE BEEN GENERATED
</commit_message>
<xml_diff>
--- a/DOCS/CSE3_REPORT.docx
+++ b/DOCS/CSE3_REPORT.docx
@@ -430,7 +430,15 @@
                 <w:b/>
                 <w:szCs w:val="24"/>
               </w:rPr>
-              <w:t>261100610017</w:t>
+              <w:t>26110061001</w:t>
+            </w:r>
+            <w:r>
+              <w:rPr>
+                <w:rFonts w:cs="Times New Roman"/>
+                <w:b/>
+                <w:szCs w:val="24"/>
+              </w:rPr>
+              <w:t>9</w:t>
             </w:r>
           </w:p>
         </w:tc>
@@ -764,7 +772,7 @@
           <w:lang w:val="en-US"/>
         </w:rPr>
         <w:drawing>
-          <wp:anchor distT="0" distB="0" distL="114300" distR="114300" simplePos="0" relativeHeight="251658240" behindDoc="0" locked="0" layoutInCell="1" allowOverlap="1" wp14:anchorId="21785E6A" wp14:editId="05BA8A18">
+          <wp:anchor distT="0" distB="0" distL="114300" distR="114300" simplePos="0" relativeHeight="251658240" behindDoc="0" locked="0" layoutInCell="1" allowOverlap="1" wp14:anchorId="21785E6A" wp14:editId="59CB96AE">
             <wp:simplePos x="0" y="0"/>
             <wp:positionH relativeFrom="margin">
               <wp:align>center</wp:align>
@@ -7243,7 +7251,7 @@
           <w:noProof/>
         </w:rPr>
         <w:drawing>
-          <wp:inline distT="0" distB="0" distL="0" distR="0" wp14:anchorId="76E92904" wp14:editId="045681B4">
+          <wp:inline distT="0" distB="0" distL="0" distR="0" wp14:anchorId="76E92904" wp14:editId="79AC15C1">
             <wp:extent cx="5731510" cy="7019925"/>
             <wp:effectExtent l="0" t="0" r="2540" b="9525"/>
             <wp:docPr id="1360371267" name="Picture 1"/>
@@ -8752,7 +8760,7 @@
         </w:rPr>
         <w:lastRenderedPageBreak/>
         <w:drawing>
-          <wp:inline distT="0" distB="0" distL="0" distR="0" wp14:anchorId="58647A75" wp14:editId="181BFA1A">
+          <wp:inline distT="0" distB="0" distL="0" distR="0" wp14:anchorId="58647A75" wp14:editId="03FF7159">
             <wp:extent cx="5731510" cy="4972050"/>
             <wp:effectExtent l="0" t="0" r="2540" b="0"/>
             <wp:docPr id="1437494371" name="Picture 4"/>
@@ -11481,6 +11489,1716 @@
     </w:p>
     <w:p>
       <w:pPr>
+        <w:pStyle w:val="MSISSUBHEADIN"/>
+      </w:pPr>
+      <w:r>
+        <w:t>CNN</w:t>
+      </w:r>
+    </w:p>
+    <w:p>
+      <w:pPr>
+        <w:pStyle w:val="MSISSUBHEADIN"/>
+        <w:numPr>
+          <w:ilvl w:val="2"/>
+          <w:numId w:val="5"/>
+        </w:numPr>
+      </w:pPr>
+      <w:r>
+        <w:t>Architecture</w:t>
+      </w:r>
+    </w:p>
+    <w:p>
+      <w:pPr>
+        <w:pStyle w:val="MSISTEXT"/>
+        <w:jc w:val="center"/>
+      </w:pPr>
+      <w:r>
+        <w:rPr>
+          <w:noProof/>
+        </w:rPr>
+        <w:drawing>
+          <wp:inline distT="0" distB="0" distL="0" distR="0" wp14:anchorId="380CF2ED" wp14:editId="6271214E">
+            <wp:extent cx="5731510" cy="1409700"/>
+            <wp:effectExtent l="0" t="0" r="2540" b="0"/>
+            <wp:docPr id="755285696" name="Picture 1"/>
+            <wp:cNvGraphicFramePr>
+              <a:graphicFrameLocks xmlns:a="http://schemas.openxmlformats.org/drawingml/2006/main" noChangeAspect="1"/>
+            </wp:cNvGraphicFramePr>
+            <a:graphic xmlns:a="http://schemas.openxmlformats.org/drawingml/2006/main">
+              <a:graphicData uri="http://schemas.openxmlformats.org/drawingml/2006/picture">
+                <pic:pic xmlns:pic="http://schemas.openxmlformats.org/drawingml/2006/picture">
+                  <pic:nvPicPr>
+                    <pic:cNvPr id="0" name="Picture 2"/>
+                    <pic:cNvPicPr>
+                      <a:picLocks noChangeAspect="1" noChangeArrowheads="1"/>
+                    </pic:cNvPicPr>
+                  </pic:nvPicPr>
+                  <pic:blipFill rotWithShape="1">
+                    <a:blip r:embed="rId18" cstate="print">
+                      <a:extLst>
+                        <a:ext uri="{28A0092B-C50C-407E-A947-70E740481C1C}">
+                          <a14:useLocalDpi xmlns:a14="http://schemas.microsoft.com/office/drawing/2010/main" val="0"/>
+                        </a:ext>
+                      </a:extLst>
+                    </a:blip>
+                    <a:srcRect t="18516" b="8601"/>
+                    <a:stretch>
+                      <a:fillRect/>
+                    </a:stretch>
+                  </pic:blipFill>
+                  <pic:spPr bwMode="auto">
+                    <a:xfrm>
+                      <a:off x="0" y="0"/>
+                      <a:ext cx="5731510" cy="1409700"/>
+                    </a:xfrm>
+                    <a:prstGeom prst="rect">
+                      <a:avLst/>
+                    </a:prstGeom>
+                    <a:noFill/>
+                    <a:ln>
+                      <a:noFill/>
+                    </a:ln>
+                    <a:extLst>
+                      <a:ext uri="{53640926-AAD7-44D8-BBD7-CCE9431645EC}">
+                        <a14:shadowObscured xmlns:a14="http://schemas.microsoft.com/office/drawing/2010/main"/>
+                      </a:ext>
+                    </a:extLst>
+                  </pic:spPr>
+                </pic:pic>
+              </a:graphicData>
+            </a:graphic>
+          </wp:inline>
+        </w:drawing>
+      </w:r>
+    </w:p>
+    <w:p>
+      <w:pPr>
+        <w:pStyle w:val="MSISTEXT"/>
+        <w:jc w:val="center"/>
+      </w:pPr>
+      <w:r>
+        <w:t>Fig 7.1. CNN Architecture</w:t>
+      </w:r>
+    </w:p>
+    <w:p>
+      <w:pPr>
+        <w:pStyle w:val="MSISSUBHEADIN"/>
+        <w:numPr>
+          <w:ilvl w:val="2"/>
+          <w:numId w:val="5"/>
+        </w:numPr>
+      </w:pPr>
+      <w:r>
+        <w:t>Hyperparameter Configuration</w:t>
+      </w:r>
+    </w:p>
+    <w:p>
+      <w:pPr>
+        <w:pStyle w:val="MSISTEXT"/>
+        <w:jc w:val="center"/>
+      </w:pPr>
+      <w:r>
+        <w:rPr>
+          <w:noProof/>
+        </w:rPr>
+        <w:drawing>
+          <wp:inline distT="0" distB="0" distL="0" distR="0" wp14:anchorId="7F644C7A" wp14:editId="63D44BE9">
+            <wp:extent cx="5731510" cy="2674620"/>
+            <wp:effectExtent l="0" t="0" r="2540" b="0"/>
+            <wp:docPr id="580357939" name="Picture 2"/>
+            <wp:cNvGraphicFramePr>
+              <a:graphicFrameLocks xmlns:a="http://schemas.openxmlformats.org/drawingml/2006/main" noChangeAspect="1"/>
+            </wp:cNvGraphicFramePr>
+            <a:graphic xmlns:a="http://schemas.openxmlformats.org/drawingml/2006/main">
+              <a:graphicData uri="http://schemas.openxmlformats.org/drawingml/2006/picture">
+                <pic:pic xmlns:pic="http://schemas.openxmlformats.org/drawingml/2006/picture">
+                  <pic:nvPicPr>
+                    <pic:cNvPr id="0" name="Picture 3"/>
+                    <pic:cNvPicPr>
+                      <a:picLocks noChangeAspect="1" noChangeArrowheads="1"/>
+                    </pic:cNvPicPr>
+                  </pic:nvPicPr>
+                  <pic:blipFill rotWithShape="1">
+                    <a:blip r:embed="rId19" cstate="print">
+                      <a:extLst>
+                        <a:ext uri="{28A0092B-C50C-407E-A947-70E740481C1C}">
+                          <a14:useLocalDpi xmlns:a14="http://schemas.microsoft.com/office/drawing/2010/main" val="0"/>
+                        </a:ext>
+                      </a:extLst>
+                    </a:blip>
+                    <a:srcRect t="15283" b="9166"/>
+                    <a:stretch>
+                      <a:fillRect/>
+                    </a:stretch>
+                  </pic:blipFill>
+                  <pic:spPr bwMode="auto">
+                    <a:xfrm>
+                      <a:off x="0" y="0"/>
+                      <a:ext cx="5731510" cy="2674620"/>
+                    </a:xfrm>
+                    <a:prstGeom prst="rect">
+                      <a:avLst/>
+                    </a:prstGeom>
+                    <a:noFill/>
+                    <a:ln>
+                      <a:noFill/>
+                    </a:ln>
+                    <a:extLst>
+                      <a:ext uri="{53640926-AAD7-44D8-BBD7-CCE9431645EC}">
+                        <a14:shadowObscured xmlns:a14="http://schemas.microsoft.com/office/drawing/2010/main"/>
+                      </a:ext>
+                    </a:extLst>
+                  </pic:spPr>
+                </pic:pic>
+              </a:graphicData>
+            </a:graphic>
+          </wp:inline>
+        </w:drawing>
+      </w:r>
+    </w:p>
+    <w:p>
+      <w:pPr>
+        <w:pStyle w:val="MSISTEXT"/>
+        <w:jc w:val="center"/>
+      </w:pPr>
+      <w:r>
+        <w:t>Fig 7.2. Hyperparameters</w:t>
+      </w:r>
+    </w:p>
+    <w:p>
+      <w:pPr>
+        <w:pStyle w:val="MSISSUBHEADIN"/>
+        <w:numPr>
+          <w:ilvl w:val="2"/>
+          <w:numId w:val="5"/>
+        </w:numPr>
+      </w:pPr>
+      <w:r>
+        <w:t>Training Performance</w:t>
+      </w:r>
+    </w:p>
+    <w:p>
+      <w:pPr>
+        <w:pStyle w:val="MSISTEXT"/>
+        <w:jc w:val="center"/>
+      </w:pPr>
+      <w:r>
+        <w:rPr>
+          <w:noProof/>
+        </w:rPr>
+        <w:lastRenderedPageBreak/>
+        <w:drawing>
+          <wp:inline distT="0" distB="0" distL="0" distR="0" wp14:anchorId="450C7F83" wp14:editId="6D11ED95">
+            <wp:extent cx="5731510" cy="3582035"/>
+            <wp:effectExtent l="0" t="0" r="2540" b="0"/>
+            <wp:docPr id="217781950" name="Picture 3"/>
+            <wp:cNvGraphicFramePr>
+              <a:graphicFrameLocks xmlns:a="http://schemas.openxmlformats.org/drawingml/2006/main" noChangeAspect="1"/>
+            </wp:cNvGraphicFramePr>
+            <a:graphic xmlns:a="http://schemas.openxmlformats.org/drawingml/2006/main">
+              <a:graphicData uri="http://schemas.openxmlformats.org/drawingml/2006/picture">
+                <pic:pic xmlns:pic="http://schemas.openxmlformats.org/drawingml/2006/picture">
+                  <pic:nvPicPr>
+                    <pic:cNvPr id="0" name="Picture 4"/>
+                    <pic:cNvPicPr>
+                      <a:picLocks noChangeAspect="1" noChangeArrowheads="1"/>
+                    </pic:cNvPicPr>
+                  </pic:nvPicPr>
+                  <pic:blipFill>
+                    <a:blip r:embed="rId20" cstate="print">
+                      <a:extLst>
+                        <a:ext uri="{28A0092B-C50C-407E-A947-70E740481C1C}">
+                          <a14:useLocalDpi xmlns:a14="http://schemas.microsoft.com/office/drawing/2010/main" val="0"/>
+                        </a:ext>
+                      </a:extLst>
+                    </a:blip>
+                    <a:srcRect/>
+                    <a:stretch>
+                      <a:fillRect/>
+                    </a:stretch>
+                  </pic:blipFill>
+                  <pic:spPr bwMode="auto">
+                    <a:xfrm>
+                      <a:off x="0" y="0"/>
+                      <a:ext cx="5731510" cy="3582035"/>
+                    </a:xfrm>
+                    <a:prstGeom prst="rect">
+                      <a:avLst/>
+                    </a:prstGeom>
+                    <a:noFill/>
+                    <a:ln>
+                      <a:noFill/>
+                    </a:ln>
+                  </pic:spPr>
+                </pic:pic>
+              </a:graphicData>
+            </a:graphic>
+          </wp:inline>
+        </w:drawing>
+      </w:r>
+    </w:p>
+    <w:p>
+      <w:pPr>
+        <w:pStyle w:val="MSISTEXT"/>
+        <w:jc w:val="center"/>
+      </w:pPr>
+      <w:r>
+        <w:t>Figure 7.3. Training and Validation Accuracy over epochs</w:t>
+      </w:r>
+    </w:p>
+    <w:p>
+      <w:pPr>
+        <w:pStyle w:val="MSISTEXT"/>
+        <w:jc w:val="center"/>
+      </w:pPr>
+      <w:r>
+        <w:rPr>
+          <w:noProof/>
+        </w:rPr>
+        <w:drawing>
+          <wp:inline distT="0" distB="0" distL="0" distR="0" wp14:anchorId="36C73DB8" wp14:editId="5E909E33">
+            <wp:extent cx="5731510" cy="3582035"/>
+            <wp:effectExtent l="0" t="0" r="2540" b="0"/>
+            <wp:docPr id="1081931846" name="Picture 4"/>
+            <wp:cNvGraphicFramePr>
+              <a:graphicFrameLocks xmlns:a="http://schemas.openxmlformats.org/drawingml/2006/main" noChangeAspect="1"/>
+            </wp:cNvGraphicFramePr>
+            <a:graphic xmlns:a="http://schemas.openxmlformats.org/drawingml/2006/main">
+              <a:graphicData uri="http://schemas.openxmlformats.org/drawingml/2006/picture">
+                <pic:pic xmlns:pic="http://schemas.openxmlformats.org/drawingml/2006/picture">
+                  <pic:nvPicPr>
+                    <pic:cNvPr id="0" name="Picture 5"/>
+                    <pic:cNvPicPr>
+                      <a:picLocks noChangeAspect="1" noChangeArrowheads="1"/>
+                    </pic:cNvPicPr>
+                  </pic:nvPicPr>
+                  <pic:blipFill>
+                    <a:blip r:embed="rId21" cstate="print">
+                      <a:extLst>
+                        <a:ext uri="{28A0092B-C50C-407E-A947-70E740481C1C}">
+                          <a14:useLocalDpi xmlns:a14="http://schemas.microsoft.com/office/drawing/2010/main" val="0"/>
+                        </a:ext>
+                      </a:extLst>
+                    </a:blip>
+                    <a:srcRect/>
+                    <a:stretch>
+                      <a:fillRect/>
+                    </a:stretch>
+                  </pic:blipFill>
+                  <pic:spPr bwMode="auto">
+                    <a:xfrm>
+                      <a:off x="0" y="0"/>
+                      <a:ext cx="5731510" cy="3582035"/>
+                    </a:xfrm>
+                    <a:prstGeom prst="rect">
+                      <a:avLst/>
+                    </a:prstGeom>
+                    <a:noFill/>
+                    <a:ln>
+                      <a:noFill/>
+                    </a:ln>
+                  </pic:spPr>
+                </pic:pic>
+              </a:graphicData>
+            </a:graphic>
+          </wp:inline>
+        </w:drawing>
+      </w:r>
+    </w:p>
+    <w:p>
+      <w:pPr>
+        <w:pStyle w:val="MSISTEXT"/>
+        <w:jc w:val="center"/>
+      </w:pPr>
+      <w:r>
+        <w:t>Figure 7.4. Training and Validation Loss over epochs</w:t>
+      </w:r>
+    </w:p>
+    <w:p>
+      <w:pPr>
+        <w:pStyle w:val="MSISSUBHEADIN"/>
+        <w:numPr>
+          <w:ilvl w:val="2"/>
+          <w:numId w:val="5"/>
+        </w:numPr>
+      </w:pPr>
+      <w:r>
+        <w:t>Cross Validation Results</w:t>
+      </w:r>
+    </w:p>
+    <w:p>
+      <w:pPr>
+        <w:pStyle w:val="MSISTEXT"/>
+        <w:jc w:val="center"/>
+      </w:pPr>
+      <w:r>
+        <w:rPr>
+          <w:noProof/>
+        </w:rPr>
+        <w:lastRenderedPageBreak/>
+        <w:drawing>
+          <wp:inline distT="0" distB="0" distL="0" distR="0" wp14:anchorId="46882529" wp14:editId="6D9C9D65">
+            <wp:extent cx="5731510" cy="3582035"/>
+            <wp:effectExtent l="0" t="0" r="2540" b="0"/>
+            <wp:docPr id="138741544" name="Picture 5"/>
+            <wp:cNvGraphicFramePr>
+              <a:graphicFrameLocks xmlns:a="http://schemas.openxmlformats.org/drawingml/2006/main" noChangeAspect="1"/>
+            </wp:cNvGraphicFramePr>
+            <a:graphic xmlns:a="http://schemas.openxmlformats.org/drawingml/2006/main">
+              <a:graphicData uri="http://schemas.openxmlformats.org/drawingml/2006/picture">
+                <pic:pic xmlns:pic="http://schemas.openxmlformats.org/drawingml/2006/picture">
+                  <pic:nvPicPr>
+                    <pic:cNvPr id="0" name="Picture 6"/>
+                    <pic:cNvPicPr>
+                      <a:picLocks noChangeAspect="1" noChangeArrowheads="1"/>
+                    </pic:cNvPicPr>
+                  </pic:nvPicPr>
+                  <pic:blipFill>
+                    <a:blip r:embed="rId22" cstate="print">
+                      <a:extLst>
+                        <a:ext uri="{28A0092B-C50C-407E-A947-70E740481C1C}">
+                          <a14:useLocalDpi xmlns:a14="http://schemas.microsoft.com/office/drawing/2010/main" val="0"/>
+                        </a:ext>
+                      </a:extLst>
+                    </a:blip>
+                    <a:srcRect/>
+                    <a:stretch>
+                      <a:fillRect/>
+                    </a:stretch>
+                  </pic:blipFill>
+                  <pic:spPr bwMode="auto">
+                    <a:xfrm>
+                      <a:off x="0" y="0"/>
+                      <a:ext cx="5731510" cy="3582035"/>
+                    </a:xfrm>
+                    <a:prstGeom prst="rect">
+                      <a:avLst/>
+                    </a:prstGeom>
+                    <a:noFill/>
+                    <a:ln>
+                      <a:noFill/>
+                    </a:ln>
+                  </pic:spPr>
+                </pic:pic>
+              </a:graphicData>
+            </a:graphic>
+          </wp:inline>
+        </w:drawing>
+      </w:r>
+    </w:p>
+    <w:p>
+      <w:pPr>
+        <w:pStyle w:val="MSISTEXT"/>
+        <w:jc w:val="center"/>
+      </w:pPr>
+      <w:r>
+        <w:t>Figure 7.5. Accuracy obtained across 10 Folds</w:t>
+      </w:r>
+    </w:p>
+    <w:p>
+      <w:pPr>
+        <w:pStyle w:val="MSISSUBHEADIN"/>
+        <w:numPr>
+          <w:ilvl w:val="2"/>
+          <w:numId w:val="5"/>
+        </w:numPr>
+      </w:pPr>
+      <w:r>
+        <w:t>Quantitative Performance</w:t>
+      </w:r>
+    </w:p>
+    <w:tbl>
+      <w:tblPr>
+        <w:tblW w:w="5401" w:type="dxa"/>
+        <w:jc w:val="center"/>
+        <w:tblBorders>
+          <w:top w:val="single" w:sz="4" w:space="0" w:color="auto"/>
+          <w:left w:val="single" w:sz="4" w:space="0" w:color="auto"/>
+          <w:bottom w:val="single" w:sz="4" w:space="0" w:color="auto"/>
+          <w:right w:val="single" w:sz="4" w:space="0" w:color="auto"/>
+          <w:insideH w:val="single" w:sz="4" w:space="0" w:color="auto"/>
+          <w:insideV w:val="single" w:sz="4" w:space="0" w:color="auto"/>
+        </w:tblBorders>
+        <w:tblLook w:val="04A0" w:firstRow="1" w:lastRow="0" w:firstColumn="1" w:lastColumn="0" w:noHBand="0" w:noVBand="1"/>
+      </w:tblPr>
+      <w:tblGrid>
+        <w:gridCol w:w="2209"/>
+        <w:gridCol w:w="1596"/>
+        <w:gridCol w:w="1596"/>
+      </w:tblGrid>
+      <w:tr>
+        <w:trPr>
+          <w:trHeight w:val="288"/>
+          <w:jc w:val="center"/>
+        </w:trPr>
+        <w:tc>
+          <w:tcPr>
+            <w:tcW w:w="2209" w:type="dxa"/>
+            <w:noWrap/>
+            <w:vAlign w:val="bottom"/>
+            <w:hideMark/>
+          </w:tcPr>
+          <w:p>
+            <w:pPr>
+              <w:spacing w:line="240" w:lineRule="auto"/>
+              <w:jc w:val="center"/>
+              <w:rPr>
+                <w:rFonts w:eastAsia="Times New Roman" w:cs="Times New Roman"/>
+                <w:b/>
+                <w:bCs/>
+                <w:color w:val="000000"/>
+                <w:szCs w:val="24"/>
+                <w:lang w:eastAsia="en-IN"/>
+              </w:rPr>
+            </w:pPr>
+            <w:r>
+              <w:rPr>
+                <w:rFonts w:eastAsia="Times New Roman" w:cs="Times New Roman"/>
+                <w:b/>
+                <w:bCs/>
+                <w:color w:val="000000"/>
+                <w:szCs w:val="24"/>
+                <w:lang w:eastAsia="en-IN"/>
+              </w:rPr>
+              <w:t>Metric</w:t>
+            </w:r>
+          </w:p>
+        </w:tc>
+        <w:tc>
+          <w:tcPr>
+            <w:tcW w:w="1596" w:type="dxa"/>
+            <w:noWrap/>
+            <w:vAlign w:val="bottom"/>
+            <w:hideMark/>
+          </w:tcPr>
+          <w:p>
+            <w:pPr>
+              <w:spacing w:line="240" w:lineRule="auto"/>
+              <w:jc w:val="center"/>
+              <w:rPr>
+                <w:rFonts w:eastAsia="Times New Roman" w:cs="Times New Roman"/>
+                <w:b/>
+                <w:bCs/>
+                <w:color w:val="000000"/>
+                <w:szCs w:val="24"/>
+                <w:lang w:eastAsia="en-IN"/>
+              </w:rPr>
+            </w:pPr>
+            <w:r>
+              <w:rPr>
+                <w:rFonts w:eastAsia="Times New Roman" w:cs="Times New Roman"/>
+                <w:b/>
+                <w:bCs/>
+                <w:color w:val="000000"/>
+                <w:szCs w:val="24"/>
+                <w:lang w:eastAsia="en-IN"/>
+              </w:rPr>
+              <w:t>Mean</w:t>
+            </w:r>
+          </w:p>
+        </w:tc>
+        <w:tc>
+          <w:tcPr>
+            <w:tcW w:w="1596" w:type="dxa"/>
+            <w:noWrap/>
+            <w:vAlign w:val="bottom"/>
+            <w:hideMark/>
+          </w:tcPr>
+          <w:p>
+            <w:pPr>
+              <w:spacing w:line="240" w:lineRule="auto"/>
+              <w:jc w:val="center"/>
+              <w:rPr>
+                <w:rFonts w:eastAsia="Times New Roman" w:cs="Times New Roman"/>
+                <w:b/>
+                <w:bCs/>
+                <w:color w:val="000000"/>
+                <w:szCs w:val="24"/>
+                <w:lang w:eastAsia="en-IN"/>
+              </w:rPr>
+            </w:pPr>
+            <w:r>
+              <w:rPr>
+                <w:rFonts w:eastAsia="Times New Roman" w:cs="Times New Roman"/>
+                <w:b/>
+                <w:bCs/>
+                <w:color w:val="000000"/>
+                <w:szCs w:val="24"/>
+                <w:lang w:eastAsia="en-IN"/>
+              </w:rPr>
+              <w:t>Std</w:t>
+            </w:r>
+          </w:p>
+        </w:tc>
+      </w:tr>
+      <w:tr>
+        <w:trPr>
+          <w:trHeight w:val="288"/>
+          <w:jc w:val="center"/>
+        </w:trPr>
+        <w:tc>
+          <w:tcPr>
+            <w:tcW w:w="2209" w:type="dxa"/>
+            <w:noWrap/>
+            <w:vAlign w:val="bottom"/>
+            <w:hideMark/>
+          </w:tcPr>
+          <w:p>
+            <w:pPr>
+              <w:spacing w:line="240" w:lineRule="auto"/>
+              <w:rPr>
+                <w:rFonts w:eastAsia="Times New Roman" w:cs="Times New Roman"/>
+                <w:color w:val="000000"/>
+                <w:szCs w:val="24"/>
+                <w:lang w:eastAsia="en-IN"/>
+              </w:rPr>
+            </w:pPr>
+            <w:r>
+              <w:rPr>
+                <w:rFonts w:eastAsia="Times New Roman" w:cs="Times New Roman"/>
+                <w:color w:val="000000"/>
+                <w:szCs w:val="24"/>
+                <w:lang w:eastAsia="en-IN"/>
+              </w:rPr>
+              <w:t>Accuracy</w:t>
+            </w:r>
+          </w:p>
+        </w:tc>
+        <w:tc>
+          <w:tcPr>
+            <w:tcW w:w="1596" w:type="dxa"/>
+            <w:noWrap/>
+            <w:vAlign w:val="bottom"/>
+            <w:hideMark/>
+          </w:tcPr>
+          <w:p>
+            <w:pPr>
+              <w:spacing w:line="240" w:lineRule="auto"/>
+              <w:jc w:val="both"/>
+              <w:rPr>
+                <w:rFonts w:eastAsia="Times New Roman" w:cs="Times New Roman"/>
+                <w:color w:val="000000"/>
+                <w:szCs w:val="24"/>
+                <w:lang w:eastAsia="en-IN"/>
+              </w:rPr>
+            </w:pPr>
+            <w:r>
+              <w:rPr>
+                <w:rFonts w:eastAsia="Times New Roman" w:cs="Times New Roman"/>
+                <w:color w:val="000000"/>
+                <w:szCs w:val="24"/>
+                <w:lang w:eastAsia="en-IN"/>
+              </w:rPr>
+              <w:t>0.987501179</w:t>
+            </w:r>
+          </w:p>
+        </w:tc>
+        <w:tc>
+          <w:tcPr>
+            <w:tcW w:w="1596" w:type="dxa"/>
+            <w:noWrap/>
+            <w:vAlign w:val="bottom"/>
+            <w:hideMark/>
+          </w:tcPr>
+          <w:p>
+            <w:pPr>
+              <w:spacing w:line="240" w:lineRule="auto"/>
+              <w:jc w:val="both"/>
+              <w:rPr>
+                <w:rFonts w:eastAsia="Times New Roman" w:cs="Times New Roman"/>
+                <w:color w:val="000000"/>
+                <w:szCs w:val="24"/>
+                <w:lang w:eastAsia="en-IN"/>
+              </w:rPr>
+            </w:pPr>
+            <w:r>
+              <w:rPr>
+                <w:rFonts w:eastAsia="Times New Roman" w:cs="Times New Roman"/>
+                <w:color w:val="000000"/>
+                <w:szCs w:val="24"/>
+                <w:lang w:eastAsia="en-IN"/>
+              </w:rPr>
+              <w:t>0.000717648</w:t>
+            </w:r>
+          </w:p>
+        </w:tc>
+      </w:tr>
+      <w:tr>
+        <w:trPr>
+          <w:trHeight w:val="288"/>
+          <w:jc w:val="center"/>
+        </w:trPr>
+        <w:tc>
+          <w:tcPr>
+            <w:tcW w:w="2209" w:type="dxa"/>
+            <w:noWrap/>
+            <w:vAlign w:val="bottom"/>
+            <w:hideMark/>
+          </w:tcPr>
+          <w:p>
+            <w:pPr>
+              <w:spacing w:line="240" w:lineRule="auto"/>
+              <w:rPr>
+                <w:rFonts w:eastAsia="Times New Roman" w:cs="Times New Roman"/>
+                <w:color w:val="000000"/>
+                <w:szCs w:val="24"/>
+                <w:lang w:eastAsia="en-IN"/>
+              </w:rPr>
+            </w:pPr>
+            <w:r>
+              <w:rPr>
+                <w:rFonts w:eastAsia="Times New Roman" w:cs="Times New Roman"/>
+                <w:color w:val="000000"/>
+                <w:szCs w:val="24"/>
+                <w:lang w:eastAsia="en-IN"/>
+              </w:rPr>
+              <w:t>Balanced Accuracy</w:t>
+            </w:r>
+          </w:p>
+        </w:tc>
+        <w:tc>
+          <w:tcPr>
+            <w:tcW w:w="1596" w:type="dxa"/>
+            <w:noWrap/>
+            <w:vAlign w:val="bottom"/>
+            <w:hideMark/>
+          </w:tcPr>
+          <w:p>
+            <w:pPr>
+              <w:spacing w:line="240" w:lineRule="auto"/>
+              <w:jc w:val="both"/>
+              <w:rPr>
+                <w:rFonts w:eastAsia="Times New Roman" w:cs="Times New Roman"/>
+                <w:color w:val="000000"/>
+                <w:szCs w:val="24"/>
+                <w:lang w:eastAsia="en-IN"/>
+              </w:rPr>
+            </w:pPr>
+            <w:r>
+              <w:rPr>
+                <w:rFonts w:eastAsia="Times New Roman" w:cs="Times New Roman"/>
+                <w:color w:val="000000"/>
+                <w:szCs w:val="24"/>
+                <w:lang w:eastAsia="en-IN"/>
+              </w:rPr>
+              <w:t>0.876193227</w:t>
+            </w:r>
+          </w:p>
+        </w:tc>
+        <w:tc>
+          <w:tcPr>
+            <w:tcW w:w="1596" w:type="dxa"/>
+            <w:noWrap/>
+            <w:vAlign w:val="bottom"/>
+            <w:hideMark/>
+          </w:tcPr>
+          <w:p>
+            <w:pPr>
+              <w:spacing w:line="240" w:lineRule="auto"/>
+              <w:jc w:val="both"/>
+              <w:rPr>
+                <w:rFonts w:eastAsia="Times New Roman" w:cs="Times New Roman"/>
+                <w:color w:val="000000"/>
+                <w:szCs w:val="24"/>
+                <w:lang w:eastAsia="en-IN"/>
+              </w:rPr>
+            </w:pPr>
+            <w:r>
+              <w:rPr>
+                <w:rFonts w:eastAsia="Times New Roman" w:cs="Times New Roman"/>
+                <w:color w:val="000000"/>
+                <w:szCs w:val="24"/>
+                <w:lang w:eastAsia="en-IN"/>
+              </w:rPr>
+              <w:t>0.012983422</w:t>
+            </w:r>
+          </w:p>
+        </w:tc>
+      </w:tr>
+      <w:tr>
+        <w:trPr>
+          <w:trHeight w:val="288"/>
+          <w:jc w:val="center"/>
+        </w:trPr>
+        <w:tc>
+          <w:tcPr>
+            <w:tcW w:w="2209" w:type="dxa"/>
+            <w:noWrap/>
+            <w:vAlign w:val="bottom"/>
+            <w:hideMark/>
+          </w:tcPr>
+          <w:p>
+            <w:pPr>
+              <w:spacing w:line="240" w:lineRule="auto"/>
+              <w:rPr>
+                <w:rFonts w:eastAsia="Times New Roman" w:cs="Times New Roman"/>
+                <w:color w:val="000000"/>
+                <w:szCs w:val="24"/>
+                <w:lang w:eastAsia="en-IN"/>
+              </w:rPr>
+            </w:pPr>
+            <w:r>
+              <w:rPr>
+                <w:rFonts w:eastAsia="Times New Roman" w:cs="Times New Roman"/>
+                <w:color w:val="000000"/>
+                <w:szCs w:val="24"/>
+                <w:lang w:eastAsia="en-IN"/>
+              </w:rPr>
+              <w:t>Precision</w:t>
+            </w:r>
+          </w:p>
+        </w:tc>
+        <w:tc>
+          <w:tcPr>
+            <w:tcW w:w="1596" w:type="dxa"/>
+            <w:noWrap/>
+            <w:vAlign w:val="bottom"/>
+            <w:hideMark/>
+          </w:tcPr>
+          <w:p>
+            <w:pPr>
+              <w:spacing w:line="240" w:lineRule="auto"/>
+              <w:jc w:val="both"/>
+              <w:rPr>
+                <w:rFonts w:eastAsia="Times New Roman" w:cs="Times New Roman"/>
+                <w:color w:val="000000"/>
+                <w:szCs w:val="24"/>
+                <w:lang w:eastAsia="en-IN"/>
+              </w:rPr>
+            </w:pPr>
+            <w:r>
+              <w:rPr>
+                <w:rFonts w:eastAsia="Times New Roman" w:cs="Times New Roman"/>
+                <w:color w:val="000000"/>
+                <w:szCs w:val="24"/>
+                <w:lang w:eastAsia="en-IN"/>
+              </w:rPr>
+              <w:t>0.994214858</w:t>
+            </w:r>
+          </w:p>
+        </w:tc>
+        <w:tc>
+          <w:tcPr>
+            <w:tcW w:w="1596" w:type="dxa"/>
+            <w:noWrap/>
+            <w:vAlign w:val="bottom"/>
+            <w:hideMark/>
+          </w:tcPr>
+          <w:p>
+            <w:pPr>
+              <w:spacing w:line="240" w:lineRule="auto"/>
+              <w:jc w:val="both"/>
+              <w:rPr>
+                <w:rFonts w:eastAsia="Times New Roman" w:cs="Times New Roman"/>
+                <w:color w:val="000000"/>
+                <w:szCs w:val="24"/>
+                <w:lang w:eastAsia="en-IN"/>
+              </w:rPr>
+            </w:pPr>
+            <w:r>
+              <w:rPr>
+                <w:rFonts w:eastAsia="Times New Roman" w:cs="Times New Roman"/>
+                <w:color w:val="000000"/>
+                <w:szCs w:val="24"/>
+                <w:lang w:eastAsia="en-IN"/>
+              </w:rPr>
+              <w:t>0.000632967</w:t>
+            </w:r>
+          </w:p>
+        </w:tc>
+      </w:tr>
+      <w:tr>
+        <w:trPr>
+          <w:trHeight w:val="288"/>
+          <w:jc w:val="center"/>
+        </w:trPr>
+        <w:tc>
+          <w:tcPr>
+            <w:tcW w:w="2209" w:type="dxa"/>
+            <w:noWrap/>
+            <w:vAlign w:val="bottom"/>
+            <w:hideMark/>
+          </w:tcPr>
+          <w:p>
+            <w:pPr>
+              <w:spacing w:line="240" w:lineRule="auto"/>
+              <w:rPr>
+                <w:rFonts w:eastAsia="Times New Roman" w:cs="Times New Roman"/>
+                <w:color w:val="000000"/>
+                <w:szCs w:val="24"/>
+                <w:lang w:eastAsia="en-IN"/>
+              </w:rPr>
+            </w:pPr>
+            <w:r>
+              <w:rPr>
+                <w:rFonts w:eastAsia="Times New Roman" w:cs="Times New Roman"/>
+                <w:color w:val="000000"/>
+                <w:szCs w:val="24"/>
+                <w:lang w:eastAsia="en-IN"/>
+              </w:rPr>
+              <w:t>Sensitivity</w:t>
+            </w:r>
+          </w:p>
+        </w:tc>
+        <w:tc>
+          <w:tcPr>
+            <w:tcW w:w="1596" w:type="dxa"/>
+            <w:noWrap/>
+            <w:vAlign w:val="bottom"/>
+            <w:hideMark/>
+          </w:tcPr>
+          <w:p>
+            <w:pPr>
+              <w:spacing w:line="240" w:lineRule="auto"/>
+              <w:jc w:val="both"/>
+              <w:rPr>
+                <w:rFonts w:eastAsia="Times New Roman" w:cs="Times New Roman"/>
+                <w:color w:val="000000"/>
+                <w:szCs w:val="24"/>
+                <w:lang w:eastAsia="en-IN"/>
+              </w:rPr>
+            </w:pPr>
+            <w:r>
+              <w:rPr>
+                <w:rFonts w:eastAsia="Times New Roman" w:cs="Times New Roman"/>
+                <w:color w:val="000000"/>
+                <w:szCs w:val="24"/>
+                <w:lang w:eastAsia="en-IN"/>
+              </w:rPr>
+              <w:t>0.992979702</w:t>
+            </w:r>
+          </w:p>
+        </w:tc>
+        <w:tc>
+          <w:tcPr>
+            <w:tcW w:w="1596" w:type="dxa"/>
+            <w:noWrap/>
+            <w:vAlign w:val="bottom"/>
+            <w:hideMark/>
+          </w:tcPr>
+          <w:p>
+            <w:pPr>
+              <w:spacing w:line="240" w:lineRule="auto"/>
+              <w:jc w:val="both"/>
+              <w:rPr>
+                <w:rFonts w:eastAsia="Times New Roman" w:cs="Times New Roman"/>
+                <w:color w:val="000000"/>
+                <w:szCs w:val="24"/>
+                <w:lang w:eastAsia="en-IN"/>
+              </w:rPr>
+            </w:pPr>
+            <w:r>
+              <w:rPr>
+                <w:rFonts w:eastAsia="Times New Roman" w:cs="Times New Roman"/>
+                <w:color w:val="000000"/>
+                <w:szCs w:val="24"/>
+                <w:lang w:eastAsia="en-IN"/>
+              </w:rPr>
+              <w:t>0.001015329</w:t>
+            </w:r>
+          </w:p>
+        </w:tc>
+      </w:tr>
+      <w:tr>
+        <w:trPr>
+          <w:trHeight w:val="288"/>
+          <w:jc w:val="center"/>
+        </w:trPr>
+        <w:tc>
+          <w:tcPr>
+            <w:tcW w:w="2209" w:type="dxa"/>
+            <w:noWrap/>
+            <w:vAlign w:val="bottom"/>
+            <w:hideMark/>
+          </w:tcPr>
+          <w:p>
+            <w:pPr>
+              <w:spacing w:line="240" w:lineRule="auto"/>
+              <w:rPr>
+                <w:rFonts w:eastAsia="Times New Roman" w:cs="Times New Roman"/>
+                <w:color w:val="000000"/>
+                <w:szCs w:val="24"/>
+                <w:lang w:eastAsia="en-IN"/>
+              </w:rPr>
+            </w:pPr>
+            <w:r>
+              <w:rPr>
+                <w:rFonts w:eastAsia="Times New Roman" w:cs="Times New Roman"/>
+                <w:color w:val="000000"/>
+                <w:szCs w:val="24"/>
+                <w:lang w:eastAsia="en-IN"/>
+              </w:rPr>
+              <w:t>F1</w:t>
+            </w:r>
+          </w:p>
+        </w:tc>
+        <w:tc>
+          <w:tcPr>
+            <w:tcW w:w="1596" w:type="dxa"/>
+            <w:noWrap/>
+            <w:vAlign w:val="bottom"/>
+            <w:hideMark/>
+          </w:tcPr>
+          <w:p>
+            <w:pPr>
+              <w:spacing w:line="240" w:lineRule="auto"/>
+              <w:jc w:val="both"/>
+              <w:rPr>
+                <w:rFonts w:eastAsia="Times New Roman" w:cs="Times New Roman"/>
+                <w:color w:val="000000"/>
+                <w:szCs w:val="24"/>
+                <w:lang w:eastAsia="en-IN"/>
+              </w:rPr>
+            </w:pPr>
+            <w:r>
+              <w:rPr>
+                <w:rFonts w:eastAsia="Times New Roman" w:cs="Times New Roman"/>
+                <w:color w:val="000000"/>
+                <w:szCs w:val="24"/>
+                <w:lang w:eastAsia="en-IN"/>
+              </w:rPr>
+              <w:t>0.993596372</w:t>
+            </w:r>
+          </w:p>
+        </w:tc>
+        <w:tc>
+          <w:tcPr>
+            <w:tcW w:w="1596" w:type="dxa"/>
+            <w:noWrap/>
+            <w:vAlign w:val="bottom"/>
+            <w:hideMark/>
+          </w:tcPr>
+          <w:p>
+            <w:pPr>
+              <w:spacing w:line="240" w:lineRule="auto"/>
+              <w:jc w:val="both"/>
+              <w:rPr>
+                <w:rFonts w:eastAsia="Times New Roman" w:cs="Times New Roman"/>
+                <w:color w:val="000000"/>
+                <w:szCs w:val="24"/>
+                <w:lang w:eastAsia="en-IN"/>
+              </w:rPr>
+            </w:pPr>
+            <w:r>
+              <w:rPr>
+                <w:rFonts w:eastAsia="Times New Roman" w:cs="Times New Roman"/>
+                <w:color w:val="000000"/>
+                <w:szCs w:val="24"/>
+                <w:lang w:eastAsia="en-IN"/>
+              </w:rPr>
+              <w:t>0.00037025</w:t>
+            </w:r>
+          </w:p>
+        </w:tc>
+      </w:tr>
+      <w:tr>
+        <w:trPr>
+          <w:trHeight w:val="288"/>
+          <w:jc w:val="center"/>
+        </w:trPr>
+        <w:tc>
+          <w:tcPr>
+            <w:tcW w:w="2209" w:type="dxa"/>
+            <w:noWrap/>
+            <w:vAlign w:val="bottom"/>
+            <w:hideMark/>
+          </w:tcPr>
+          <w:p>
+            <w:pPr>
+              <w:spacing w:line="240" w:lineRule="auto"/>
+              <w:rPr>
+                <w:rFonts w:eastAsia="Times New Roman" w:cs="Times New Roman"/>
+                <w:color w:val="000000"/>
+                <w:szCs w:val="24"/>
+                <w:lang w:eastAsia="en-IN"/>
+              </w:rPr>
+            </w:pPr>
+            <w:r>
+              <w:rPr>
+                <w:rFonts w:eastAsia="Times New Roman" w:cs="Times New Roman"/>
+                <w:color w:val="000000"/>
+                <w:szCs w:val="24"/>
+                <w:lang w:eastAsia="en-IN"/>
+              </w:rPr>
+              <w:t>Macro F1</w:t>
+            </w:r>
+          </w:p>
+        </w:tc>
+        <w:tc>
+          <w:tcPr>
+            <w:tcW w:w="1596" w:type="dxa"/>
+            <w:noWrap/>
+            <w:vAlign w:val="bottom"/>
+            <w:hideMark/>
+          </w:tcPr>
+          <w:p>
+            <w:pPr>
+              <w:spacing w:line="240" w:lineRule="auto"/>
+              <w:jc w:val="both"/>
+              <w:rPr>
+                <w:rFonts w:eastAsia="Times New Roman" w:cs="Times New Roman"/>
+                <w:color w:val="000000"/>
+                <w:szCs w:val="24"/>
+                <w:lang w:eastAsia="en-IN"/>
+              </w:rPr>
+            </w:pPr>
+            <w:r>
+              <w:rPr>
+                <w:rFonts w:eastAsia="Times New Roman" w:cs="Times New Roman"/>
+                <w:color w:val="000000"/>
+                <w:szCs w:val="24"/>
+                <w:lang w:eastAsia="en-IN"/>
+              </w:rPr>
+              <w:t>0.86693722</w:t>
+            </w:r>
+          </w:p>
+        </w:tc>
+        <w:tc>
+          <w:tcPr>
+            <w:tcW w:w="1596" w:type="dxa"/>
+            <w:noWrap/>
+            <w:vAlign w:val="bottom"/>
+            <w:hideMark/>
+          </w:tcPr>
+          <w:p>
+            <w:pPr>
+              <w:spacing w:line="240" w:lineRule="auto"/>
+              <w:jc w:val="both"/>
+              <w:rPr>
+                <w:rFonts w:eastAsia="Times New Roman" w:cs="Times New Roman"/>
+                <w:color w:val="000000"/>
+                <w:szCs w:val="24"/>
+                <w:lang w:eastAsia="en-IN"/>
+              </w:rPr>
+            </w:pPr>
+            <w:r>
+              <w:rPr>
+                <w:rFonts w:eastAsia="Times New Roman" w:cs="Times New Roman"/>
+                <w:color w:val="000000"/>
+                <w:szCs w:val="24"/>
+                <w:lang w:eastAsia="en-IN"/>
+              </w:rPr>
+              <w:t>0.006469721</w:t>
+            </w:r>
+          </w:p>
+        </w:tc>
+      </w:tr>
+      <w:tr>
+        <w:trPr>
+          <w:trHeight w:val="288"/>
+          <w:jc w:val="center"/>
+        </w:trPr>
+        <w:tc>
+          <w:tcPr>
+            <w:tcW w:w="2209" w:type="dxa"/>
+            <w:noWrap/>
+            <w:vAlign w:val="bottom"/>
+            <w:hideMark/>
+          </w:tcPr>
+          <w:p>
+            <w:pPr>
+              <w:spacing w:line="240" w:lineRule="auto"/>
+              <w:rPr>
+                <w:rFonts w:eastAsia="Times New Roman" w:cs="Times New Roman"/>
+                <w:color w:val="000000"/>
+                <w:szCs w:val="24"/>
+                <w:lang w:eastAsia="en-IN"/>
+              </w:rPr>
+            </w:pPr>
+            <w:r>
+              <w:rPr>
+                <w:rFonts w:eastAsia="Times New Roman" w:cs="Times New Roman"/>
+                <w:color w:val="000000"/>
+                <w:szCs w:val="24"/>
+                <w:lang w:eastAsia="en-IN"/>
+              </w:rPr>
+              <w:t>AUC</w:t>
+            </w:r>
+          </w:p>
+        </w:tc>
+        <w:tc>
+          <w:tcPr>
+            <w:tcW w:w="1596" w:type="dxa"/>
+            <w:noWrap/>
+            <w:vAlign w:val="bottom"/>
+            <w:hideMark/>
+          </w:tcPr>
+          <w:p>
+            <w:pPr>
+              <w:spacing w:line="240" w:lineRule="auto"/>
+              <w:jc w:val="both"/>
+              <w:rPr>
+                <w:rFonts w:eastAsia="Times New Roman" w:cs="Times New Roman"/>
+                <w:color w:val="000000"/>
+                <w:szCs w:val="24"/>
+                <w:lang w:eastAsia="en-IN"/>
+              </w:rPr>
+            </w:pPr>
+            <w:r>
+              <w:rPr>
+                <w:rFonts w:eastAsia="Times New Roman" w:cs="Times New Roman"/>
+                <w:color w:val="000000"/>
+                <w:szCs w:val="24"/>
+                <w:lang w:eastAsia="en-IN"/>
+              </w:rPr>
+              <w:t>0.995647856</w:t>
+            </w:r>
+          </w:p>
+        </w:tc>
+        <w:tc>
+          <w:tcPr>
+            <w:tcW w:w="1596" w:type="dxa"/>
+            <w:noWrap/>
+            <w:vAlign w:val="bottom"/>
+            <w:hideMark/>
+          </w:tcPr>
+          <w:p>
+            <w:pPr>
+              <w:spacing w:line="240" w:lineRule="auto"/>
+              <w:jc w:val="both"/>
+              <w:rPr>
+                <w:rFonts w:eastAsia="Times New Roman" w:cs="Times New Roman"/>
+                <w:color w:val="000000"/>
+                <w:szCs w:val="24"/>
+                <w:lang w:eastAsia="en-IN"/>
+              </w:rPr>
+            </w:pPr>
+            <w:r>
+              <w:rPr>
+                <w:rFonts w:eastAsia="Times New Roman" w:cs="Times New Roman"/>
+                <w:color w:val="000000"/>
+                <w:szCs w:val="24"/>
+                <w:lang w:eastAsia="en-IN"/>
+              </w:rPr>
+              <w:t>0.000363316</w:t>
+            </w:r>
+          </w:p>
+        </w:tc>
+      </w:tr>
+      <w:tr>
+        <w:trPr>
+          <w:trHeight w:val="288"/>
+          <w:jc w:val="center"/>
+        </w:trPr>
+        <w:tc>
+          <w:tcPr>
+            <w:tcW w:w="2209" w:type="dxa"/>
+            <w:noWrap/>
+            <w:vAlign w:val="bottom"/>
+            <w:hideMark/>
+          </w:tcPr>
+          <w:p>
+            <w:pPr>
+              <w:spacing w:line="240" w:lineRule="auto"/>
+              <w:rPr>
+                <w:rFonts w:eastAsia="Times New Roman" w:cs="Times New Roman"/>
+                <w:color w:val="000000"/>
+                <w:szCs w:val="24"/>
+                <w:lang w:eastAsia="en-IN"/>
+              </w:rPr>
+            </w:pPr>
+            <w:r>
+              <w:rPr>
+                <w:rFonts w:eastAsia="Times New Roman" w:cs="Times New Roman"/>
+                <w:color w:val="000000"/>
+                <w:szCs w:val="24"/>
+                <w:lang w:eastAsia="en-IN"/>
+              </w:rPr>
+              <w:t>Specificity</w:t>
+            </w:r>
+          </w:p>
+        </w:tc>
+        <w:tc>
+          <w:tcPr>
+            <w:tcW w:w="1596" w:type="dxa"/>
+            <w:noWrap/>
+            <w:vAlign w:val="bottom"/>
+            <w:hideMark/>
+          </w:tcPr>
+          <w:p>
+            <w:pPr>
+              <w:spacing w:line="240" w:lineRule="auto"/>
+              <w:jc w:val="both"/>
+              <w:rPr>
+                <w:rFonts w:eastAsia="Times New Roman" w:cs="Times New Roman"/>
+                <w:color w:val="000000"/>
+                <w:szCs w:val="24"/>
+                <w:lang w:eastAsia="en-IN"/>
+              </w:rPr>
+            </w:pPr>
+            <w:r>
+              <w:rPr>
+                <w:rFonts w:eastAsia="Times New Roman" w:cs="Times New Roman"/>
+                <w:color w:val="000000"/>
+                <w:szCs w:val="24"/>
+                <w:lang w:eastAsia="en-IN"/>
+              </w:rPr>
+              <w:t>0.759406751</w:t>
+            </w:r>
+          </w:p>
+        </w:tc>
+        <w:tc>
+          <w:tcPr>
+            <w:tcW w:w="1596" w:type="dxa"/>
+            <w:noWrap/>
+            <w:vAlign w:val="bottom"/>
+            <w:hideMark/>
+          </w:tcPr>
+          <w:p>
+            <w:pPr>
+              <w:spacing w:line="240" w:lineRule="auto"/>
+              <w:jc w:val="both"/>
+              <w:rPr>
+                <w:rFonts w:eastAsia="Times New Roman" w:cs="Times New Roman"/>
+                <w:color w:val="000000"/>
+                <w:szCs w:val="24"/>
+                <w:lang w:eastAsia="en-IN"/>
+              </w:rPr>
+            </w:pPr>
+            <w:r>
+              <w:rPr>
+                <w:rFonts w:eastAsia="Times New Roman" w:cs="Times New Roman"/>
+                <w:color w:val="000000"/>
+                <w:szCs w:val="24"/>
+                <w:lang w:eastAsia="en-IN"/>
+              </w:rPr>
+              <w:t>0.026656187</w:t>
+            </w:r>
+          </w:p>
+        </w:tc>
+      </w:tr>
+    </w:tbl>
+    <w:p>
+      <w:pPr>
+        <w:pStyle w:val="MSISTEXT"/>
+        <w:jc w:val="center"/>
+      </w:pPr>
+      <w:r>
+        <w:t>Table 7.1. Evaluation Metrics</w:t>
+      </w:r>
+    </w:p>
+    <w:p>
+      <w:pPr>
+        <w:pStyle w:val="MSISSUBHEADIN"/>
+        <w:numPr>
+          <w:ilvl w:val="2"/>
+          <w:numId w:val="5"/>
+        </w:numPr>
+      </w:pPr>
+      <w:r>
+        <w:t>ROC Analysis</w:t>
+      </w:r>
+    </w:p>
+    <w:p>
+      <w:pPr>
+        <w:pStyle w:val="MSISTEXT"/>
+        <w:jc w:val="center"/>
+      </w:pPr>
+      <w:r>
+        <w:rPr>
+          <w:noProof/>
+        </w:rPr>
+        <w:lastRenderedPageBreak/>
+        <w:drawing>
+          <wp:inline distT="0" distB="0" distL="0" distR="0" wp14:anchorId="563CFFFA" wp14:editId="78083315">
+            <wp:extent cx="5486400" cy="5486400"/>
+            <wp:effectExtent l="0" t="0" r="0" b="0"/>
+            <wp:docPr id="121286564" name="Picture 6"/>
+            <wp:cNvGraphicFramePr>
+              <a:graphicFrameLocks xmlns:a="http://schemas.openxmlformats.org/drawingml/2006/main" noChangeAspect="1"/>
+            </wp:cNvGraphicFramePr>
+            <a:graphic xmlns:a="http://schemas.openxmlformats.org/drawingml/2006/main">
+              <a:graphicData uri="http://schemas.openxmlformats.org/drawingml/2006/picture">
+                <pic:pic xmlns:pic="http://schemas.openxmlformats.org/drawingml/2006/picture">
+                  <pic:nvPicPr>
+                    <pic:cNvPr id="0" name="Picture 7"/>
+                    <pic:cNvPicPr>
+                      <a:picLocks noChangeAspect="1" noChangeArrowheads="1"/>
+                    </pic:cNvPicPr>
+                  </pic:nvPicPr>
+                  <pic:blipFill>
+                    <a:blip r:embed="rId23" cstate="print">
+                      <a:extLst>
+                        <a:ext uri="{28A0092B-C50C-407E-A947-70E740481C1C}">
+                          <a14:useLocalDpi xmlns:a14="http://schemas.microsoft.com/office/drawing/2010/main" val="0"/>
+                        </a:ext>
+                      </a:extLst>
+                    </a:blip>
+                    <a:srcRect/>
+                    <a:stretch>
+                      <a:fillRect/>
+                    </a:stretch>
+                  </pic:blipFill>
+                  <pic:spPr bwMode="auto">
+                    <a:xfrm>
+                      <a:off x="0" y="0"/>
+                      <a:ext cx="5486400" cy="5486400"/>
+                    </a:xfrm>
+                    <a:prstGeom prst="rect">
+                      <a:avLst/>
+                    </a:prstGeom>
+                    <a:noFill/>
+                    <a:ln>
+                      <a:noFill/>
+                    </a:ln>
+                  </pic:spPr>
+                </pic:pic>
+              </a:graphicData>
+            </a:graphic>
+          </wp:inline>
+        </w:drawing>
+      </w:r>
+    </w:p>
+    <w:p>
+      <w:pPr>
+        <w:pStyle w:val="MSISTEXT"/>
+        <w:jc w:val="center"/>
+      </w:pPr>
+      <w:r>
+        <w:t>Figure 7.6. Average ROC curve across the 10 – fold curve.</w:t>
+      </w:r>
+    </w:p>
+    <w:p>
+      <w:pPr>
+        <w:pStyle w:val="MSISSUBHEADIN"/>
+        <w:numPr>
+          <w:ilvl w:val="2"/>
+          <w:numId w:val="5"/>
+        </w:numPr>
+      </w:pPr>
+      <w:r>
+        <w:t>Confusion Matrix</w:t>
+      </w:r>
+    </w:p>
+    <w:p>
+      <w:pPr>
+        <w:pStyle w:val="MSISTEXT"/>
+        <w:jc w:val="center"/>
+      </w:pPr>
+      <w:r>
+        <w:rPr>
+          <w:noProof/>
+        </w:rPr>
+        <w:lastRenderedPageBreak/>
+        <w:drawing>
+          <wp:inline distT="0" distB="0" distL="0" distR="0" wp14:anchorId="0373019B" wp14:editId="031281BF">
+            <wp:extent cx="5731510" cy="4298950"/>
+            <wp:effectExtent l="0" t="0" r="2540" b="6350"/>
+            <wp:docPr id="987916487" name="Picture 7"/>
+            <wp:cNvGraphicFramePr>
+              <a:graphicFrameLocks xmlns:a="http://schemas.openxmlformats.org/drawingml/2006/main" noChangeAspect="1"/>
+            </wp:cNvGraphicFramePr>
+            <a:graphic xmlns:a="http://schemas.openxmlformats.org/drawingml/2006/main">
+              <a:graphicData uri="http://schemas.openxmlformats.org/drawingml/2006/picture">
+                <pic:pic xmlns:pic="http://schemas.openxmlformats.org/drawingml/2006/picture">
+                  <pic:nvPicPr>
+                    <pic:cNvPr id="0" name="Picture 8"/>
+                    <pic:cNvPicPr>
+                      <a:picLocks noChangeAspect="1" noChangeArrowheads="1"/>
+                    </pic:cNvPicPr>
+                  </pic:nvPicPr>
+                  <pic:blipFill>
+                    <a:blip r:embed="rId24" cstate="print">
+                      <a:extLst>
+                        <a:ext uri="{28A0092B-C50C-407E-A947-70E740481C1C}">
+                          <a14:useLocalDpi xmlns:a14="http://schemas.microsoft.com/office/drawing/2010/main" val="0"/>
+                        </a:ext>
+                      </a:extLst>
+                    </a:blip>
+                    <a:srcRect/>
+                    <a:stretch>
+                      <a:fillRect/>
+                    </a:stretch>
+                  </pic:blipFill>
+                  <pic:spPr bwMode="auto">
+                    <a:xfrm>
+                      <a:off x="0" y="0"/>
+                      <a:ext cx="5731510" cy="4298950"/>
+                    </a:xfrm>
+                    <a:prstGeom prst="rect">
+                      <a:avLst/>
+                    </a:prstGeom>
+                    <a:noFill/>
+                    <a:ln>
+                      <a:noFill/>
+                    </a:ln>
+                  </pic:spPr>
+                </pic:pic>
+              </a:graphicData>
+            </a:graphic>
+          </wp:inline>
+        </w:drawing>
+      </w:r>
+    </w:p>
+    <w:p>
+      <w:pPr>
+        <w:pStyle w:val="MSISTEXT"/>
+        <w:jc w:val="center"/>
+      </w:pPr>
+      <w:r>
+        <w:t>Figure 7.7. Average Confusion Matrix over 10 validation folds.</w:t>
+      </w:r>
+    </w:p>
+    <w:p>
+      <w:pPr>
+        <w:pStyle w:val="MSISSUBHEADIN"/>
+        <w:numPr>
+          <w:ilvl w:val="2"/>
+          <w:numId w:val="5"/>
+        </w:numPr>
+      </w:pPr>
+      <w:r>
+        <w:t>Metric Distribution</w:t>
+      </w:r>
+    </w:p>
+    <w:p>
+      <w:pPr>
+        <w:pStyle w:val="MSISTEXT"/>
+        <w:jc w:val="center"/>
+      </w:pPr>
+      <w:r>
+        <w:rPr>
+          <w:noProof/>
+        </w:rPr>
+        <w:drawing>
+          <wp:inline distT="0" distB="0" distL="0" distR="0" wp14:anchorId="2ABED1C9" wp14:editId="474A28F8">
+            <wp:extent cx="5731510" cy="3126105"/>
+            <wp:effectExtent l="0" t="0" r="2540" b="0"/>
+            <wp:docPr id="323235079" name="Picture 9"/>
+            <wp:cNvGraphicFramePr>
+              <a:graphicFrameLocks xmlns:a="http://schemas.openxmlformats.org/drawingml/2006/main" noChangeAspect="1"/>
+            </wp:cNvGraphicFramePr>
+            <a:graphic xmlns:a="http://schemas.openxmlformats.org/drawingml/2006/main">
+              <a:graphicData uri="http://schemas.openxmlformats.org/drawingml/2006/picture">
+                <pic:pic xmlns:pic="http://schemas.openxmlformats.org/drawingml/2006/picture">
+                  <pic:nvPicPr>
+                    <pic:cNvPr id="0" name="Picture 10"/>
+                    <pic:cNvPicPr>
+                      <a:picLocks noChangeAspect="1" noChangeArrowheads="1"/>
+                    </pic:cNvPicPr>
+                  </pic:nvPicPr>
+                  <pic:blipFill>
+                    <a:blip r:embed="rId25" cstate="print">
+                      <a:extLst>
+                        <a:ext uri="{28A0092B-C50C-407E-A947-70E740481C1C}">
+                          <a14:useLocalDpi xmlns:a14="http://schemas.microsoft.com/office/drawing/2010/main" val="0"/>
+                        </a:ext>
+                      </a:extLst>
+                    </a:blip>
+                    <a:srcRect/>
+                    <a:stretch>
+                      <a:fillRect/>
+                    </a:stretch>
+                  </pic:blipFill>
+                  <pic:spPr bwMode="auto">
+                    <a:xfrm>
+                      <a:off x="0" y="0"/>
+                      <a:ext cx="5731510" cy="3126105"/>
+                    </a:xfrm>
+                    <a:prstGeom prst="rect">
+                      <a:avLst/>
+                    </a:prstGeom>
+                    <a:noFill/>
+                    <a:ln>
+                      <a:noFill/>
+                    </a:ln>
+                  </pic:spPr>
+                </pic:pic>
+              </a:graphicData>
+            </a:graphic>
+          </wp:inline>
+        </w:drawing>
+      </w:r>
+    </w:p>
+    <w:p>
+      <w:pPr>
+        <w:pStyle w:val="MSISTEXT"/>
+        <w:jc w:val="center"/>
+      </w:pPr>
+      <w:r>
+        <w:t>Figure 7.8. Metric Boxplot</w:t>
+      </w:r>
+    </w:p>
+    <w:p>
+      <w:pPr>
+        <w:pStyle w:val="MSISSUBHEADIN"/>
+        <w:numPr>
+          <w:ilvl w:val="2"/>
+          <w:numId w:val="5"/>
+        </w:numPr>
+      </w:pPr>
+      <w:r>
+        <w:lastRenderedPageBreak/>
+        <w:t>Average Metric Comparison</w:t>
+      </w:r>
+    </w:p>
+    <w:p>
+      <w:pPr>
+        <w:pStyle w:val="MSISTEXT"/>
+        <w:jc w:val="center"/>
+      </w:pPr>
+      <w:r>
+        <w:rPr>
+          <w:noProof/>
+        </w:rPr>
+        <w:drawing>
+          <wp:inline distT="0" distB="0" distL="0" distR="0" wp14:anchorId="5D249034" wp14:editId="4D90CE60">
+            <wp:extent cx="5731510" cy="3183890"/>
+            <wp:effectExtent l="0" t="0" r="2540" b="0"/>
+            <wp:docPr id="522761800" name="Picture 8"/>
+            <wp:cNvGraphicFramePr>
+              <a:graphicFrameLocks xmlns:a="http://schemas.openxmlformats.org/drawingml/2006/main" noChangeAspect="1"/>
+            </wp:cNvGraphicFramePr>
+            <a:graphic xmlns:a="http://schemas.openxmlformats.org/drawingml/2006/main">
+              <a:graphicData uri="http://schemas.openxmlformats.org/drawingml/2006/picture">
+                <pic:pic xmlns:pic="http://schemas.openxmlformats.org/drawingml/2006/picture">
+                  <pic:nvPicPr>
+                    <pic:cNvPr id="0" name="Picture 9"/>
+                    <pic:cNvPicPr>
+                      <a:picLocks noChangeAspect="1" noChangeArrowheads="1"/>
+                    </pic:cNvPicPr>
+                  </pic:nvPicPr>
+                  <pic:blipFill>
+                    <a:blip r:embed="rId26" cstate="print">
+                      <a:extLst>
+                        <a:ext uri="{28A0092B-C50C-407E-A947-70E740481C1C}">
+                          <a14:useLocalDpi xmlns:a14="http://schemas.microsoft.com/office/drawing/2010/main" val="0"/>
+                        </a:ext>
+                      </a:extLst>
+                    </a:blip>
+                    <a:srcRect/>
+                    <a:stretch>
+                      <a:fillRect/>
+                    </a:stretch>
+                  </pic:blipFill>
+                  <pic:spPr bwMode="auto">
+                    <a:xfrm>
+                      <a:off x="0" y="0"/>
+                      <a:ext cx="5731510" cy="3183890"/>
+                    </a:xfrm>
+                    <a:prstGeom prst="rect">
+                      <a:avLst/>
+                    </a:prstGeom>
+                    <a:noFill/>
+                    <a:ln>
+                      <a:noFill/>
+                    </a:ln>
+                  </pic:spPr>
+                </pic:pic>
+              </a:graphicData>
+            </a:graphic>
+          </wp:inline>
+        </w:drawing>
+      </w:r>
+    </w:p>
+    <w:p>
+      <w:pPr>
+        <w:pStyle w:val="MSISTEXT"/>
+        <w:jc w:val="center"/>
+      </w:pPr>
+      <w:r>
+        <w:t xml:space="preserve">Figure 7.9. Metric </w:t>
+      </w:r>
+      <w:r>
+        <w:t>Comparison</w:t>
+      </w:r>
+      <w:r>
+        <w:t xml:space="preserve"> </w:t>
+      </w:r>
+    </w:p>
+    <w:p>
+      <w:pPr>
+        <w:pStyle w:val="MSISHEADING"/>
+        <w:numPr>
+          <w:ilvl w:val="0"/>
+          <w:numId w:val="5"/>
+        </w:numPr>
+      </w:pPr>
+      <w:r>
+        <w:t>CONCLUSION</w:t>
+      </w:r>
+    </w:p>
+    <w:p>
+      <w:pPr>
+        <w:pStyle w:val="MSISTEXT"/>
+      </w:pPr>
+      <w:r>
+        <w:t xml:space="preserve">In this project, the implementation of an anomaly-based Intrusion Detection System (IDS) for IoT networks through machine learning and deep learning algorithms is carried out. The increased use of IoT technology poses many challenges to cybersecurity because of the high </w:t>
+      </w:r>
+      <w:proofErr w:type="gramStart"/>
+      <w:r>
+        <w:t>number</w:t>
+      </w:r>
+      <w:proofErr w:type="gramEnd"/>
+      <w:r>
+        <w:t xml:space="preserve"> of traffic in a heterogeneous environment and the increased complexity of cyberattacks. In order to counter this challenge, the design of the IDS through the methodology in the chosen research paper is done.</w:t>
+      </w:r>
+    </w:p>
+    <w:p>
+      <w:pPr>
+        <w:pStyle w:val="MSISTEXT"/>
+        <w:rPr>
+          <w:lang w:val="en-IN"/>
+        </w:rPr>
+      </w:pPr>
+      <w:r>
+        <w:rPr>
+          <w:lang w:val="en-IN"/>
+        </w:rPr>
+        <w:t>The implementation began with the collection and preprocessing of the CICIoT2023 dataset. Since the original dataset consisted of a large number of network traffic records distributed across multiple files, the data was merged, sampled, cleaned, and transformed into a binary classification dataset. Exploratory Data Analysis (EDA) was then performed to understand the characteristics of the dataset and validate its suitability for machine learning and deep learning applications.</w:t>
+      </w:r>
+    </w:p>
+    <w:p>
+      <w:pPr>
+        <w:pStyle w:val="MSISTEXT"/>
+        <w:rPr>
+          <w:lang w:val="en-IN"/>
+        </w:rPr>
+      </w:pPr>
+      <w:r>
+        <w:rPr>
+          <w:lang w:val="en-IN"/>
+        </w:rPr>
+        <w:t xml:space="preserve">To reduce data dimensionality and eliminate redundant attributes, Pearson Correlation Coefficient (PCC)-based feature selection was applied. The selected feature subset was subsequently used to train three classification models, namely Random Forest (RF), Artificial Neural Network (ANN), and Convolutional Neural Network (CNN). </w:t>
+      </w:r>
+      <w:r>
+        <w:rPr>
+          <w:lang w:val="en-IN"/>
+        </w:rPr>
+        <w:lastRenderedPageBreak/>
+        <w:t>Implementing multiple classifiers enables a comparative evaluation of traditional machine learning and deep learning approaches for IoT intrusion detection.</w:t>
+      </w:r>
+    </w:p>
+    <w:p>
+      <w:pPr>
+        <w:pStyle w:val="MSISTEXT"/>
+        <w:rPr>
+          <w:lang w:val="en-IN"/>
+        </w:rPr>
+      </w:pPr>
+      <w:r>
+        <w:rPr>
+          <w:lang w:val="en-IN"/>
+        </w:rPr>
+        <w:t>The implementation presented in this work establishes a complete intrusion detection framework, beginning with raw network traffic data and progressing through preprocessing, feature selection, model development, and evaluation. The experimental analysis and comparative performance of the implemented models are presented in the Results chapter, providing a detailed assessment of their effectiveness in detecting malicious network traffic.</w:t>
+      </w:r>
+    </w:p>
+    <w:p>
+      <w:pPr>
+        <w:pStyle w:val="MSISTEXT"/>
+        <w:rPr>
+          <w:lang w:val="en-IN"/>
+        </w:rPr>
+      </w:pPr>
+      <w:r>
+        <w:rPr>
+          <w:lang w:val="en-IN"/>
+        </w:rPr>
+        <w:t>Overall, the work demonstrates a structured implementation of an anomaly-based intrusion detection framework for IoT environments and provides a foundation for further improvements in intelligent network security systems.</w:t>
+      </w:r>
+    </w:p>
+    <w:p>
+      <w:pPr>
         <w:spacing w:after="160"/>
         <w:rPr>
           <w:rFonts w:cs="Times New Roman"/>
@@ -11507,79 +13225,79 @@
       </w:pPr>
       <w:r>
         <w:lastRenderedPageBreak/>
-        <w:t>CONCLUSION</w:t>
-      </w:r>
-    </w:p>
-    <w:p>
-      <w:pPr>
-        <w:pStyle w:val="MSISTEXT"/>
-      </w:pPr>
-      <w:r>
-        <w:t xml:space="preserve">In this project, the implementation of an anomaly-based Intrusion Detection System (IDS) for IoT networks through machine learning and deep learning algorithms is carried out. The increased use of IoT technology poses many challenges to cybersecurity because of the high </w:t>
-      </w:r>
-      <w:proofErr w:type="gramStart"/>
-      <w:r>
-        <w:t>number</w:t>
-      </w:r>
-      <w:proofErr w:type="gramEnd"/>
-      <w:r>
-        <w:t xml:space="preserve"> of traffic in a heterogeneous environment and the increased complexity of cyberattacks. In order to counter this challenge, the design of the IDS through the methodology in the chosen research paper is done.</w:t>
-      </w:r>
-    </w:p>
-    <w:p>
-      <w:pPr>
-        <w:pStyle w:val="MSISTEXT"/>
-        <w:rPr>
-          <w:lang w:val="en-IN"/>
-        </w:rPr>
-      </w:pPr>
-      <w:r>
-        <w:rPr>
-          <w:lang w:val="en-IN"/>
-        </w:rPr>
-        <w:t>The implementation began with the collection and preprocessing of the CICIoT2023 dataset. Since the original dataset consisted of a large number of network traffic records distributed across multiple files, the data was merged, sampled, cleaned, and transformed into a binary classification dataset. Exploratory Data Analysis (EDA) was then performed to understand the characteristics of the dataset and validate its suitability for machine learning and deep learning applications.</w:t>
-      </w:r>
-    </w:p>
-    <w:p>
-      <w:pPr>
-        <w:pStyle w:val="MSISTEXT"/>
-        <w:rPr>
-          <w:lang w:val="en-IN"/>
-        </w:rPr>
-      </w:pPr>
-      <w:r>
-        <w:rPr>
-          <w:lang w:val="en-IN"/>
-        </w:rPr>
-        <w:t>To reduce data dimensionality and eliminate redundant attributes, Pearson Correlation Coefficient (PCC)-based feature selection was applied. The selected feature subset was subsequently used to train three classification models, namely Random Forest (RF), Artificial Neural Network (ANN), and Convolutional Neural Network (CNN). Implementing multiple classifiers enables a comparative evaluation of traditional machine learning and deep learning approaches for IoT intrusion detection.</w:t>
-      </w:r>
-    </w:p>
-    <w:p>
-      <w:pPr>
-        <w:pStyle w:val="MSISTEXT"/>
-        <w:rPr>
-          <w:lang w:val="en-IN"/>
-        </w:rPr>
-      </w:pPr>
-      <w:r>
-        <w:rPr>
-          <w:lang w:val="en-IN"/>
-        </w:rPr>
-        <w:t>The implementation presented in this work establishes a complete intrusion detection framework, beginning with raw network traffic data and progressing through preprocessing, feature selection, model development, and evaluation. The experimental analysis and comparative performance of the implemented models are presented in the Results chapter, providing a detailed assessment of their effectiveness in detecting malicious network traffic.</w:t>
-      </w:r>
-    </w:p>
-    <w:p>
-      <w:pPr>
-        <w:pStyle w:val="MSISTEXT"/>
-        <w:rPr>
-          <w:lang w:val="en-IN"/>
-        </w:rPr>
-      </w:pPr>
-      <w:r>
-        <w:rPr>
-          <w:lang w:val="en-IN"/>
-        </w:rPr>
-        <w:t>Overall, the work demonstrates a structured implementation of an anomaly-based intrusion detection framework for IoT environments and provides a foundation for further improvements in intelligent network security systems.</w:t>
+        <w:t>SCOPE FOR FUTURE WORK</w:t>
+      </w:r>
+    </w:p>
+    <w:p>
+      <w:pPr>
+        <w:pStyle w:val="MSISTEXT"/>
+      </w:pPr>
+      <w:r>
+        <w:t>Despite the fact that the developed intrusion detection system offers a methodological way of detecting malicious network traffic in the Internet of Things setting, there are still multiple possibilities for its future development.</w:t>
+      </w:r>
+    </w:p>
+    <w:p>
+      <w:pPr>
+        <w:pStyle w:val="MSISTEXT"/>
+      </w:pPr>
+      <w:r>
+        <w:t>Currently, the classification in the system is based on the two-class model that includes classifying the network traffic as being normal or malicious. Future developments of the system could lead to multi-class classification and the possibility of identifying particular classes of attacks including DDoS, spoofing, reconnaissance, brute force attacks, among others.</w:t>
+      </w:r>
+    </w:p>
+    <w:p>
+      <w:pPr>
+        <w:pStyle w:val="MSISTEXT"/>
+        <w:rPr>
+          <w:lang w:val="en-IN"/>
+        </w:rPr>
+      </w:pPr>
+      <w:r>
+        <w:rPr>
+          <w:lang w:val="en-IN"/>
+        </w:rPr>
+        <w:t>The current study utilizes Pearson Correlation Coefficient (PCC) for feature selection. Future research may investigate alternative feature selection techniques such as Mutual Information, Recursive Feature Elimination (RFE), Principal Component Analysis (PCA), or hybrid feature selection methods to evaluate their impact on detection performance and computational efficiency.</w:t>
+      </w:r>
+    </w:p>
+    <w:p>
+      <w:pPr>
+        <w:pStyle w:val="MSISTEXT"/>
+        <w:rPr>
+          <w:lang w:val="en-IN"/>
+        </w:rPr>
+      </w:pPr>
+      <w:r>
+        <w:rPr>
+          <w:lang w:val="en-IN"/>
+        </w:rPr>
+        <w:t>Additional machine learning and deep learning algorithms, including Long Short-Term Memory (LSTM), Gated Recurrent Units (GRU), Transformer-based architectures, and hybrid ensemble models, may also be explored for improving intrusion detection accuracy and robustness.</w:t>
+      </w:r>
+    </w:p>
+    <w:p>
+      <w:pPr>
+        <w:pStyle w:val="MSISTEXT"/>
+        <w:rPr>
+          <w:lang w:val="en-IN"/>
+        </w:rPr>
+      </w:pPr>
+      <w:r>
+        <w:rPr>
+          <w:lang w:val="en-IN"/>
+        </w:rPr>
+        <w:t>The framework can further be evaluated using additional benchmark intrusion detection datasets, such as BOT-IoT, UNSW-NB15, TON-IoT, CICIDS2017, NSL-KDD, and IoTID20, to assess its generalization capability across diverse IoT environments.</w:t>
+      </w:r>
+    </w:p>
+    <w:p>
+      <w:pPr>
+        <w:pStyle w:val="MSISTEXT"/>
+        <w:rPr>
+          <w:lang w:val="en-IN"/>
+        </w:rPr>
+      </w:pPr>
+      <w:r>
+        <w:rPr>
+          <w:lang w:val="en-IN"/>
+        </w:rPr>
+        <w:t>Finally, the proposed intrusion detection framework can be integrated into real-time IoT systems and edge computing platforms, enabling continuous monitoring of network traffic and rapid detection of emerging cyber threats with reduced computational latency.</w:t>
       </w:r>
     </w:p>
     <w:p>
@@ -11610,109 +13328,6 @@
       </w:pPr>
       <w:r>
         <w:lastRenderedPageBreak/>
-        <w:t>SCOPE FOR FUTURE WORK</w:t>
-      </w:r>
-    </w:p>
-    <w:p>
-      <w:pPr>
-        <w:pStyle w:val="MSISTEXT"/>
-      </w:pPr>
-      <w:r>
-        <w:t>Despite the fact that the developed intrusion detection system offers a methodological way of detecting malicious network traffic in the Internet of Things setting, there are still multiple possibilities for its future development.</w:t>
-      </w:r>
-    </w:p>
-    <w:p>
-      <w:pPr>
-        <w:pStyle w:val="MSISTEXT"/>
-      </w:pPr>
-      <w:r>
-        <w:t>Currently, the classification in the system is based on the two-class model that includes classifying the network traffic as being normal or malicious. Future developments of the system could lead to multi-class classification and the possibility of identifying particular classes of attacks including DDoS, spoofing, reconnaissance, brute force attacks, among others.</w:t>
-      </w:r>
-    </w:p>
-    <w:p>
-      <w:pPr>
-        <w:pStyle w:val="MSISTEXT"/>
-        <w:rPr>
-          <w:lang w:val="en-IN"/>
-        </w:rPr>
-      </w:pPr>
-      <w:r>
-        <w:rPr>
-          <w:lang w:val="en-IN"/>
-        </w:rPr>
-        <w:t>The current study utilizes Pearson Correlation Coefficient (PCC) for feature selection. Future research may investigate alternative feature selection techniques such as Mutual Information, Recursive Feature Elimination (RFE), Principal Component Analysis (PCA), or hybrid feature selection methods to evaluate their impact on detection performance and computational efficiency.</w:t>
-      </w:r>
-    </w:p>
-    <w:p>
-      <w:pPr>
-        <w:pStyle w:val="MSISTEXT"/>
-        <w:rPr>
-          <w:lang w:val="en-IN"/>
-        </w:rPr>
-      </w:pPr>
-      <w:r>
-        <w:rPr>
-          <w:lang w:val="en-IN"/>
-        </w:rPr>
-        <w:t>Additional machine learning and deep learning algorithms, including Long Short-Term Memory (LSTM), Gated Recurrent Units (GRU), Transformer-based architectures, and hybrid ensemble models, may also be explored for improving intrusion detection accuracy and robustness.</w:t>
-      </w:r>
-    </w:p>
-    <w:p>
-      <w:pPr>
-        <w:pStyle w:val="MSISTEXT"/>
-        <w:rPr>
-          <w:lang w:val="en-IN"/>
-        </w:rPr>
-      </w:pPr>
-      <w:r>
-        <w:rPr>
-          <w:lang w:val="en-IN"/>
-        </w:rPr>
-        <w:t>The framework can further be evaluated using additional benchmark intrusion detection datasets, such as BOT-IoT, UNSW-NB15, TON-IoT, CICIDS2017, NSL-KDD, and IoTID20, to assess its generalization capability across diverse IoT environments.</w:t>
-      </w:r>
-    </w:p>
-    <w:p>
-      <w:pPr>
-        <w:pStyle w:val="MSISTEXT"/>
-        <w:rPr>
-          <w:lang w:val="en-IN"/>
-        </w:rPr>
-      </w:pPr>
-      <w:r>
-        <w:rPr>
-          <w:lang w:val="en-IN"/>
-        </w:rPr>
-        <w:t>Finally, the proposed intrusion detection framework can be integrated into real-time IoT systems and edge computing platforms, enabling continuous monitoring of network traffic and rapid detection of emerging cyber threats with reduced computational latency.</w:t>
-      </w:r>
-    </w:p>
-    <w:p>
-      <w:pPr>
-        <w:spacing w:after="160"/>
-        <w:rPr>
-          <w:rFonts w:cs="Times New Roman"/>
-          <w:b/>
-          <w:bCs/>
-          <w:kern w:val="2"/>
-          <w:sz w:val="28"/>
-          <w:szCs w:val="28"/>
-          <w:lang w:val="en-US"/>
-          <w14:ligatures w14:val="standardContextual"/>
-        </w:rPr>
-      </w:pPr>
-      <w:r>
-        <w:br w:type="page"/>
-      </w:r>
-    </w:p>
-    <w:p>
-      <w:pPr>
-        <w:pStyle w:val="MSISHEADING"/>
-        <w:numPr>
-          <w:ilvl w:val="0"/>
-          <w:numId w:val="5"/>
-        </w:numPr>
-      </w:pPr>
-      <w:r>
-        <w:lastRenderedPageBreak/>
         <w:t>REFERENCES</w:t>
       </w:r>
     </w:p>
@@ -12588,8 +14203,8 @@
       </w:r>
     </w:p>
     <w:sectPr>
-      <w:footerReference w:type="default" r:id="rId18"/>
-      <w:footerReference w:type="first" r:id="rId19"/>
+      <w:footerReference w:type="default" r:id="rId27"/>
+      <w:footerReference w:type="first" r:id="rId28"/>
       <w:pgSz w:w="11906" w:h="16838"/>
       <w:pgMar w:top="1440" w:right="1440" w:bottom="1440" w:left="1440" w:header="708" w:footer="708" w:gutter="0"/>
       <w:pgNumType w:start="1"/>

</xml_diff>